<commit_message>
Corrige modelos de estagio TCE e plano
</commit_message>
<xml_diff>
--- a/models/plano-atividades-estagio-aems.docx
+++ b/models/plano-atividades-estagio-aems.docx
@@ -1,8 +1,8 @@
 
 <file path=word/document.xml><?xml version="1.0" encoding="utf-8"?>
-<w:document xmlns:wpc="http://schemas.microsoft.com/office/word/2010/wordprocessingCanvas" xmlns:cx="http://schemas.microsoft.com/office/drawing/2014/chartex" xmlns:cx1="http://schemas.microsoft.com/office/drawing/2015/9/8/chartex" xmlns:cx2="http://schemas.microsoft.com/office/drawing/2015/10/21/chartex" xmlns:cx3="http://schemas.microsoft.com/office/drawing/2016/5/9/chartex" xmlns:cx4="http://schemas.microsoft.com/office/drawing/2016/5/10/chartex" xmlns:cx5="http://schemas.microsoft.com/office/drawing/2016/5/11/chartex" xmlns:cx6="http://schemas.microsoft.com/office/drawing/2016/5/12/chartex" xmlns:cx7="http://schemas.microsoft.com/office/drawing/2016/5/13/chartex" xmlns:cx8="http://schemas.microsoft.com/office/drawing/2016/5/14/chartex" xmlns:mc="http://schemas.openxmlformats.org/markup-compatibility/2006" xmlns:aink="http://schemas.microsoft.com/office/drawing/2016/ink" xmlns:am3d="http://schemas.microsoft.com/office/drawing/2017/model3d" xmlns:o="urn:schemas-microsoft-com:office:office" xmlns:r="http://schemas.openxmlformats.org/officeDocument/2006/relationships" xmlns:m="http://schemas.openxmlformats.org/officeDocument/2006/math" xmlns:v="urn:schemas-microsoft-com:vml" xmlns:wp14="http://schemas.microsoft.com/office/word/2010/wordprocessingDrawing" xmlns:wp="http://schemas.openxmlformats.org/drawingml/2006/wordprocessingDrawing" xmlns:w10="urn:schemas-microsoft-com:office:word" xmlns:w="http://schemas.openxmlformats.org/wordprocessingml/2006/main" xmlns:w14="http://schemas.microsoft.com/office/word/2010/wordml" xmlns:w15="http://schemas.microsoft.com/office/word/2012/wordml" xmlns:w16cex="http://schemas.microsoft.com/office/word/2018/wordml/cex" xmlns:w16cid="http://schemas.microsoft.com/office/word/2016/wordml/cid" xmlns:w16="http://schemas.microsoft.com/office/word/2018/wordml" xmlns:w16sdtdh="http://schemas.microsoft.com/office/word/2020/wordml/sdtdatahash" xmlns:w16se="http://schemas.microsoft.com/office/word/2015/wordml/symex" xmlns:wpg="http://schemas.microsoft.com/office/word/2010/wordprocessingGroup" xmlns:wpi="http://schemas.microsoft.com/office/word/2010/wordprocessingInk" xmlns:wne="http://schemas.microsoft.com/office/word/2006/wordml" xmlns:wps="http://schemas.microsoft.com/office/word/2010/wordprocessingShape" mc:Ignorable="w14 w15 w16se w16cid w16 w16cex w16sdtdh wp14">
+<w:document xmlns:ns1="http://schemas.openxmlformats.org/markup-compatibility/2006" xmlns:ns10="http://schemas.openxmlformats.org/officeDocument/2006/relationships" xmlns:ns2="http://schemas.microsoft.com/office/word/2010/wordml" xmlns:ns3="http://schemas.openxmlformats.org/drawingml/2006/wordprocessingDrawing" xmlns:ns4="http://schemas.microsoft.com/office/word/2010/wordprocessingDrawing" xmlns:ns5="http://schemas.openxmlformats.org/drawingml/2006/main" xmlns:ns6="http://schemas.microsoft.com/office/word/2010/wordprocessingShape" xmlns:ns7="urn:schemas-microsoft-com:vml" xmlns:ns8="urn:schemas-microsoft-com:office:office" xmlns:ns9="urn:schemas-microsoft-com:office:word" xmlns:w="http://schemas.openxmlformats.org/wordprocessingml/2006/main" ns1:Ignorable="w14 w15 w16se w16cid w16 w16cex w16sdtdh wp14">
   <w:body>
-    <w:p>
+    <w:p ns2:paraId="648D9CB2" ns2:textId="77777777">
       <w:pPr>
         <w:pStyle w:val="Ttulo2"/>
         <w:tabs>
@@ -25,7 +25,7 @@
         <w:t>PLANO DE ATIVIDADES DE ESTÁGIO</w:t>
       </w:r>
     </w:p>
-    <w:p>
+    <w:p ns2:paraId="27C1514D" ns2:textId="77777777">
       <w:pPr>
         <w:pStyle w:val="Ttulo2"/>
         <w:tabs>
@@ -68,7 +68,7 @@
         <w:t>11.788, Art. 7º)</w:t>
       </w:r>
     </w:p>
-    <w:p>
+    <w:p ns2:paraId="3E58BB62" ns2:textId="77777777">
       <w:pPr>
         <w:pStyle w:val="Corpodetexto"/>
         <w:ind w:left="-181" w:right="283"/>
@@ -90,7 +90,7 @@
         <w:t xml:space="preserve"> </w:t>
       </w:r>
     </w:p>
-    <w:p>
+    <w:p ns2:paraId="6D197238" ns2:textId="593818C4">
       <w:pPr>
         <w:pStyle w:val="Corpodetexto"/>
         <w:ind w:left="-181" w:right="283"/>
@@ -150,7 +150,7 @@
         <w:t xml:space="preserve">     ) ESTÁGIO NÃO OBRIGATÓRIO</w:t>
       </w:r>
     </w:p>
-    <w:p>
+    <w:p ns2:paraId="043FC376" ns2:textId="77777777">
       <w:pPr>
         <w:jc w:val="both"/>
         <w:rPr>
@@ -160,7 +160,7 @@
         </w:rPr>
       </w:pPr>
     </w:p>
-    <w:p>
+    <w:p ns2:paraId="1D3A35C0" ns2:textId="65E81A91">
       <w:pPr>
         <w:pStyle w:val="Corpodetexto"/>
         <w:spacing w:after="0"/>
@@ -220,7 +220,7 @@
         <w:t xml:space="preserve"> as partes a seguir identificadas pretendem proporcionar formação prática e aperfeiçoamento técnico e acadêmico aos estudantes estagiários, nos termos de Lei nº 11.788 de 25/09/08, conforme segue.</w:t>
       </w:r>
     </w:p>
-    <w:p>
+    <w:p ns2:paraId="44A50358" ns2:textId="77777777">
       <w:pPr>
         <w:pStyle w:val="Corpodetexto"/>
         <w:tabs>
@@ -240,10 +240,10 @@
           <w:sz w:val="24"/>
           <w:szCs w:val="24"/>
         </w:rPr>
-        <w:t>nos termos de Lei nº 11.788 de 25/09/08, conforme segue.</w:t>
-      </w:r>
-    </w:p>
-    <w:p>
+        <w:t xml:space="preserve"/>
+      </w:r>
+    </w:p>
+    <w:p ns2:paraId="097E2E86" ns2:textId="77777777">
       <w:pPr>
         <w:pStyle w:val="Corpodetexto"/>
         <w:tabs>
@@ -280,7 +280,7 @@
       <w:tblGrid>
         <w:gridCol w:w="10615"/>
       </w:tblGrid>
-      <w:tr>
+      <w:tr ns2:paraId="41DBD465" ns2:textId="77777777">
         <w:trPr>
           <w:trHeight w:val="258"/>
         </w:trPr>
@@ -289,7 +289,7 @@
             <w:tcW w:w="10615" w:type="dxa"/>
             <w:shd w:val="clear" w:color="auto" w:fill="E6E6E6"/>
           </w:tcPr>
-          <w:p>
+          <w:p ns2:paraId="48CB7F34" ns2:textId="77777777">
             <w:pPr>
               <w:pStyle w:val="Ttulo3"/>
               <w:tabs>
@@ -315,7 +315,7 @@
         </w:tc>
       </w:tr>
     </w:tbl>
-    <w:p>
+    <w:p ns2:paraId="296FECC0" ns2:textId="77777777">
       <w:pPr>
         <w:pStyle w:val="Corpodetexto"/>
         <w:tabs>
@@ -351,7 +351,7 @@
         <w:t>{{razao_social}}</w:t>
       </w:r>
     </w:p>
-    <w:p>
+    <w:p ns2:paraId="45DA5538" ns2:textId="77777777">
       <w:pPr>
         <w:pStyle w:val="Corpodetexto"/>
         <w:tabs>
@@ -419,7 +419,7 @@
         <w:tab/>
       </w:r>
     </w:p>
-    <w:p>
+    <w:p ns2:paraId="64042C85" ns2:textId="77777777">
       <w:pPr>
         <w:pStyle w:val="Corpodetexto"/>
         <w:tabs>
@@ -442,15 +442,15 @@
           <w:sz w:val="24"/>
           <w:szCs w:val="24"/>
         </w:rPr>
-        <w:t>Telefone:</w:t>
-      </w:r>
-      <w:r>
-        <w:rPr>
-          <w:rFonts w:ascii="Arial" w:hAnsi="Arial" w:cs="Arial"/>
-          <w:sz w:val="24"/>
-          <w:szCs w:val="24"/>
-        </w:rPr>
-        <w:t xml:space="preserve"> </w:t>
+        <w:t xml:space="preserve">Telefone: {{telefone_empresa}}        </w:t>
+      </w:r>
+      <w:r>
+        <w:rPr>
+          <w:rFonts w:ascii="Arial" w:hAnsi="Arial" w:cs="Arial"/>
+          <w:sz w:val="24"/>
+          <w:szCs w:val="24"/>
+        </w:rPr>
+        <w:t xml:space="preserve"/>
       </w:r>
       <w:r>
         <w:rPr>
@@ -460,18 +460,18 @@
           <w:sz w:val="24"/>
           <w:szCs w:val="24"/>
         </w:rPr>
-        <w:t>{{ramo_atividade}}</w:t>
-      </w:r>
-      <w:r>
-        <w:rPr>
-          <w:rFonts w:ascii="Arial" w:hAnsi="Arial" w:cs="Arial"/>
-          <w:sz w:val="24"/>
-          <w:szCs w:val="24"/>
-        </w:rPr>
-        <w:t xml:space="preserve">        </w:t>
-      </w:r>
-    </w:p>
-    <w:p>
+        <w:t/>
+      </w:r>
+      <w:r>
+        <w:rPr>
+          <w:rFonts w:ascii="Arial" w:hAnsi="Arial" w:cs="Arial"/>
+          <w:sz w:val="24"/>
+          <w:szCs w:val="24"/>
+        </w:rPr>
+        <w:t xml:space="preserve"/>
+      </w:r>
+    </w:p>
+    <w:p ns2:paraId="0F2CC8BB" ns2:textId="77777777">
       <w:pPr>
         <w:pStyle w:val="Corpodetexto"/>
         <w:tabs>
@@ -494,7 +494,7 @@
           <w:sz w:val="24"/>
           <w:szCs w:val="24"/>
         </w:rPr>
-        <w:t xml:space="preserve">Ramo de atividade: </w:t>
+        <w:t xml:space="preserve">Ramo de atividade: {{ramo_atividade}}                                                                                 </w:t>
       </w:r>
       <w:r>
         <w:rPr>
@@ -504,18 +504,18 @@
           <w:sz w:val="24"/>
           <w:szCs w:val="24"/>
         </w:rPr>
-        <w:t>{{endereco_empresa}}</w:t>
-      </w:r>
-      <w:r>
-        <w:rPr>
-          <w:rFonts w:ascii="Arial" w:hAnsi="Arial" w:cs="Arial"/>
-          <w:sz w:val="24"/>
-          <w:szCs w:val="24"/>
-        </w:rPr>
-        <w:t xml:space="preserve">                                                                                 </w:t>
-      </w:r>
-    </w:p>
-    <w:p>
+        <w:t/>
+      </w:r>
+      <w:r>
+        <w:rPr>
+          <w:rFonts w:ascii="Arial" w:hAnsi="Arial" w:cs="Arial"/>
+          <w:sz w:val="24"/>
+          <w:szCs w:val="24"/>
+        </w:rPr>
+        <w:t xml:space="preserve"/>
+      </w:r>
+    </w:p>
+    <w:p ns2:paraId="441D5C50" ns2:textId="77777777">
       <w:pPr>
         <w:pStyle w:val="Corpodetexto"/>
         <w:tabs>
@@ -538,15 +538,15 @@
           <w:sz w:val="24"/>
           <w:szCs w:val="24"/>
         </w:rPr>
-        <w:t>E</w:t>
-      </w:r>
-      <w:r>
-        <w:rPr>
-          <w:rFonts w:ascii="Arial" w:hAnsi="Arial" w:cs="Arial"/>
-          <w:sz w:val="24"/>
-          <w:szCs w:val="24"/>
-        </w:rPr>
-        <w:t xml:space="preserve">-mail: </w:t>
+        <w:t xml:space="preserve">E-mail: {{email_empresa}}</w:t>
+      </w:r>
+      <w:r>
+        <w:rPr>
+          <w:rFonts w:ascii="Arial" w:hAnsi="Arial" w:cs="Arial"/>
+          <w:sz w:val="24"/>
+          <w:szCs w:val="24"/>
+        </w:rPr>
+        <w:t xml:space="preserve"/>
       </w:r>
       <w:r>
         <w:rPr>
@@ -556,10 +556,10 @@
           <w:sz w:val="24"/>
           <w:szCs w:val="24"/>
         </w:rPr>
-        <w:t>{{bairro_empresa}}</w:t>
-      </w:r>
-    </w:p>
-    <w:p>
+        <w:t/>
+      </w:r>
+    </w:p>
+    <w:p ns2:paraId="356B539D" ns2:textId="77777777">
       <w:pPr>
         <w:pStyle w:val="Corpodetexto"/>
         <w:tabs>
@@ -582,7 +582,7 @@
           <w:sz w:val="24"/>
           <w:szCs w:val="24"/>
         </w:rPr>
-        <w:t>Endereço:</w:t>
+        <w:t xml:space="preserve">Endereço: {{endereco_empresa}}  </w:t>
       </w:r>
       <w:r>
         <w:rPr>
@@ -592,7 +592,7 @@
           <w:sz w:val="24"/>
           <w:szCs w:val="24"/>
         </w:rPr>
-        <w:t>{{representante_legal}}</w:t>
+        <w:t/>
       </w:r>
       <w:r>
         <w:rPr>
@@ -610,10 +610,10 @@
           <w:sz w:val="24"/>
           <w:szCs w:val="24"/>
         </w:rPr>
-        <w:t xml:space="preserve">  </w:t>
-      </w:r>
-    </w:p>
-    <w:p>
+        <w:t xml:space="preserve"/>
+      </w:r>
+    </w:p>
+    <w:p ns2:paraId="71736CBF" ns2:textId="77777777">
       <w:pPr>
         <w:pStyle w:val="Corpodetexto"/>
         <w:tabs>
@@ -632,7 +632,7 @@
           <w:sz w:val="24"/>
           <w:szCs w:val="24"/>
         </w:rPr>
-        <w:t xml:space="preserve">Bairro: </w:t>
+        <w:t xml:space="preserve">Bairro: {{bairro_empresa}}                                              </w:t>
       </w:r>
       <w:r>
         <w:rPr>
@@ -642,18 +642,18 @@
           <w:sz w:val="24"/>
           <w:szCs w:val="24"/>
         </w:rPr>
-        <w:t>{{nome_estudante}}</w:t>
-      </w:r>
-      <w:r>
-        <w:rPr>
-          <w:rFonts w:ascii="Arial" w:hAnsi="Arial" w:cs="Arial"/>
-          <w:sz w:val="24"/>
-          <w:szCs w:val="24"/>
-        </w:rPr>
-        <w:t xml:space="preserve">                                              </w:t>
-      </w:r>
-    </w:p>
-    <w:p>
+        <w:t/>
+      </w:r>
+      <w:r>
+        <w:rPr>
+          <w:rFonts w:ascii="Arial" w:hAnsi="Arial" w:cs="Arial"/>
+          <w:sz w:val="24"/>
+          <w:szCs w:val="24"/>
+        </w:rPr>
+        <w:t xml:space="preserve"/>
+      </w:r>
+    </w:p>
+    <w:p ns2:paraId="741FDCDC" ns2:textId="77777777">
       <w:pPr>
         <w:pStyle w:val="Corpodetexto"/>
         <w:tabs>
@@ -672,7 +672,7 @@
           <w:sz w:val="24"/>
           <w:szCs w:val="24"/>
         </w:rPr>
-        <w:t xml:space="preserve">Município: </w:t>
+        <w:t xml:space="preserve">Município: {{municipio_empresa}}                                                          </w:t>
       </w:r>
       <w:r>
         <w:rPr>
@@ -682,18 +682,18 @@
           <w:sz w:val="24"/>
           <w:szCs w:val="24"/>
         </w:rPr>
-        <w:t>{{rg}}</w:t>
-      </w:r>
-      <w:r>
-        <w:rPr>
-          <w:rFonts w:ascii="Arial" w:hAnsi="Arial" w:cs="Arial"/>
-          <w:sz w:val="24"/>
-          <w:szCs w:val="24"/>
-        </w:rPr>
-        <w:t xml:space="preserve">                                                          </w:t>
-      </w:r>
-    </w:p>
-    <w:p>
+        <w:t/>
+      </w:r>
+      <w:r>
+        <w:rPr>
+          <w:rFonts w:ascii="Arial" w:hAnsi="Arial" w:cs="Arial"/>
+          <w:sz w:val="24"/>
+          <w:szCs w:val="24"/>
+        </w:rPr>
+        <w:t xml:space="preserve"/>
+      </w:r>
+    </w:p>
+    <w:p ns2:paraId="0568DF55" ns2:textId="77777777">
       <w:pPr>
         <w:pStyle w:val="Corpodetexto"/>
         <w:tabs>
@@ -712,7 +712,7 @@
           <w:sz w:val="24"/>
           <w:szCs w:val="24"/>
         </w:rPr>
-        <w:t xml:space="preserve">UF: </w:t>
+        <w:t xml:space="preserve">UF: {{uf_empresa}}                            </w:t>
       </w:r>
       <w:r>
         <w:rPr>
@@ -722,18 +722,18 @@
           <w:sz w:val="24"/>
           <w:szCs w:val="24"/>
         </w:rPr>
-        <w:t>{{curso}}</w:t>
-      </w:r>
-      <w:r>
-        <w:rPr>
-          <w:rFonts w:ascii="Arial" w:hAnsi="Arial" w:cs="Arial"/>
-          <w:sz w:val="24"/>
-          <w:szCs w:val="24"/>
-        </w:rPr>
-        <w:t xml:space="preserve">                            </w:t>
-      </w:r>
-    </w:p>
-    <w:p>
+        <w:t/>
+      </w:r>
+      <w:r>
+        <w:rPr>
+          <w:rFonts w:ascii="Arial" w:hAnsi="Arial" w:cs="Arial"/>
+          <w:sz w:val="24"/>
+          <w:szCs w:val="24"/>
+        </w:rPr>
+        <w:t xml:space="preserve"/>
+      </w:r>
+    </w:p>
+    <w:p ns2:paraId="234C79A7" ns2:textId="77777777">
       <w:pPr>
         <w:pStyle w:val="Corpodetexto"/>
         <w:tabs>
@@ -752,7 +752,7 @@
           <w:sz w:val="24"/>
           <w:szCs w:val="24"/>
         </w:rPr>
-        <w:t xml:space="preserve">CEP: </w:t>
+        <w:t xml:space="preserve">CEP: {{cep_empresa}} </w:t>
       </w:r>
       <w:r>
         <w:rPr>
@@ -762,18 +762,18 @@
           <w:sz w:val="24"/>
           <w:szCs w:val="24"/>
         </w:rPr>
-        <w:t>{{endereco_estudante}}</w:t>
-      </w:r>
-      <w:r>
-        <w:rPr>
-          <w:rFonts w:ascii="Arial" w:hAnsi="Arial" w:cs="Arial"/>
-          <w:sz w:val="24"/>
-          <w:szCs w:val="24"/>
-        </w:rPr>
-        <w:t xml:space="preserve"> </w:t>
-      </w:r>
-    </w:p>
-    <w:p>
+        <w:t/>
+      </w:r>
+      <w:r>
+        <w:rPr>
+          <w:rFonts w:ascii="Arial" w:hAnsi="Arial" w:cs="Arial"/>
+          <w:sz w:val="24"/>
+          <w:szCs w:val="24"/>
+        </w:rPr>
+        <w:t xml:space="preserve"/>
+      </w:r>
+    </w:p>
+    <w:p ns2:paraId="47E3B0DE" ns2:textId="77777777">
       <w:pPr>
         <w:tabs>
           <w:tab w:val="left" w:pos="0"/>
@@ -792,7 +792,7 @@
           <w:sz w:val="24"/>
           <w:szCs w:val="24"/>
         </w:rPr>
-        <w:t xml:space="preserve">Representada por: </w:t>
+        <w:t xml:space="preserve">Representada por: {{representante_legal}}                                      </w:t>
       </w:r>
       <w:r>
         <w:rPr>
@@ -802,15 +802,15 @@
           <w:sz w:val="24"/>
           <w:szCs w:val="24"/>
         </w:rPr>
-        <w:t>{{email_estudante}}</w:t>
-      </w:r>
-      <w:r>
-        <w:rPr>
-          <w:rFonts w:ascii="Arial" w:hAnsi="Arial" w:cs="Arial"/>
-          <w:sz w:val="24"/>
-          <w:szCs w:val="24"/>
-        </w:rPr>
-        <w:t xml:space="preserve"> </w:t>
+        <w:t/>
+      </w:r>
+      <w:r>
+        <w:rPr>
+          <w:rFonts w:ascii="Arial" w:hAnsi="Arial" w:cs="Arial"/>
+          <w:sz w:val="24"/>
+          <w:szCs w:val="24"/>
+        </w:rPr>
+        <w:t xml:space="preserve"/>
       </w:r>
       <w:r>
         <w:rPr>
@@ -819,10 +819,10 @@
           <w:szCs w:val="24"/>
         </w:rPr>
         <w:tab/>
-        <w:t xml:space="preserve">                                     </w:t>
-      </w:r>
-    </w:p>
-    <w:p>
+        <w:t xml:space="preserve"/>
+      </w:r>
+    </w:p>
+    <w:p ns2:paraId="05050D25" ns2:textId="77777777">
       <w:pPr>
         <w:tabs>
           <w:tab w:val="left" w:pos="0"/>
@@ -842,7 +842,7 @@
           <w:sz w:val="24"/>
           <w:szCs w:val="24"/>
         </w:rPr>
-        <w:t xml:space="preserve">Cargo:  </w:t>
+        <w:t xml:space="preserve">Cargo:  {{cargo_representante}}</w:t>
       </w:r>
       <w:r>
         <w:rPr>
@@ -852,10 +852,10 @@
           <w:sz w:val="24"/>
           <w:szCs w:val="24"/>
         </w:rPr>
-        <w:t>{{bairro_estudante}}</w:t>
-      </w:r>
-    </w:p>
-    <w:p>
+        <w:t/>
+      </w:r>
+    </w:p>
+    <w:p ns2:paraId="2DD5E569" ns2:textId="77777777">
       <w:pPr>
         <w:tabs>
           <w:tab w:val="left" w:pos="0"/>
@@ -892,7 +892,7 @@
       <w:tblGrid>
         <w:gridCol w:w="10510"/>
       </w:tblGrid>
-      <w:tr>
+      <w:tr ns2:paraId="74418864" ns2:textId="77777777">
         <w:trPr>
           <w:trHeight w:val="260"/>
         </w:trPr>
@@ -901,7 +901,7 @@
             <w:tcW w:w="10510" w:type="dxa"/>
             <w:shd w:val="clear" w:color="auto" w:fill="E6E6E6"/>
           </w:tcPr>
-          <w:p>
+          <w:p ns2:paraId="01CEC3FE" ns2:textId="77777777">
             <w:pPr>
               <w:pStyle w:val="Ttulo3"/>
               <w:tabs>
@@ -927,7 +927,7 @@
         </w:tc>
       </w:tr>
     </w:tbl>
-    <w:p>
+    <w:p ns2:paraId="111A491D" ns2:textId="77777777">
       <w:pPr>
         <w:tabs>
           <w:tab w:val="left" w:pos="0"/>
@@ -945,15 +945,15 @@
           <w:sz w:val="24"/>
           <w:szCs w:val="24"/>
         </w:rPr>
-        <w:t>Nome:</w:t>
-      </w:r>
-      <w:r>
-        <w:rPr>
-          <w:rFonts w:ascii="Arial" w:hAnsi="Arial" w:cs="Arial"/>
-          <w:sz w:val="24"/>
-          <w:szCs w:val="24"/>
-        </w:rPr>
-        <w:t xml:space="preserve"> </w:t>
+        <w:t xml:space="preserve">Nome: {{nome_estudante}}                                                                       </w:t>
+      </w:r>
+      <w:r>
+        <w:rPr>
+          <w:rFonts w:ascii="Arial" w:hAnsi="Arial" w:cs="Arial"/>
+          <w:sz w:val="24"/>
+          <w:szCs w:val="24"/>
+        </w:rPr>
+        <w:t xml:space="preserve"/>
       </w:r>
       <w:r>
         <w:rPr>
@@ -963,15 +963,15 @@
           <w:sz w:val="24"/>
           <w:szCs w:val="24"/>
         </w:rPr>
-        <w:t>{{instituicao}}</w:t>
-      </w:r>
-      <w:r>
-        <w:rPr>
-          <w:rFonts w:ascii="Arial" w:hAnsi="Arial" w:cs="Arial"/>
-          <w:sz w:val="24"/>
-          <w:szCs w:val="24"/>
-        </w:rPr>
-        <w:t xml:space="preserve"> </w:t>
+        <w:t/>
+      </w:r>
+      <w:r>
+        <w:rPr>
+          <w:rFonts w:ascii="Arial" w:hAnsi="Arial" w:cs="Arial"/>
+          <w:sz w:val="24"/>
+          <w:szCs w:val="24"/>
+        </w:rPr>
+        <w:t xml:space="preserve"/>
       </w:r>
       <w:r>
         <w:rPr>
@@ -1012,10 +1012,10 @@
           <w:szCs w:val="24"/>
         </w:rPr>
         <w:tab/>
-        <w:t xml:space="preserve">                                                                      </w:t>
-      </w:r>
-    </w:p>
-    <w:p>
+        <w:t xml:space="preserve"/>
+      </w:r>
+    </w:p>
+    <w:p ns2:paraId="38738D6A" ns2:textId="77777777">
       <w:pPr>
         <w:tabs>
           <w:tab w:val="left" w:pos="0"/>
@@ -1033,15 +1033,15 @@
           <w:sz w:val="24"/>
           <w:szCs w:val="24"/>
         </w:rPr>
-        <w:t>Telefone:</w:t>
-      </w:r>
-      <w:r>
-        <w:rPr>
-          <w:rFonts w:ascii="Arial" w:hAnsi="Arial" w:cs="Arial"/>
-          <w:sz w:val="24"/>
-          <w:szCs w:val="24"/>
-        </w:rPr>
-        <w:t xml:space="preserve"> </w:t>
+        <w:t xml:space="preserve">Telefone: {{telefone_estudante}} </w:t>
+      </w:r>
+      <w:r>
+        <w:rPr>
+          <w:rFonts w:ascii="Arial" w:hAnsi="Arial" w:cs="Arial"/>
+          <w:sz w:val="24"/>
+          <w:szCs w:val="24"/>
+        </w:rPr>
+        <w:t xml:space="preserve"/>
       </w:r>
       <w:r>
         <w:rPr>
@@ -1051,18 +1051,18 @@
           <w:sz w:val="24"/>
           <w:szCs w:val="24"/>
         </w:rPr>
-        <w:t>{{cnpj_instituicao}}</w:t>
-      </w:r>
-      <w:r>
-        <w:rPr>
-          <w:rFonts w:ascii="Arial" w:hAnsi="Arial" w:cs="Arial"/>
-          <w:sz w:val="24"/>
-          <w:szCs w:val="24"/>
-        </w:rPr>
-        <w:t xml:space="preserve"> </w:t>
-      </w:r>
-    </w:p>
-    <w:p>
+        <w:t/>
+      </w:r>
+      <w:r>
+        <w:rPr>
+          <w:rFonts w:ascii="Arial" w:hAnsi="Arial" w:cs="Arial"/>
+          <w:sz w:val="24"/>
+          <w:szCs w:val="24"/>
+        </w:rPr>
+        <w:t xml:space="preserve"/>
+      </w:r>
+    </w:p>
+    <w:p ns2:paraId="4404F7F8" ns2:textId="77777777">
       <w:pPr>
         <w:tabs>
           <w:tab w:val="left" w:pos="0"/>
@@ -1080,15 +1080,15 @@
           <w:sz w:val="24"/>
           <w:szCs w:val="24"/>
         </w:rPr>
-        <w:t>Identidade:</w:t>
-      </w:r>
-      <w:r>
-        <w:rPr>
-          <w:rFonts w:ascii="Arial" w:hAnsi="Arial" w:cs="Arial"/>
-          <w:sz w:val="24"/>
-          <w:szCs w:val="24"/>
-        </w:rPr>
-        <w:t xml:space="preserve"> </w:t>
+        <w:t xml:space="preserve">Identidade: {{rg}}                          </w:t>
+      </w:r>
+      <w:r>
+        <w:rPr>
+          <w:rFonts w:ascii="Arial" w:hAnsi="Arial" w:cs="Arial"/>
+          <w:sz w:val="24"/>
+          <w:szCs w:val="24"/>
+        </w:rPr>
+        <w:t xml:space="preserve"/>
       </w:r>
       <w:r>
         <w:rPr>
@@ -1098,7 +1098,7 @@
           <w:sz w:val="24"/>
           <w:szCs w:val="24"/>
         </w:rPr>
-        <w:t>{{endereco_instituicao}}</w:t>
+        <w:t/>
       </w:r>
       <w:r>
         <w:rPr>
@@ -1123,10 +1123,10 @@
           <w:szCs w:val="24"/>
         </w:rPr>
         <w:tab/>
-        <w:t xml:space="preserve">                          </w:t>
-      </w:r>
-    </w:p>
-    <w:p>
+        <w:t xml:space="preserve"/>
+      </w:r>
+    </w:p>
+    <w:p ns2:paraId="0DA9C47B" ns2:textId="77777777">
       <w:pPr>
         <w:tabs>
           <w:tab w:val="left" w:pos="0"/>
@@ -1144,15 +1144,15 @@
           <w:sz w:val="24"/>
           <w:szCs w:val="24"/>
         </w:rPr>
-        <w:t>CPF:</w:t>
-      </w:r>
-      <w:r>
-        <w:rPr>
-          <w:rFonts w:ascii="Arial" w:hAnsi="Arial" w:cs="Arial"/>
-          <w:sz w:val="24"/>
-          <w:szCs w:val="24"/>
-        </w:rPr>
-        <w:t xml:space="preserve"> </w:t>
+        <w:t xml:space="preserve">CPF: {{cpf}}     </w:t>
+      </w:r>
+      <w:r>
+        <w:rPr>
+          <w:rFonts w:ascii="Arial" w:hAnsi="Arial" w:cs="Arial"/>
+          <w:sz w:val="24"/>
+          <w:szCs w:val="24"/>
+        </w:rPr>
+        <w:t xml:space="preserve"/>
       </w:r>
       <w:r>
         <w:rPr>
@@ -1162,7 +1162,7 @@
           <w:sz w:val="24"/>
           <w:szCs w:val="24"/>
         </w:rPr>
-        <w:t>{{coordenador}}</w:t>
+        <w:t/>
       </w:r>
       <w:r>
         <w:rPr>
@@ -1187,10 +1187,10 @@
           <w:szCs w:val="24"/>
         </w:rPr>
         <w:tab/>
-        <w:t xml:space="preserve">     </w:t>
-      </w:r>
-    </w:p>
-    <w:p>
+        <w:t xml:space="preserve"/>
+      </w:r>
+    </w:p>
+    <w:p ns2:paraId="44E35EED" ns2:textId="77777777">
       <w:pPr>
         <w:tabs>
           <w:tab w:val="left" w:pos="0"/>
@@ -1208,31 +1208,31 @@
           <w:sz w:val="24"/>
           <w:szCs w:val="24"/>
         </w:rPr>
-        <w:t>Data d</w:t>
-      </w:r>
-      <w:r>
-        <w:rPr>
-          <w:rFonts w:ascii="Arial" w:hAnsi="Arial" w:cs="Arial"/>
-          <w:sz w:val="24"/>
-          <w:szCs w:val="24"/>
-        </w:rPr>
-        <w:t xml:space="preserve">e </w:t>
-      </w:r>
-      <w:r>
-        <w:rPr>
-          <w:rFonts w:ascii="Arial" w:hAnsi="Arial" w:cs="Arial"/>
-          <w:sz w:val="24"/>
-          <w:szCs w:val="24"/>
-        </w:rPr>
-        <w:t>Nascimento:</w:t>
-      </w:r>
-      <w:r>
-        <w:rPr>
-          <w:rFonts w:ascii="Arial" w:hAnsi="Arial" w:cs="Arial"/>
-          <w:sz w:val="24"/>
-          <w:szCs w:val="24"/>
-        </w:rPr>
-        <w:t xml:space="preserve"> </w:t>
+        <w:t xml:space="preserve">Data de Nascimento: {{data_nascimento}} </w:t>
+      </w:r>
+      <w:r>
+        <w:rPr>
+          <w:rFonts w:ascii="Arial" w:hAnsi="Arial" w:cs="Arial"/>
+          <w:sz w:val="24"/>
+          <w:szCs w:val="24"/>
+        </w:rPr>
+        <w:t xml:space="preserve"/>
+      </w:r>
+      <w:r>
+        <w:rPr>
+          <w:rFonts w:ascii="Arial" w:hAnsi="Arial" w:cs="Arial"/>
+          <w:sz w:val="24"/>
+          <w:szCs w:val="24"/>
+        </w:rPr>
+        <w:t/>
+      </w:r>
+      <w:r>
+        <w:rPr>
+          <w:rFonts w:ascii="Arial" w:hAnsi="Arial" w:cs="Arial"/>
+          <w:sz w:val="24"/>
+          <w:szCs w:val="24"/>
+        </w:rPr>
+        <w:t xml:space="preserve"/>
       </w:r>
       <w:r>
         <w:rPr>
@@ -1242,18 +1242,18 @@
           <w:sz w:val="24"/>
           <w:szCs w:val="24"/>
         </w:rPr>
-        <w:t>{{data_inicio}}</w:t>
-      </w:r>
-      <w:r>
-        <w:rPr>
-          <w:rFonts w:ascii="Arial" w:hAnsi="Arial" w:cs="Arial"/>
-          <w:sz w:val="24"/>
-          <w:szCs w:val="24"/>
-        </w:rPr>
-        <w:t xml:space="preserve"> </w:t>
-      </w:r>
-    </w:p>
-    <w:p>
+        <w:t/>
+      </w:r>
+      <w:r>
+        <w:rPr>
+          <w:rFonts w:ascii="Arial" w:hAnsi="Arial" w:cs="Arial"/>
+          <w:sz w:val="24"/>
+          <w:szCs w:val="24"/>
+        </w:rPr>
+        <w:t xml:space="preserve"/>
+      </w:r>
+    </w:p>
+    <w:p ns2:paraId="61BD856F" ns2:textId="77777777">
       <w:pPr>
         <w:tabs>
           <w:tab w:val="left" w:pos="0"/>
@@ -1271,7 +1271,7 @@
           <w:sz w:val="24"/>
           <w:szCs w:val="24"/>
         </w:rPr>
-        <w:t>Curso:</w:t>
+        <w:t xml:space="preserve">Curso: {{curso}}              </w:t>
       </w:r>
       <w:r>
         <w:rPr>
@@ -1287,7 +1287,7 @@
           <w:sz w:val="24"/>
           <w:szCs w:val="24"/>
         </w:rPr>
-        <w:t xml:space="preserve"> </w:t>
+        <w:t xml:space="preserve"/>
       </w:r>
       <w:r>
         <w:rPr>
@@ -1297,7 +1297,7 @@
           <w:sz w:val="24"/>
           <w:szCs w:val="24"/>
         </w:rPr>
-        <w:t>{{carga_horaria}}</w:t>
+        <w:t/>
       </w:r>
       <w:r>
         <w:rPr>
@@ -1314,10 +1314,10 @@
           <w:szCs w:val="24"/>
         </w:rPr>
         <w:tab/>
-        <w:t xml:space="preserve">              </w:t>
-      </w:r>
-    </w:p>
-    <w:p>
+        <w:t xml:space="preserve"/>
+      </w:r>
+    </w:p>
+    <w:p ns2:paraId="3EB4DD46" ns2:textId="77777777">
       <w:pPr>
         <w:tabs>
           <w:tab w:val="left" w:pos="0"/>
@@ -1335,15 +1335,15 @@
           <w:sz w:val="24"/>
           <w:szCs w:val="24"/>
         </w:rPr>
-        <w:t>Série:</w:t>
-      </w:r>
-      <w:r>
-        <w:rPr>
-          <w:rFonts w:ascii="Arial" w:hAnsi="Arial" w:cs="Arial"/>
-          <w:sz w:val="24"/>
-          <w:szCs w:val="24"/>
-        </w:rPr>
-        <w:t xml:space="preserve"> </w:t>
+        <w:t xml:space="preserve">Série: {{periodo}}                         </w:t>
+      </w:r>
+      <w:r>
+        <w:rPr>
+          <w:rFonts w:ascii="Arial" w:hAnsi="Arial" w:cs="Arial"/>
+          <w:sz w:val="24"/>
+          <w:szCs w:val="24"/>
+        </w:rPr>
+        <w:t xml:space="preserve"/>
       </w:r>
       <w:r>
         <w:rPr>
@@ -1353,18 +1353,18 @@
           <w:sz w:val="24"/>
           <w:szCs w:val="24"/>
         </w:rPr>
-        <w:t>{{bolsa_auxilio}}</w:t>
-      </w:r>
-      <w:r>
-        <w:rPr>
-          <w:rFonts w:ascii="Arial" w:hAnsi="Arial" w:cs="Arial"/>
-          <w:sz w:val="24"/>
-          <w:szCs w:val="24"/>
-        </w:rPr>
-        <w:t xml:space="preserve">                         </w:t>
-      </w:r>
-    </w:p>
-    <w:p>
+        <w:t/>
+      </w:r>
+      <w:r>
+        <w:rPr>
+          <w:rFonts w:ascii="Arial" w:hAnsi="Arial" w:cs="Arial"/>
+          <w:sz w:val="24"/>
+          <w:szCs w:val="24"/>
+        </w:rPr>
+        <w:t xml:space="preserve"/>
+      </w:r>
+    </w:p>
+    <w:p ns2:paraId="3B999A20" ns2:textId="77777777">
       <w:pPr>
         <w:tabs>
           <w:tab w:val="left" w:pos="0"/>
@@ -1382,15 +1382,15 @@
           <w:sz w:val="24"/>
           <w:szCs w:val="24"/>
         </w:rPr>
-        <w:t>Matrícula:</w:t>
-      </w:r>
-      <w:r>
-        <w:rPr>
-          <w:rFonts w:ascii="Arial" w:hAnsi="Arial" w:cs="Arial"/>
-          <w:sz w:val="24"/>
-          <w:szCs w:val="24"/>
-        </w:rPr>
-        <w:t xml:space="preserve"> </w:t>
+        <w:t xml:space="preserve">Matrícula: {{matricula}}                                      </w:t>
+      </w:r>
+      <w:r>
+        <w:rPr>
+          <w:rFonts w:ascii="Arial" w:hAnsi="Arial" w:cs="Arial"/>
+          <w:sz w:val="24"/>
+          <w:szCs w:val="24"/>
+        </w:rPr>
+        <w:t xml:space="preserve"/>
       </w:r>
       <w:r>
         <w:rPr>
@@ -1400,18 +1400,18 @@
           <w:sz w:val="24"/>
           <w:szCs w:val="24"/>
         </w:rPr>
-        <w:t>{{beneficios}}</w:t>
-      </w:r>
-      <w:r>
-        <w:rPr>
-          <w:rFonts w:ascii="Arial" w:hAnsi="Arial" w:cs="Arial"/>
-          <w:sz w:val="24"/>
-          <w:szCs w:val="24"/>
-        </w:rPr>
-        <w:t xml:space="preserve">                                      </w:t>
-      </w:r>
-    </w:p>
-    <w:p>
+        <w:t/>
+      </w:r>
+      <w:r>
+        <w:rPr>
+          <w:rFonts w:ascii="Arial" w:hAnsi="Arial" w:cs="Arial"/>
+          <w:sz w:val="24"/>
+          <w:szCs w:val="24"/>
+        </w:rPr>
+        <w:t xml:space="preserve"/>
+      </w:r>
+    </w:p>
+    <w:p ns2:paraId="0EBA9359" ns2:textId="77777777">
       <w:pPr>
         <w:tabs>
           <w:tab w:val="left" w:pos="0"/>
@@ -1429,15 +1429,15 @@
           <w:sz w:val="24"/>
           <w:szCs w:val="24"/>
         </w:rPr>
-        <w:t>Turno:</w:t>
-      </w:r>
-      <w:r>
-        <w:rPr>
-          <w:rFonts w:ascii="Arial" w:hAnsi="Arial" w:cs="Arial"/>
-          <w:sz w:val="24"/>
-          <w:szCs w:val="24"/>
-        </w:rPr>
-        <w:t xml:space="preserve"> </w:t>
+        <w:t xml:space="preserve">Turno: {{turno}}</w:t>
+      </w:r>
+      <w:r>
+        <w:rPr>
+          <w:rFonts w:ascii="Arial" w:hAnsi="Arial" w:cs="Arial"/>
+          <w:sz w:val="24"/>
+          <w:szCs w:val="24"/>
+        </w:rPr>
+        <w:t xml:space="preserve"/>
       </w:r>
       <w:r>
         <w:rPr>
@@ -1447,10 +1447,10 @@
           <w:sz w:val="24"/>
           <w:szCs w:val="24"/>
         </w:rPr>
-        <w:t>{{atividades}}</w:t>
-      </w:r>
-    </w:p>
-    <w:p>
+        <w:t/>
+      </w:r>
+    </w:p>
+    <w:p ns2:paraId="26B36904" ns2:textId="77777777">
       <w:pPr>
         <w:tabs>
           <w:tab w:val="left" w:pos="0"/>
@@ -1468,15 +1468,15 @@
           <w:sz w:val="24"/>
           <w:szCs w:val="24"/>
         </w:rPr>
-        <w:t>Endereço:</w:t>
-      </w:r>
-      <w:r>
-        <w:rPr>
-          <w:rFonts w:ascii="Arial" w:hAnsi="Arial" w:cs="Arial"/>
-          <w:sz w:val="24"/>
-          <w:szCs w:val="24"/>
-        </w:rPr>
-        <w:t xml:space="preserve"> </w:t>
+        <w:t xml:space="preserve">Endereço: {{endereco_estudante}}</w:t>
+      </w:r>
+      <w:r>
+        <w:rPr>
+          <w:rFonts w:ascii="Arial" w:hAnsi="Arial" w:cs="Arial"/>
+          <w:sz w:val="24"/>
+          <w:szCs w:val="24"/>
+        </w:rPr>
+        <w:t xml:space="preserve"/>
       </w:r>
       <w:r>
         <w:rPr>
@@ -1486,7 +1486,7 @@
           <w:sz w:val="24"/>
           <w:szCs w:val="24"/>
         </w:rPr>
-        <w:t>{{parecer}}</w:t>
+        <w:t/>
       </w:r>
       <w:r>
         <w:rPr>
@@ -1497,7 +1497,7 @@
         <w:tab/>
       </w:r>
     </w:p>
-    <w:p>
+    <w:p ns2:paraId="4BD09452" ns2:textId="77777777">
       <w:pPr>
         <w:tabs>
           <w:tab w:val="left" w:pos="0"/>
@@ -1515,15 +1515,15 @@
           <w:sz w:val="24"/>
           <w:szCs w:val="24"/>
         </w:rPr>
-        <w:t>E-mail:</w:t>
-      </w:r>
-      <w:r>
-        <w:rPr>
-          <w:rFonts w:ascii="Arial" w:hAnsi="Arial" w:cs="Arial"/>
-          <w:sz w:val="24"/>
-          <w:szCs w:val="24"/>
-        </w:rPr>
-        <w:t xml:space="preserve"> </w:t>
+        <w:t xml:space="preserve">E-mail: {{email_estudante}}                              </w:t>
+      </w:r>
+      <w:r>
+        <w:rPr>
+          <w:rFonts w:ascii="Arial" w:hAnsi="Arial" w:cs="Arial"/>
+          <w:sz w:val="24"/>
+          <w:szCs w:val="24"/>
+        </w:rPr>
+        <w:t xml:space="preserve"/>
       </w:r>
       <w:r>
         <w:rPr>
@@ -1533,7 +1533,7 @@
           <w:sz w:val="24"/>
           <w:szCs w:val="24"/>
         </w:rPr>
-        <w:t>{{comentarios}}</w:t>
+        <w:t/>
       </w:r>
       <w:r>
         <w:rPr>
@@ -1558,10 +1558,10 @@
           <w:szCs w:val="24"/>
         </w:rPr>
         <w:tab/>
-        <w:t xml:space="preserve">                              </w:t>
-      </w:r>
-    </w:p>
-    <w:p>
+        <w:t xml:space="preserve"/>
+      </w:r>
+    </w:p>
+    <w:p ns2:paraId="1BD6EDC6" ns2:textId="77777777">
       <w:pPr>
         <w:tabs>
           <w:tab w:val="left" w:pos="0"/>
@@ -1579,7 +1579,7 @@
           <w:sz w:val="24"/>
           <w:szCs w:val="24"/>
         </w:rPr>
-        <w:t>Bairro:</w:t>
+        <w:t xml:space="preserve">Bairro: {{bairro_estudante}}                                                                  </w:t>
       </w:r>
       <w:r>
         <w:rPr>
@@ -1589,7 +1589,7 @@
           <w:sz w:val="24"/>
           <w:szCs w:val="24"/>
         </w:rPr>
-        <w:t>{{deferido_x}}</w:t>
+        <w:t/>
       </w:r>
       <w:r>
         <w:rPr>
@@ -1607,10 +1607,10 @@
           <w:sz w:val="24"/>
           <w:szCs w:val="24"/>
         </w:rPr>
-        <w:t xml:space="preserve">                                                                  </w:t>
-      </w:r>
-    </w:p>
-    <w:p>
+        <w:t xml:space="preserve"/>
+      </w:r>
+    </w:p>
+    <w:p ns2:paraId="1F6C928F" ns2:textId="77777777">
       <w:pPr>
         <w:tabs>
           <w:tab w:val="left" w:pos="0"/>
@@ -1629,7 +1629,7 @@
           <w:sz w:val="24"/>
           <w:szCs w:val="24"/>
         </w:rPr>
-        <w:t>Município:</w:t>
+        <w:t xml:space="preserve">Município: {{municipio_estudante}}                                       </w:t>
       </w:r>
       <w:r>
         <w:rPr>
@@ -1639,7 +1639,7 @@
           <w:sz w:val="24"/>
           <w:szCs w:val="24"/>
         </w:rPr>
-        <w:t>{{indeferido_x}}</w:t>
+        <w:t/>
       </w:r>
       <w:proofErr w:type="spellEnd"/>
       <w:r>
@@ -1648,10 +1648,10 @@
           <w:sz w:val="24"/>
           <w:szCs w:val="24"/>
         </w:rPr>
-        <w:t xml:space="preserve">                                       </w:t>
-      </w:r>
-    </w:p>
-    <w:p>
+        <w:t xml:space="preserve"/>
+      </w:r>
+    </w:p>
+    <w:p ns2:paraId="233F3252" ns2:textId="77777777">
       <w:pPr>
         <w:tabs>
           <w:tab w:val="left" w:pos="0"/>
@@ -1671,7 +1671,7 @@
           <w:sz w:val="24"/>
           <w:szCs w:val="24"/>
         </w:rPr>
-        <w:t>UF</w:t>
+        <w:t xml:space="preserve">UF: {{uf_estudante}}                              </w:t>
       </w:r>
       <w:r>
         <w:rPr>
@@ -1681,7 +1681,7 @@
           <w:sz w:val="24"/>
           <w:szCs w:val="24"/>
         </w:rPr>
-        <w:t xml:space="preserve">: </w:t>
+        <w:t xml:space="preserve"/>
       </w:r>
       <w:r>
         <w:rPr>
@@ -1691,7 +1691,7 @@
           <w:sz w:val="24"/>
           <w:szCs w:val="24"/>
         </w:rPr>
-        <w:t>{{comentarios}}</w:t>
+        <w:t/>
       </w:r>
       <w:r>
         <w:rPr>
@@ -1701,10 +1701,10 @@
           <w:sz w:val="24"/>
           <w:szCs w:val="24"/>
         </w:rPr>
-        <w:t xml:space="preserve">                              </w:t>
-      </w:r>
-    </w:p>
-    <w:p>
+        <w:t xml:space="preserve"/>
+      </w:r>
+    </w:p>
+    <w:p ns2:paraId="4A7A3A5F" ns2:textId="77777777">
       <w:pPr>
         <w:tabs>
           <w:tab w:val="left" w:pos="0"/>
@@ -1722,7 +1722,7 @@
           <w:sz w:val="24"/>
           <w:szCs w:val="24"/>
         </w:rPr>
-        <w:t>CEP:</w:t>
+        <w:t xml:space="preserve">CEP: {{cep_estudante}}</w:t>
       </w:r>
       <w:r>
         <w:rPr>
@@ -1732,7 +1732,7 @@
           <w:sz w:val="24"/>
           <w:szCs w:val="24"/>
         </w:rPr>
-        <w:t>{{comentarios}}</w:t>
+        <w:t/>
       </w:r>
       <w:r>
         <w:rPr>
@@ -1745,7 +1745,7 @@
         </w:rPr>
       </w:r>
     </w:p>
-    <w:p>
+    <w:p ns2:paraId="4E1E2C65" ns2:textId="77777777">
       <w:pPr>
         <w:tabs>
           <w:tab w:val="left" w:pos="0"/>
@@ -1781,7 +1781,7 @@
       <w:tblGrid>
         <w:gridCol w:w="10582"/>
       </w:tblGrid>
-      <w:tr>
+      <w:tr ns2:paraId="0F4D03A3" ns2:textId="77777777">
         <w:trPr>
           <w:trHeight w:val="270"/>
         </w:trPr>
@@ -1790,7 +1790,7 @@
             <w:tcW w:w="10582" w:type="dxa"/>
             <w:shd w:val="clear" w:color="auto" w:fill="E6E6E6"/>
           </w:tcPr>
-          <w:p>
+          <w:p ns2:paraId="769A0F61" ns2:textId="77777777">
             <w:pPr>
               <w:pStyle w:val="Ttulo3"/>
               <w:tabs>
@@ -1816,7 +1816,7 @@
         </w:tc>
       </w:tr>
     </w:tbl>
-    <w:p>
+    <w:p ns2:paraId="18914063" ns2:textId="77777777">
       <w:pPr>
         <w:tabs>
           <w:tab w:val="left" w:pos="0"/>
@@ -1849,7 +1849,7 @@
         <w:t>ASSOCIAÇÃO DE ENSINO E CULTURA DE MATO GROSSO DO SUL</w:t>
       </w:r>
     </w:p>
-    <w:p>
+    <w:p ns2:paraId="175FC3F9" ns2:textId="77777777">
       <w:pPr>
         <w:tabs>
           <w:tab w:val="left" w:pos="0"/>
@@ -1919,7 +1919,7 @@
         <w:t>6060</w:t>
       </w:r>
     </w:p>
-    <w:p>
+    <w:p ns2:paraId="4FEDEF2A" ns2:textId="77777777">
       <w:pPr>
         <w:pStyle w:val="Ttulo1"/>
         <w:tabs>
@@ -1952,7 +1952,7 @@
         <w:t>79610-320</w:t>
       </w:r>
     </w:p>
-    <w:p>
+    <w:p ns2:paraId="75FCF193" ns2:textId="77777777">
       <w:pPr>
         <w:tabs>
           <w:tab w:val="left" w:pos="0"/>
@@ -2036,7 +2036,7 @@
         <w:t xml:space="preserve"> </w:t>
       </w:r>
     </w:p>
-    <w:p>
+    <w:p ns2:paraId="3D69C29B" ns2:textId="4A5821D4">
       <w:pPr>
         <w:tabs>
           <w:tab w:val="left" w:pos="0"/>
@@ -2073,7 +2073,7 @@
       <w:tblGrid>
         <w:gridCol w:w="9947"/>
       </w:tblGrid>
-      <w:tr>
+      <w:tr ns2:paraId="5E7FC16C" ns2:textId="77777777">
         <w:trPr>
           <w:trHeight w:val="289"/>
         </w:trPr>
@@ -2082,7 +2082,7 @@
             <w:tcW w:w="9947" w:type="dxa"/>
             <w:shd w:val="clear" w:color="auto" w:fill="E6E6E6"/>
           </w:tcPr>
-          <w:p>
+          <w:p ns2:paraId="1D5B9C16" ns2:textId="77777777">
             <w:pPr>
               <w:pStyle w:val="Ttulo3"/>
               <w:tabs>
@@ -2108,7 +2108,7 @@
         </w:tc>
       </w:tr>
     </w:tbl>
-    <w:p>
+    <w:p ns2:paraId="0FB99F1D" ns2:textId="39726DE2">
       <w:pPr>
         <w:ind w:left="15" w:right="-522"/>
         <w:jc w:val="both"/>
@@ -2124,34 +2124,34 @@
           <w:sz w:val="24"/>
           <w:szCs w:val="24"/>
         </w:rPr>
-        <w:t xml:space="preserve">Vigência do plano de atividade de estágio: </w:t>
-      </w:r>
-      <w:r>
-        <w:rPr>
-          <w:rFonts w:ascii="Arial" w:hAnsi="Arial" w:cs="Arial"/>
-          <w:sz w:val="24"/>
-          <w:szCs w:val="24"/>
-        </w:rPr>
-        <w:t>{{data_documento}}</w:t>
-      </w:r>
-      <w:r>
-        <w:rPr>
-          <w:rFonts w:ascii="Arial" w:hAnsi="Arial" w:cs="Arial"/>
-          <w:sz w:val="24"/>
-          <w:szCs w:val="24"/>
-        </w:rPr>
-        <w:t xml:space="preserve"> a </w:t>
-      </w:r>
-      <w:r>
-        <w:rPr>
-          <w:rFonts w:ascii="Arial" w:hAnsi="Arial" w:cs="Arial"/>
-          <w:sz w:val="24"/>
-          <w:szCs w:val="24"/>
-        </w:rPr>
-        <w:t>{{ano_documento}}</w:t>
-      </w:r>
-    </w:p>
-    <w:p>
+        <w:t xml:space="preserve">Vigência do plano de atividade de estágio: {{data_inicio}} a {{data_fim}}</w:t>
+      </w:r>
+      <w:r>
+        <w:rPr>
+          <w:rFonts w:ascii="Arial" w:hAnsi="Arial" w:cs="Arial"/>
+          <w:sz w:val="24"/>
+          <w:szCs w:val="24"/>
+        </w:rPr>
+        <w:t/>
+      </w:r>
+      <w:r>
+        <w:rPr>
+          <w:rFonts w:ascii="Arial" w:hAnsi="Arial" w:cs="Arial"/>
+          <w:sz w:val="24"/>
+          <w:szCs w:val="24"/>
+        </w:rPr>
+        <w:t xml:space="preserve"/>
+      </w:r>
+      <w:r>
+        <w:rPr>
+          <w:rFonts w:ascii="Arial" w:hAnsi="Arial" w:cs="Arial"/>
+          <w:sz w:val="24"/>
+          <w:szCs w:val="24"/>
+        </w:rPr>
+        <w:t/>
+      </w:r>
+    </w:p>
+    <w:p ns2:paraId="662C265F" ns2:textId="1CB600E6">
       <w:pPr>
         <w:ind w:left="15" w:right="-522"/>
         <w:jc w:val="both"/>
@@ -2167,15 +2167,15 @@
           <w:sz w:val="24"/>
           <w:szCs w:val="24"/>
         </w:rPr>
-        <w:t>Horário</w:t>
-      </w:r>
-      <w:r>
-        <w:rPr>
-          <w:rFonts w:ascii="Arial" w:hAnsi="Arial" w:cs="Arial"/>
-          <w:sz w:val="24"/>
-          <w:szCs w:val="24"/>
-        </w:rPr>
-        <w:t xml:space="preserve"> do estágio (</w:t>
+        <w:t xml:space="preserve">Horário do estágio (Ex: 8h às 12h - Máx 6h/dia): {{horario}}     </w:t>
+      </w:r>
+      <w:r>
+        <w:rPr>
+          <w:rFonts w:ascii="Arial" w:hAnsi="Arial" w:cs="Arial"/>
+          <w:sz w:val="24"/>
+          <w:szCs w:val="24"/>
+        </w:rPr>
+        <w:t xml:space="preserve"/>
       </w:r>
       <w:proofErr w:type="spellStart"/>
       <w:r>
@@ -2184,7 +2184,7 @@
           <w:sz w:val="24"/>
           <w:szCs w:val="24"/>
         </w:rPr>
-        <w:t>Ex</w:t>
+        <w:t/>
       </w:r>
       <w:proofErr w:type="spellEnd"/>
       <w:r>
@@ -2193,7 +2193,7 @@
           <w:sz w:val="24"/>
           <w:szCs w:val="24"/>
         </w:rPr>
-        <w:t xml:space="preserve">: 8h às 12h – </w:t>
+        <w:t xml:space="preserve"/>
       </w:r>
       <w:proofErr w:type="spellStart"/>
       <w:r>
@@ -2202,7 +2202,7 @@
           <w:sz w:val="24"/>
           <w:szCs w:val="24"/>
         </w:rPr>
-        <w:t>Máx</w:t>
+        <w:t/>
       </w:r>
       <w:proofErr w:type="spellEnd"/>
       <w:r>
@@ -2211,23 +2211,23 @@
           <w:sz w:val="24"/>
           <w:szCs w:val="24"/>
         </w:rPr>
-        <w:t xml:space="preserve"> 6h/dia)</w:t>
-      </w:r>
-      <w:r>
-        <w:rPr>
-          <w:rFonts w:ascii="Arial" w:hAnsi="Arial" w:cs="Arial"/>
-          <w:sz w:val="24"/>
-          <w:szCs w:val="24"/>
-        </w:rPr>
-        <w:t xml:space="preserve">: </w:t>
-      </w:r>
-      <w:r>
-        <w:rPr>
-          <w:rFonts w:ascii="Arial" w:hAnsi="Arial" w:cs="Arial"/>
-          <w:sz w:val="24"/>
-          <w:szCs w:val="24"/>
-        </w:rPr>
-        <w:t>{{supervisor}}</w:t>
+        <w:t xml:space="preserve"/>
+      </w:r>
+      <w:r>
+        <w:rPr>
+          <w:rFonts w:ascii="Arial" w:hAnsi="Arial" w:cs="Arial"/>
+          <w:sz w:val="24"/>
+          <w:szCs w:val="24"/>
+        </w:rPr>
+        <w:t xml:space="preserve"/>
+      </w:r>
+      <w:r>
+        <w:rPr>
+          <w:rFonts w:ascii="Arial" w:hAnsi="Arial" w:cs="Arial"/>
+          <w:sz w:val="24"/>
+          <w:szCs w:val="24"/>
+        </w:rPr>
+        <w:t/>
       </w:r>
       <w:r>
         <w:rPr>
@@ -2243,18 +2243,18 @@
           <w:sz w:val="24"/>
           <w:szCs w:val="24"/>
         </w:rPr>
-        <w:t xml:space="preserve">  </w:t>
-      </w:r>
-      <w:r>
-        <w:rPr>
-          <w:rFonts w:ascii="Arial" w:hAnsi="Arial" w:cs="Arial"/>
-          <w:sz w:val="24"/>
-          <w:szCs w:val="24"/>
-        </w:rPr>
-        <w:t xml:space="preserve">   </w:t>
-      </w:r>
-    </w:p>
-    <w:p>
+        <w:t xml:space="preserve"/>
+      </w:r>
+      <w:r>
+        <w:rPr>
+          <w:rFonts w:ascii="Arial" w:hAnsi="Arial" w:cs="Arial"/>
+          <w:sz w:val="24"/>
+          <w:szCs w:val="24"/>
+        </w:rPr>
+        <w:t xml:space="preserve"/>
+      </w:r>
+    </w:p>
+    <w:p ns2:paraId="02E83BF9" ns2:textId="2911506B">
       <w:pPr>
         <w:ind w:left="15" w:right="-522"/>
         <w:jc w:val="both"/>
@@ -2270,15 +2270,15 @@
           <w:sz w:val="24"/>
           <w:szCs w:val="24"/>
         </w:rPr>
-        <w:t>Carga Horária Semanal</w:t>
-      </w:r>
-      <w:r>
-        <w:rPr>
-          <w:rFonts w:ascii="Arial" w:hAnsi="Arial" w:cs="Arial"/>
-          <w:sz w:val="24"/>
-          <w:szCs w:val="24"/>
-        </w:rPr>
-        <w:t xml:space="preserve"> (</w:t>
+        <w:t xml:space="preserve">Carga Horária Semanal (Máx 30h/semana): {{carga_horaria}}                          </w:t>
+      </w:r>
+      <w:r>
+        <w:rPr>
+          <w:rFonts w:ascii="Arial" w:hAnsi="Arial" w:cs="Arial"/>
+          <w:sz w:val="24"/>
+          <w:szCs w:val="24"/>
+        </w:rPr>
+        <w:t xml:space="preserve"/>
       </w:r>
       <w:proofErr w:type="spellStart"/>
       <w:r>
@@ -2287,7 +2287,7 @@
           <w:sz w:val="24"/>
           <w:szCs w:val="24"/>
         </w:rPr>
-        <w:t>Máx</w:t>
+        <w:t/>
       </w:r>
       <w:proofErr w:type="spellEnd"/>
       <w:r>
@@ -2296,47 +2296,47 @@
           <w:sz w:val="24"/>
           <w:szCs w:val="24"/>
         </w:rPr>
-        <w:t xml:space="preserve"> 30h/semana): </w:t>
-      </w:r>
-      <w:r>
-        <w:rPr>
-          <w:rFonts w:ascii="Arial" w:hAnsi="Arial" w:cs="Arial"/>
-          <w:sz w:val="24"/>
-          <w:szCs w:val="24"/>
-        </w:rPr>
-        <w:t>{{nome_estudante}}</w:t>
-      </w:r>
-      <w:r>
-        <w:rPr>
-          <w:rFonts w:ascii="Arial" w:hAnsi="Arial" w:cs="Arial"/>
-          <w:sz w:val="24"/>
-          <w:szCs w:val="24"/>
-        </w:rPr>
-        <w:t xml:space="preserve">  </w:t>
-      </w:r>
-      <w:r>
-        <w:rPr>
-          <w:rFonts w:ascii="Arial" w:hAnsi="Arial" w:cs="Arial"/>
-          <w:sz w:val="24"/>
-          <w:szCs w:val="24"/>
-        </w:rPr>
-        <w:t xml:space="preserve">  </w:t>
-      </w:r>
-      <w:r>
-        <w:rPr>
-          <w:rFonts w:ascii="Arial" w:hAnsi="Arial" w:cs="Arial"/>
-          <w:sz w:val="24"/>
-          <w:szCs w:val="24"/>
-        </w:rPr>
-        <w:t xml:space="preserve"> </w:t>
-      </w:r>
-      <w:r>
-        <w:rPr>
-          <w:rFonts w:ascii="Arial" w:hAnsi="Arial" w:cs="Arial"/>
-          <w:sz w:val="24"/>
-          <w:szCs w:val="24"/>
-        </w:rPr>
-        <w:t xml:space="preserve">              </w:t>
+        <w:t xml:space="preserve"/>
+      </w:r>
+      <w:r>
+        <w:rPr>
+          <w:rFonts w:ascii="Arial" w:hAnsi="Arial" w:cs="Arial"/>
+          <w:sz w:val="24"/>
+          <w:szCs w:val="24"/>
+        </w:rPr>
+        <w:t/>
+      </w:r>
+      <w:r>
+        <w:rPr>
+          <w:rFonts w:ascii="Arial" w:hAnsi="Arial" w:cs="Arial"/>
+          <w:sz w:val="24"/>
+          <w:szCs w:val="24"/>
+        </w:rPr>
+        <w:t xml:space="preserve"/>
+      </w:r>
+      <w:r>
+        <w:rPr>
+          <w:rFonts w:ascii="Arial" w:hAnsi="Arial" w:cs="Arial"/>
+          <w:sz w:val="24"/>
+          <w:szCs w:val="24"/>
+        </w:rPr>
+        <w:t xml:space="preserve"/>
+      </w:r>
+      <w:r>
+        <w:rPr>
+          <w:rFonts w:ascii="Arial" w:hAnsi="Arial" w:cs="Arial"/>
+          <w:sz w:val="24"/>
+          <w:szCs w:val="24"/>
+        </w:rPr>
+        <w:t xml:space="preserve"/>
+      </w:r>
+      <w:r>
+        <w:rPr>
+          <w:rFonts w:ascii="Arial" w:hAnsi="Arial" w:cs="Arial"/>
+          <w:sz w:val="24"/>
+          <w:szCs w:val="24"/>
+        </w:rPr>
+        <w:t xml:space="preserve"/>
       </w:r>
       <w:r>
         <w:rPr>
@@ -2369,10 +2369,10 @@
           <w:szCs w:val="24"/>
         </w:rPr>
         <w:tab/>
-        <w:t xml:space="preserve">       </w:t>
-      </w:r>
-    </w:p>
-    <w:p>
+        <w:t xml:space="preserve"/>
+      </w:r>
+    </w:p>
+    <w:p ns2:paraId="46C8F80F" ns2:textId="71D7A472">
       <w:pPr>
         <w:ind w:left="15" w:right="-522"/>
         <w:jc w:val="both"/>
@@ -2388,50 +2388,50 @@
           <w:sz w:val="24"/>
           <w:szCs w:val="24"/>
         </w:rPr>
-        <w:t>Setor de Estágio:</w:t>
-      </w:r>
-      <w:r>
-        <w:rPr>
-          <w:rFonts w:ascii="Arial" w:hAnsi="Arial" w:cs="Arial"/>
-          <w:sz w:val="24"/>
-          <w:szCs w:val="24"/>
-        </w:rPr>
-        <w:t xml:space="preserve"> </w:t>
-      </w:r>
-      <w:r>
-        <w:rPr>
-          <w:rFonts w:ascii="Arial" w:hAnsi="Arial" w:cs="Arial"/>
-          <w:sz w:val="24"/>
-          <w:szCs w:val="24"/>
-        </w:rPr>
-        <w:t>{{coordenador}}</w:t>
-      </w:r>
-      <w:r>
-        <w:rPr>
-          <w:rFonts w:ascii="Arial" w:hAnsi="Arial" w:cs="Arial"/>
-          <w:sz w:val="24"/>
-          <w:szCs w:val="24"/>
-        </w:rPr>
-        <w:t xml:space="preserve">  </w:t>
-      </w:r>
-      <w:r>
-        <w:rPr>
-          <w:rFonts w:ascii="Arial" w:hAnsi="Arial" w:cs="Arial"/>
-          <w:sz w:val="24"/>
-          <w:szCs w:val="24"/>
-        </w:rPr>
-        <w:t xml:space="preserve">  </w:t>
-      </w:r>
-      <w:r>
-        <w:rPr>
-          <w:rFonts w:ascii="Arial" w:hAnsi="Arial" w:cs="Arial"/>
-          <w:sz w:val="24"/>
-          <w:szCs w:val="24"/>
-        </w:rPr>
-        <w:t xml:space="preserve">                                                                        </w:t>
-      </w:r>
-    </w:p>
-    <w:p>
+        <w:t xml:space="preserve">Setor de Estágio: {{setor_estagio}}                                                                            </w:t>
+      </w:r>
+      <w:r>
+        <w:rPr>
+          <w:rFonts w:ascii="Arial" w:hAnsi="Arial" w:cs="Arial"/>
+          <w:sz w:val="24"/>
+          <w:szCs w:val="24"/>
+        </w:rPr>
+        <w:t xml:space="preserve"/>
+      </w:r>
+      <w:r>
+        <w:rPr>
+          <w:rFonts w:ascii="Arial" w:hAnsi="Arial" w:cs="Arial"/>
+          <w:sz w:val="24"/>
+          <w:szCs w:val="24"/>
+        </w:rPr>
+        <w:t/>
+      </w:r>
+      <w:r>
+        <w:rPr>
+          <w:rFonts w:ascii="Arial" w:hAnsi="Arial" w:cs="Arial"/>
+          <w:sz w:val="24"/>
+          <w:szCs w:val="24"/>
+        </w:rPr>
+        <w:t xml:space="preserve"/>
+      </w:r>
+      <w:r>
+        <w:rPr>
+          <w:rFonts w:ascii="Arial" w:hAnsi="Arial" w:cs="Arial"/>
+          <w:sz w:val="24"/>
+          <w:szCs w:val="24"/>
+        </w:rPr>
+        <w:t xml:space="preserve"/>
+      </w:r>
+      <w:r>
+        <w:rPr>
+          <w:rFonts w:ascii="Arial" w:hAnsi="Arial" w:cs="Arial"/>
+          <w:sz w:val="24"/>
+          <w:szCs w:val="24"/>
+        </w:rPr>
+        <w:t xml:space="preserve"/>
+      </w:r>
+    </w:p>
+    <w:p ns2:paraId="2A3A266C" ns2:textId="77777777">
       <w:pPr>
         <w:ind w:left="15" w:right="-522"/>
         <w:jc w:val="both"/>
@@ -2447,10 +2447,10 @@
           <w:sz w:val="24"/>
           <w:szCs w:val="24"/>
         </w:rPr>
-        <w:t xml:space="preserve">Bolsa-auxílio:               </w:t>
-      </w:r>
-    </w:p>
-    <w:p>
+        <w:t xml:space="preserve">Bolsa-auxílio: {{bolsa_auxilio}}              </w:t>
+      </w:r>
+    </w:p>
+    <w:p ns2:paraId="31016419" ns2:textId="685C2CB7">
       <w:pPr>
         <w:ind w:left="15" w:right="-522"/>
         <w:jc w:val="both"/>
@@ -2466,15 +2466,15 @@
           <w:sz w:val="24"/>
           <w:szCs w:val="24"/>
         </w:rPr>
-        <w:t xml:space="preserve">Auxílio-transporte: </w:t>
-      </w:r>
-      <w:r>
-        <w:rPr>
-          <w:rFonts w:ascii="Arial" w:hAnsi="Arial" w:cs="Arial"/>
-          <w:sz w:val="24"/>
-          <w:szCs w:val="24"/>
-        </w:rPr>
-        <w:t>{{estagio_obrigatorio_x}}</w:t>
+        <w:t xml:space="preserve">Auxílio-transporte: {{auxilio_transporte}}</w:t>
+      </w:r>
+      <w:r>
+        <w:rPr>
+          <w:rFonts w:ascii="Arial" w:hAnsi="Arial" w:cs="Arial"/>
+          <w:sz w:val="24"/>
+          <w:szCs w:val="24"/>
+        </w:rPr>
+        <w:t/>
       </w:r>
       <w:r>
         <w:rPr>
@@ -2485,7 +2485,7 @@
         </w:rPr>
       </w:r>
     </w:p>
-    <w:p>
+    <w:p ns2:paraId="057524B5" ns2:textId="3E244A4E">
       <w:pPr>
         <w:ind w:left="15" w:right="-522"/>
         <w:jc w:val="both"/>
@@ -2501,31 +2501,31 @@
           <w:sz w:val="24"/>
           <w:szCs w:val="24"/>
         </w:rPr>
-        <w:t>Vale-transporte</w:t>
-      </w:r>
-      <w:r>
-        <w:rPr>
-          <w:rFonts w:ascii="Arial" w:hAnsi="Arial" w:cs="Arial"/>
-          <w:sz w:val="24"/>
-          <w:szCs w:val="24"/>
-        </w:rPr>
-        <w:t>:</w:t>
-      </w:r>
-      <w:r>
-        <w:rPr>
-          <w:rFonts w:ascii="Arial" w:hAnsi="Arial" w:cs="Arial"/>
-          <w:sz w:val="24"/>
-          <w:szCs w:val="24"/>
-        </w:rPr>
-        <w:t xml:space="preserve"> </w:t>
-      </w:r>
-      <w:r>
-        <w:rPr>
-          <w:rFonts w:ascii="Arial" w:hAnsi="Arial" w:cs="Arial"/>
-          <w:sz w:val="24"/>
-          <w:szCs w:val="24"/>
-        </w:rPr>
-        <w:t>{{estagio_nao_obrigatorio_x}}</w:t>
+        <w:t xml:space="preserve">Vale-transporte: {{vale_transporte_x}}  </w:t>
+      </w:r>
+      <w:r>
+        <w:rPr>
+          <w:rFonts w:ascii="Arial" w:hAnsi="Arial" w:cs="Arial"/>
+          <w:sz w:val="24"/>
+          <w:szCs w:val="24"/>
+        </w:rPr>
+        <w:t/>
+      </w:r>
+      <w:r>
+        <w:rPr>
+          <w:rFonts w:ascii="Arial" w:hAnsi="Arial" w:cs="Arial"/>
+          <w:sz w:val="24"/>
+          <w:szCs w:val="24"/>
+        </w:rPr>
+        <w:t xml:space="preserve"/>
+      </w:r>
+      <w:r>
+        <w:rPr>
+          <w:rFonts w:ascii="Arial" w:hAnsi="Arial" w:cs="Arial"/>
+          <w:sz w:val="24"/>
+          <w:szCs w:val="24"/>
+        </w:rPr>
+        <w:t/>
       </w:r>
       <w:r>
         <w:rPr>
@@ -2549,10 +2549,10 @@
           <w:sz w:val="24"/>
           <w:szCs w:val="24"/>
         </w:rPr>
-        <w:t xml:space="preserve">  </w:t>
-      </w:r>
-    </w:p>
-    <w:p>
+        <w:t xml:space="preserve"/>
+      </w:r>
+    </w:p>
+    <w:p ns2:paraId="02BD107D" ns2:textId="4615CAA0">
       <w:pPr>
         <w:ind w:left="15" w:right="-522"/>
         <w:jc w:val="both"/>
@@ -2568,23 +2568,23 @@
           <w:sz w:val="24"/>
           <w:szCs w:val="24"/>
         </w:rPr>
-        <w:t>Transporte da Empresa</w:t>
-      </w:r>
-      <w:r>
-        <w:rPr>
-          <w:rFonts w:ascii="Arial" w:hAnsi="Arial" w:cs="Arial"/>
-          <w:sz w:val="24"/>
-          <w:szCs w:val="24"/>
-        </w:rPr>
-        <w:t xml:space="preserve">: </w:t>
-      </w:r>
-      <w:r>
-        <w:rPr>
-          <w:rFonts w:ascii="Arial" w:hAnsi="Arial" w:cs="Arial"/>
-          <w:sz w:val="24"/>
-          <w:szCs w:val="24"/>
-        </w:rPr>
-        <w:t>{{vale_transporte_x}}</w:t>
+        <w:t xml:space="preserve">Transporte da Empresa: {{transporte_empresa_x}}     </w:t>
+      </w:r>
+      <w:r>
+        <w:rPr>
+          <w:rFonts w:ascii="Arial" w:hAnsi="Arial" w:cs="Arial"/>
+          <w:sz w:val="24"/>
+          <w:szCs w:val="24"/>
+        </w:rPr>
+        <w:t xml:space="preserve"/>
+      </w:r>
+      <w:r>
+        <w:rPr>
+          <w:rFonts w:ascii="Arial" w:hAnsi="Arial" w:cs="Arial"/>
+          <w:sz w:val="24"/>
+          <w:szCs w:val="24"/>
+        </w:rPr>
+        <w:t/>
       </w:r>
       <w:r>
         <w:rPr>
@@ -2608,10 +2608,10 @@
           <w:sz w:val="24"/>
           <w:szCs w:val="24"/>
         </w:rPr>
-        <w:t xml:space="preserve">     </w:t>
-      </w:r>
-    </w:p>
-    <w:p>
+        <w:t xml:space="preserve"/>
+      </w:r>
+    </w:p>
+    <w:p ns2:paraId="26E1205B" ns2:textId="01BAFEA3">
       <w:pPr>
         <w:ind w:left="15" w:right="-522"/>
         <w:jc w:val="both"/>
@@ -2627,18 +2627,18 @@
           <w:sz w:val="24"/>
           <w:szCs w:val="24"/>
         </w:rPr>
-        <w:t>Outros:</w:t>
-      </w:r>
-      <w:r>
-        <w:rPr>
-          <w:rFonts w:ascii="Arial" w:hAnsi="Arial" w:cs="Arial"/>
-          <w:sz w:val="24"/>
-          <w:szCs w:val="24"/>
-        </w:rPr>
-        <w:t>{{transporte_empresa_x}}</w:t>
-      </w:r>
-    </w:p>
-    <w:p>
+        <w:t xml:space="preserve">Outros: {{outros_transporte_x}}</w:t>
+      </w:r>
+      <w:r>
+        <w:rPr>
+          <w:rFonts w:ascii="Arial" w:hAnsi="Arial" w:cs="Arial"/>
+          <w:sz w:val="24"/>
+          <w:szCs w:val="24"/>
+        </w:rPr>
+        <w:t/>
+      </w:r>
+    </w:p>
+    <w:p ns2:paraId="4B185D2C" ns2:textId="29683A95">
       <w:pPr>
         <w:ind w:left="15" w:right="-522"/>
         <w:jc w:val="both"/>
@@ -2655,47 +2655,47 @@
           <w:sz w:val="24"/>
           <w:szCs w:val="24"/>
         </w:rPr>
-        <w:t>Outro(s) benefício(s)</w:t>
-      </w:r>
-      <w:r>
-        <w:rPr>
-          <w:rFonts w:ascii="Arial" w:hAnsi="Arial" w:cs="Arial"/>
-          <w:sz w:val="24"/>
-          <w:szCs w:val="24"/>
-        </w:rPr>
-        <w:t xml:space="preserve"> (se tiver)</w:t>
-      </w:r>
-      <w:r>
-        <w:rPr>
-          <w:rFonts w:ascii="Arial" w:hAnsi="Arial" w:cs="Arial"/>
-          <w:sz w:val="24"/>
-          <w:szCs w:val="24"/>
-        </w:rPr>
-        <w:t xml:space="preserve">: </w:t>
-      </w:r>
-      <w:r>
-        <w:rPr>
-          <w:rFonts w:ascii="Arial" w:hAnsi="Arial" w:cs="Arial"/>
-          <w:sz w:val="24"/>
-          <w:szCs w:val="24"/>
-        </w:rPr>
-        <w:t>{{outros_transporte_x}}</w:t>
-      </w:r>
-      <w:r>
-        <w:rPr>
-          <w:rFonts w:ascii="Arial" w:hAnsi="Arial" w:cs="Arial"/>
-          <w:sz w:val="24"/>
-          <w:szCs w:val="24"/>
-        </w:rPr>
-        <w:t xml:space="preserve"> </w:t>
-      </w:r>
-      <w:r>
-        <w:rPr>
-          <w:rFonts w:ascii="Arial" w:hAnsi="Arial" w:cs="Arial"/>
-          <w:sz w:val="24"/>
-          <w:szCs w:val="24"/>
-        </w:rPr>
-        <w:t xml:space="preserve">              </w:t>
+        <w:t xml:space="preserve">Outro(s) benefício(s) (se tiver): {{beneficios}}                </w:t>
+      </w:r>
+      <w:r>
+        <w:rPr>
+          <w:rFonts w:ascii="Arial" w:hAnsi="Arial" w:cs="Arial"/>
+          <w:sz w:val="24"/>
+          <w:szCs w:val="24"/>
+        </w:rPr>
+        <w:t xml:space="preserve"/>
+      </w:r>
+      <w:r>
+        <w:rPr>
+          <w:rFonts w:ascii="Arial" w:hAnsi="Arial" w:cs="Arial"/>
+          <w:sz w:val="24"/>
+          <w:szCs w:val="24"/>
+        </w:rPr>
+        <w:t xml:space="preserve"/>
+      </w:r>
+      <w:r>
+        <w:rPr>
+          <w:rFonts w:ascii="Arial" w:hAnsi="Arial" w:cs="Arial"/>
+          <w:sz w:val="24"/>
+          <w:szCs w:val="24"/>
+        </w:rPr>
+        <w:t/>
+      </w:r>
+      <w:r>
+        <w:rPr>
+          <w:rFonts w:ascii="Arial" w:hAnsi="Arial" w:cs="Arial"/>
+          <w:sz w:val="24"/>
+          <w:szCs w:val="24"/>
+        </w:rPr>
+        <w:t xml:space="preserve"/>
+      </w:r>
+      <w:r>
+        <w:rPr>
+          <w:rFonts w:ascii="Arial" w:hAnsi="Arial" w:cs="Arial"/>
+          <w:sz w:val="24"/>
+          <w:szCs w:val="24"/>
+        </w:rPr>
+        <w:t xml:space="preserve"/>
       </w:r>
       <w:r>
         <w:rPr>
@@ -2705,10 +2705,10 @@
           <w:szCs w:val="24"/>
         </w:rPr>
         <w:tab/>
-        <w:t xml:space="preserve"> </w:t>
-      </w:r>
-    </w:p>
-    <w:p>
+        <w:t xml:space="preserve"/>
+      </w:r>
+    </w:p>
+    <w:p ns2:paraId="25A312C9" ns2:textId="2A2E3E4A">
       <w:pPr>
         <w:ind w:left="15" w:right="-522"/>
         <w:jc w:val="both"/>
@@ -2728,7 +2728,7 @@
         <w:t xml:space="preserve">                                                           </w:t>
       </w:r>
     </w:p>
-    <w:p>
+    <w:p ns2:paraId="7C1466AF" ns2:textId="09541DA6">
       <w:pPr>
         <w:ind w:left="-15"/>
         <w:rPr>
@@ -2898,7 +2898,7 @@
         <w:softHyphen/>
       </w:r>
     </w:p>
-    <w:p>
+    <w:p ns2:paraId="7B022611" ns2:textId="64D58798">
       <w:pPr>
         <w:ind w:left="-15"/>
         <w:rPr>
@@ -2911,53 +2911,53 @@
         <w:rPr>
           <w:noProof/>
         </w:rPr>
-        <mc:AlternateContent>
-          <mc:Choice Requires="wps">
+        <ns1:AlternateContent>
+          <ns1:Choice Requires="wps">
             <w:drawing>
-              <wp:anchor distT="45720" distB="45720" distL="114300" distR="114300" simplePos="0" relativeHeight="251659264" behindDoc="0" locked="0" layoutInCell="1" allowOverlap="1" wp14:anchorId="75D9F1C7" wp14:editId="719B1084">
-                <wp:simplePos x="0" y="0"/>
-                <wp:positionH relativeFrom="column">
-                  <wp:posOffset>11430</wp:posOffset>
-                </wp:positionH>
-                <wp:positionV relativeFrom="paragraph">
-                  <wp:posOffset>94615</wp:posOffset>
-                </wp:positionV>
-                <wp:extent cx="6137275" cy="3463290"/>
-                <wp:effectExtent l="13970" t="13335" r="11430" b="9525"/>
-                <wp:wrapSquare wrapText="bothSides"/>
-                <wp:docPr id="3" name="Caixa de Texto 2"/>
-                <wp:cNvGraphicFramePr>
-                  <a:graphicFrameLocks xmlns:a="http://schemas.openxmlformats.org/drawingml/2006/main"/>
-                </wp:cNvGraphicFramePr>
-                <a:graphic xmlns:a="http://schemas.openxmlformats.org/drawingml/2006/main">
-                  <a:graphicData uri="http://schemas.microsoft.com/office/word/2010/wordprocessingShape">
-                    <wps:wsp>
-                      <wps:cNvSpPr txBox="1">
-                        <a:spLocks noChangeArrowheads="1"/>
-                      </wps:cNvSpPr>
-                      <wps:spPr bwMode="auto">
-                        <a:xfrm>
-                          <a:off x="0" y="0"/>
-                          <a:ext cx="6137275" cy="3463290"/>
-                        </a:xfrm>
-                        <a:prstGeom prst="rect">
-                          <a:avLst/>
-                        </a:prstGeom>
-                        <a:solidFill>
-                          <a:srgbClr val="FFFFFF"/>
-                        </a:solidFill>
-                        <a:ln w="9525">
-                          <a:solidFill>
-                            <a:srgbClr val="000000"/>
-                          </a:solidFill>
-                          <a:miter lim="800000"/>
-                          <a:headEnd/>
-                          <a:tailEnd/>
-                        </a:ln>
-                      </wps:spPr>
-                      <wps:txbx>
+              <ns3:anchor distT="45720" distB="45720" distL="114300" distR="114300" simplePos="0" relativeHeight="251659264" behindDoc="0" locked="0" layoutInCell="1" allowOverlap="1" ns4:anchorId="75D9F1C7" ns4:editId="719B1084">
+                <ns3:simplePos x="0" y="0"/>
+                <ns3:positionH relativeFrom="column">
+                  <ns3:posOffset>11430</ns3:posOffset>
+                </ns3:positionH>
+                <ns3:positionV relativeFrom="paragraph">
+                  <ns3:posOffset>94615</ns3:posOffset>
+                </ns3:positionV>
+                <ns3:extent cx="6137275" cy="3463290"/>
+                <ns3:effectExtent l="13970" t="13335" r="11430" b="9525"/>
+                <ns3:wrapSquare wrapText="bothSides"/>
+                <ns3:docPr id="3" name="Caixa de Texto 2"/>
+                <ns3:cNvGraphicFramePr>
+                  <ns5:graphicFrameLocks/>
+                </ns3:cNvGraphicFramePr>
+                <ns5:graphic>
+                  <ns5:graphicData uri="http://schemas.microsoft.com/office/word/2010/wordprocessingShape">
+                    <ns6:wsp>
+                      <ns6:cNvSpPr txBox="1">
+                        <ns5:spLocks noChangeArrowheads="1"/>
+                      </ns6:cNvSpPr>
+                      <ns6:spPr bwMode="auto">
+                        <ns5:xfrm>
+                          <ns5:off x="0" y="0"/>
+                          <ns5:ext cx="6137275" cy="3463290"/>
+                        </ns5:xfrm>
+                        <ns5:prstGeom prst="rect">
+                          <ns5:avLst/>
+                        </ns5:prstGeom>
+                        <ns5:solidFill>
+                          <ns5:srgbClr val="FFFFFF"/>
+                        </ns5:solidFill>
+                        <ns5:ln w="9525">
+                          <ns5:solidFill>
+                            <ns5:srgbClr val="000000"/>
+                          </ns5:solidFill>
+                          <ns5:miter lim="800000"/>
+                          <ns5:headEnd/>
+                          <ns5:tailEnd/>
+                        </ns5:ln>
+                      </ns6:spPr>
+                      <ns6:txbx>
                         <w:txbxContent>
-                          <w:p>
+                          <w:p ns2:paraId="609F1448" ns2:textId="59054D88">
                             <w:pPr>
                               <w:rPr>
                                 <w:color w:val="FF0000"/>
@@ -2967,36 +2967,36 @@
                               <w:rPr>
                                 <w:color w:val="FF0000"/>
                               </w:rPr>
-                              <w:t>[APARECERÁ AQUI A DESCRIÇÃO QUE O ESTUDANTE INFORMAR NO SISTEMA]</w:t>
+                              <w:t xml:space="preserve"/>
                             </w:r>
                           </w:p>
                         </w:txbxContent>
-                      </wps:txbx>
-                      <wps:bodyPr rot="0" vert="horz" wrap="square" lIns="91440" tIns="45720" rIns="91440" bIns="45720" anchor="t" anchorCtr="0" upright="1">
-                        <a:noAutofit/>
-                      </wps:bodyPr>
-                    </wps:wsp>
-                  </a:graphicData>
-                </a:graphic>
-                <wp14:sizeRelH relativeFrom="margin">
-                  <wp14:pctWidth>0</wp14:pctWidth>
-                </wp14:sizeRelH>
-                <wp14:sizeRelV relativeFrom="margin">
-                  <wp14:pctHeight>0</wp14:pctHeight>
-                </wp14:sizeRelV>
-              </wp:anchor>
+                      </ns6:txbx>
+                      <ns6:bodyPr rot="0" vert="horz" wrap="square" lIns="91440" tIns="45720" rIns="91440" bIns="45720" anchor="t" anchorCtr="0" upright="1">
+                        <ns5:noAutofit/>
+                      </ns6:bodyPr>
+                    </ns6:wsp>
+                  </ns5:graphicData>
+                </ns5:graphic>
+                <ns4:sizeRelH relativeFrom="margin">
+                  <ns4:pctWidth>0</ns4:pctWidth>
+                </ns4:sizeRelH>
+                <ns4:sizeRelV relativeFrom="margin">
+                  <ns4:pctHeight>0</ns4:pctHeight>
+                </ns4:sizeRelV>
+              </ns3:anchor>
             </w:drawing>
-          </mc:Choice>
-          <mc:Fallback>
+          </ns1:Choice>
+          <ns1:Fallback>
             <w:pict>
-              <v:shapetype w14:anchorId="75D9F1C7" id="_x0000_t202" coordsize="21600,21600" o:spt="202" path="m,l,21600r21600,l21600,xe">
-                <v:stroke joinstyle="miter"/>
-                <v:path gradientshapeok="t" o:connecttype="rect"/>
-              </v:shapetype>
-              <v:shape id="Caixa de Texto 2" o:spid="_x0000_s1026" type="#_x0000_t202" style="position:absolute;left:0;text-align:left;margin-left:.9pt;margin-top:7.45pt;width:483.25pt;height:272.7pt;z-index:251659264;visibility:visible;mso-wrap-style:square;mso-width-percent:0;mso-height-percent:0;mso-wrap-distance-left:9pt;mso-wrap-distance-top:3.6pt;mso-wrap-distance-right:9pt;mso-wrap-distance-bottom:3.6pt;mso-position-horizontal:absolute;mso-position-horizontal-relative:text;mso-position-vertical:absolute;mso-position-vertical-relative:text;mso-width-percent:0;mso-height-percent:0;mso-width-relative:margin;mso-height-relative:margin;v-text-anchor:top" o:gfxdata="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">
-                <v:textbox>
+              <ns7:shapetype ns2:anchorId="75D9F1C7" id="_x0000_t202" coordsize="21600,21600" ns8:spt="202" path="m,l,21600r21600,l21600,xe">
+                <ns7:stroke joinstyle="miter"/>
+                <ns7:path gradientshapeok="t" ns8:connecttype="rect"/>
+              </ns7:shapetype>
+              <ns7:shape id="Caixa de Texto 2" ns8:spid="_x0000_s1026" type="#_x0000_t202" style="position:absolute;left:0;text-align:left;margin-left:.9pt;margin-top:7.45pt;width:483.25pt;height:272.7pt;z-index:251659264;visibility:visible;mso-wrap-style:square;mso-width-percent:0;mso-height-percent:0;mso-wrap-distance-left:9pt;mso-wrap-distance-top:3.6pt;mso-wrap-distance-right:9pt;mso-wrap-distance-bottom:3.6pt;mso-position-horizontal:absolute;mso-position-horizontal-relative:text;mso-position-vertical:absolute;mso-position-vertical-relative:text;mso-width-percent:0;mso-height-percent:0;mso-width-relative:margin;mso-height-relative:margin;v-text-anchor:top" ns8:gfxdata="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">
+                <ns7:textbox>
                   <w:txbxContent>
-                    <w:p>
+                    <w:p ns2:paraId="609F1448" ns2:textId="59054D88">
                       <w:pPr>
                         <w:rPr>
                           <w:color w:val="FF0000"/>
@@ -3006,19 +3006,20 @@
                         <w:rPr>
                           <w:color w:val="FF0000"/>
                         </w:rPr>
-                        <w:t>[APARECERÁ AQUI A DESCRIÇÃO QUE O ESTUDANTE INFORMAR NO SISTEMA]</w:t>
+                        <w:t xml:space="preserve"/>
                       </w:r>
                     </w:p>
                   </w:txbxContent>
-                </v:textbox>
-                <w10:wrap type="square"/>
-              </v:shape>
+                </ns7:textbox>
+                <ns9:wrap type="square"/>
+              </ns7:shape>
             </w:pict>
-          </mc:Fallback>
-        </mc:AlternateContent>
-      </w:r>
-    </w:p>
-    <w:p>
+          </ns1:Fallback>
+        </ns1:AlternateContent>
+        <w:t xml:space="preserve">{{atividades}}</w:t>
+      </w:r>
+    </w:p>
+    <w:p ns2:paraId="4510187F" ns2:textId="1588A465">
       <w:pPr>
         <w:ind w:left="-15"/>
         <w:rPr>
@@ -3028,7 +3029,7 @@
         </w:rPr>
       </w:pPr>
     </w:p>
-    <w:p>
+    <w:p ns2:paraId="36176B84" ns2:textId="3B8482F7">
       <w:pPr>
         <w:ind w:left="-15"/>
         <w:rPr>
@@ -3038,7 +3039,7 @@
         </w:rPr>
       </w:pPr>
     </w:p>
-    <w:p>
+    <w:p ns2:paraId="65A119AA" ns2:textId="70628A16">
       <w:pPr>
         <w:ind w:left="-15"/>
         <w:rPr>
@@ -3048,7 +3049,7 @@
         </w:rPr>
       </w:pPr>
     </w:p>
-    <w:p>
+    <w:p ns2:paraId="0F586D73" ns2:textId="4E6B8734">
       <w:pPr>
         <w:ind w:left="-15"/>
         <w:rPr>
@@ -3058,7 +3059,7 @@
         </w:rPr>
       </w:pPr>
     </w:p>
-    <w:p>
+    <w:p ns2:paraId="0E2EB919" ns2:textId="317FBA71">
       <w:pPr>
         <w:ind w:left="-15"/>
         <w:rPr>
@@ -3068,7 +3069,7 @@
         </w:rPr>
       </w:pPr>
     </w:p>
-    <w:p>
+    <w:p ns2:paraId="0C204A09" ns2:textId="4DC4EB99">
       <w:pPr>
         <w:ind w:left="-15"/>
         <w:rPr>
@@ -3078,7 +3079,7 @@
         </w:rPr>
       </w:pPr>
     </w:p>
-    <w:p>
+    <w:p ns2:paraId="168F2C7E" ns2:textId="0DAAA46F">
       <w:pPr>
         <w:ind w:left="-15"/>
         <w:rPr>
@@ -3088,7 +3089,7 @@
         </w:rPr>
       </w:pPr>
     </w:p>
-    <w:p>
+    <w:p ns2:paraId="6672F4D0" ns2:textId="7FBEDA81">
       <w:pPr>
         <w:ind w:left="-15"/>
         <w:rPr>
@@ -3098,7 +3099,7 @@
         </w:rPr>
       </w:pPr>
     </w:p>
-    <w:p>
+    <w:p ns2:paraId="57D17A07" ns2:textId="1A433F6E">
       <w:pPr>
         <w:ind w:left="-15"/>
         <w:rPr>
@@ -3108,7 +3109,7 @@
         </w:rPr>
       </w:pPr>
     </w:p>
-    <w:p>
+    <w:p ns2:paraId="20E50D1E" ns2:textId="0E350D8B">
       <w:pPr>
         <w:ind w:left="-15"/>
         <w:rPr>
@@ -3118,7 +3119,7 @@
         </w:rPr>
       </w:pPr>
     </w:p>
-    <w:p>
+    <w:p ns2:paraId="24555894" ns2:textId="7933D963">
       <w:pPr>
         <w:ind w:left="-15"/>
         <w:rPr>
@@ -3128,7 +3129,7 @@
         </w:rPr>
       </w:pPr>
     </w:p>
-    <w:p>
+    <w:p ns2:paraId="5527B0F0" ns2:textId="6EBBB855">
       <w:pPr>
         <w:ind w:left="-15"/>
         <w:rPr>
@@ -3138,7 +3139,7 @@
         </w:rPr>
       </w:pPr>
     </w:p>
-    <w:p>
+    <w:p ns2:paraId="329B8A38" ns2:textId="14124B35">
       <w:pPr>
         <w:ind w:left="-15"/>
         <w:rPr>
@@ -3148,7 +3149,7 @@
         </w:rPr>
       </w:pPr>
     </w:p>
-    <w:p>
+    <w:p ns2:paraId="1CDBE0F6" ns2:textId="3A51F364">
       <w:pPr>
         <w:ind w:left="-15"/>
         <w:rPr>
@@ -3158,7 +3159,7 @@
         </w:rPr>
       </w:pPr>
     </w:p>
-    <w:p>
+    <w:p ns2:paraId="74F31BBE" ns2:textId="2D7C2EC0">
       <w:pPr>
         <w:ind w:left="-15"/>
         <w:rPr>
@@ -3168,7 +3169,7 @@
         </w:rPr>
       </w:pPr>
     </w:p>
-    <w:p>
+    <w:p ns2:paraId="101A56CB" ns2:textId="5D805175">
       <w:pPr>
         <w:ind w:left="-15"/>
         <w:rPr>
@@ -3178,7 +3179,7 @@
         </w:rPr>
       </w:pPr>
     </w:p>
-    <w:p>
+    <w:p ns2:paraId="1EC1D9AF" ns2:textId="0DC8E2CC">
       <w:pPr>
         <w:ind w:left="-15"/>
         <w:rPr>
@@ -3188,7 +3189,7 @@
         </w:rPr>
       </w:pPr>
     </w:p>
-    <w:p>
+    <w:p ns2:paraId="6EB165E0" ns2:textId="269E444D">
       <w:pPr>
         <w:ind w:left="-15"/>
         <w:rPr>
@@ -3198,7 +3199,7 @@
         </w:rPr>
       </w:pPr>
     </w:p>
-    <w:p>
+    <w:p ns2:paraId="20AF169D" ns2:textId="6CE4336D">
       <w:pPr>
         <w:ind w:left="-15"/>
         <w:rPr>
@@ -3208,7 +3209,7 @@
         </w:rPr>
       </w:pPr>
     </w:p>
-    <w:p>
+    <w:p ns2:paraId="600C45C2" ns2:textId="77777777">
       <w:pPr>
         <w:ind w:left="-15"/>
         <w:rPr>
@@ -3218,7 +3219,7 @@
         </w:rPr>
       </w:pPr>
     </w:p>
-    <w:p>
+    <w:p ns2:paraId="35B43439" ns2:textId="77777777">
       <w:pPr>
         <w:ind w:left="-15"/>
         <w:rPr>
@@ -3251,7 +3252,7 @@
       <w:tblGrid>
         <w:gridCol w:w="9887"/>
       </w:tblGrid>
-      <w:tr>
+      <w:tr ns2:paraId="1C139D67" ns2:textId="77777777">
         <w:trPr>
           <w:trHeight w:val="292"/>
         </w:trPr>
@@ -3260,7 +3261,7 @@
             <w:tcW w:w="9887" w:type="dxa"/>
             <w:shd w:val="clear" w:color="auto" w:fill="E6E6E6"/>
           </w:tcPr>
-          <w:p>
+          <w:p ns2:paraId="5D4430DE" ns2:textId="77777777">
             <w:pPr>
               <w:pStyle w:val="Ttulo3"/>
               <w:tabs>
@@ -3286,7 +3287,7 @@
         </w:tc>
       </w:tr>
     </w:tbl>
-    <w:p>
+    <w:p ns2:paraId="0B6DC3F9" ns2:textId="77777777">
       <w:pPr>
         <w:pStyle w:val="Corpodetexto21"/>
         <w:spacing w:after="100"/>
@@ -3332,7 +3333,7 @@
         <w:tab/>
       </w:r>
     </w:p>
-    <w:p>
+    <w:p ns2:paraId="378A2959" ns2:textId="10D19FA9">
       <w:pPr>
         <w:pStyle w:val="Corpodetexto21"/>
         <w:spacing w:after="100"/>
@@ -3366,7 +3367,7 @@
         <w:t>) Indeferido</w:t>
       </w:r>
     </w:p>
-    <w:p>
+    <w:p ns2:paraId="4A610643" ns2:textId="77777777">
       <w:pPr>
         <w:pStyle w:val="Corpodetexto21"/>
         <w:spacing w:after="100"/>
@@ -3384,7 +3385,7 @@
         <w:t>Comentários:</w:t>
       </w:r>
     </w:p>
-    <w:p>
+    <w:p ns2:paraId="57C7582D" ns2:textId="7F69250A">
       <w:pPr>
         <w:rPr>
           <w:rFonts w:ascii="Arial" w:hAnsi="Arial" w:cs="Arial"/>
@@ -3424,7 +3425,7 @@
       <w:tblGrid>
         <w:gridCol w:w="10654"/>
       </w:tblGrid>
-      <w:tr>
+      <w:tr ns2:paraId="1D93E131" ns2:textId="77777777">
         <w:trPr>
           <w:trHeight w:val="281"/>
         </w:trPr>
@@ -3433,7 +3434,7 @@
             <w:tcW w:w="10654" w:type="dxa"/>
             <w:shd w:val="clear" w:color="auto" w:fill="E6E6E6"/>
           </w:tcPr>
-          <w:p>
+          <w:p ns2:paraId="158EAD1D" ns2:textId="77777777">
             <w:pPr>
               <w:pStyle w:val="p7"/>
               <w:spacing w:line="240" w:lineRule="auto"/>
@@ -3460,7 +3461,7 @@
         </w:tc>
       </w:tr>
     </w:tbl>
-    <w:p>
+    <w:p ns2:paraId="4D32DC5B" ns2:textId="77777777">
       <w:pPr>
         <w:ind w:left="-15"/>
         <w:jc w:val="both"/>
@@ -3479,7 +3480,7 @@
         <w:t>As partes, por si, por seus representantes, colaboradores e por quaisquer terceiros que por sua determinação participarem deste convênio de viabilização de concessão de estágio de complementação educacional, objeto desta relação, comprometem-se a atuar de modo a proteger e a garantir o tratamento adequado dos dados pessoais a que tiverem acesso durante a relação contratual, bem como a cumprir as disposições da Lei n° 13.709/2018 (Lei Geral de Proteção de Dados – LGPD). Cada parte será individualmente responsável pelo cumprimento de suas obrigações decorrentes da LGPD e das regulamentações emitidas posteriormente pela autoridade reguladora competente (ANPD).</w:t>
       </w:r>
     </w:p>
-    <w:p>
+    <w:p ns2:paraId="333C7ACE" ns2:textId="1AD94C06">
       <w:pPr>
         <w:tabs>
           <w:tab w:val="left" w:pos="9811"/>
@@ -3493,7 +3494,7 @@
         </w:rPr>
       </w:pPr>
     </w:p>
-    <w:p>
+    <w:p ns2:paraId="1D4636A2" ns2:textId="29AA9E06">
       <w:pPr>
         <w:tabs>
           <w:tab w:val="left" w:pos="9811"/>
@@ -3507,7 +3508,7 @@
         </w:rPr>
       </w:pPr>
     </w:p>
-    <w:p>
+    <w:p ns2:paraId="117D165D" ns2:textId="06CF9A85">
       <w:pPr>
         <w:tabs>
           <w:tab w:val="left" w:pos="9811"/>
@@ -3521,7 +3522,7 @@
         </w:rPr>
       </w:pPr>
     </w:p>
-    <w:p>
+    <w:p ns2:paraId="6567A4A6" ns2:textId="77777777">
       <w:pPr>
         <w:tabs>
           <w:tab w:val="left" w:pos="9811"/>
@@ -3535,7 +3536,7 @@
         </w:rPr>
       </w:pPr>
     </w:p>
-    <w:p>
+    <w:p ns2:paraId="32401252" ns2:textId="5845BF1A">
       <w:pPr>
         <w:tabs>
           <w:tab w:val="left" w:pos="9811"/>
@@ -3613,7 +3614,7 @@
         <w:t xml:space="preserve">.  </w:t>
       </w:r>
     </w:p>
-    <w:p>
+    <w:p ns2:paraId="5F0B9354" ns2:textId="77777777">
       <w:pPr>
         <w:tabs>
           <w:tab w:val="left" w:pos="9639"/>
@@ -3627,52 +3628,52 @@
         </w:rPr>
       </w:pPr>
     </w:p>
-    <w:p>
-      <w:pPr>
-        <w:rPr>
-          <w:rFonts w:ascii="Arial" w:hAnsi="Arial" w:cs="Arial"/>
-          <w:sz w:val="24"/>
-          <w:szCs w:val="24"/>
-        </w:rPr>
-      </w:pPr>
-    </w:p>
-    <w:p>
-      <w:pPr>
-        <w:rPr>
-          <w:rFonts w:ascii="Arial" w:hAnsi="Arial" w:cs="Arial"/>
-          <w:sz w:val="24"/>
-          <w:szCs w:val="24"/>
-        </w:rPr>
-      </w:pPr>
-    </w:p>
-    <w:p>
-      <w:pPr>
-        <w:rPr>
-          <w:rFonts w:ascii="Arial" w:hAnsi="Arial" w:cs="Arial"/>
-          <w:sz w:val="24"/>
-          <w:szCs w:val="24"/>
-        </w:rPr>
-      </w:pPr>
-    </w:p>
-    <w:p>
-      <w:pPr>
-        <w:rPr>
-          <w:rFonts w:ascii="Arial" w:hAnsi="Arial" w:cs="Arial"/>
-          <w:sz w:val="24"/>
-          <w:szCs w:val="24"/>
-        </w:rPr>
-      </w:pPr>
-    </w:p>
-    <w:p>
-      <w:pPr>
-        <w:rPr>
-          <w:rFonts w:ascii="Arial" w:hAnsi="Arial" w:cs="Arial"/>
-          <w:sz w:val="24"/>
-          <w:szCs w:val="24"/>
-        </w:rPr>
-      </w:pPr>
-    </w:p>
-    <w:p>
+    <w:p ns2:paraId="2C83DF85" ns2:textId="4B8756EB">
+      <w:pPr>
+        <w:rPr>
+          <w:rFonts w:ascii="Arial" w:hAnsi="Arial" w:cs="Arial"/>
+          <w:sz w:val="24"/>
+          <w:szCs w:val="24"/>
+        </w:rPr>
+      </w:pPr>
+    </w:p>
+    <w:p ns2:paraId="221E616B" ns2:textId="028C1CDE">
+      <w:pPr>
+        <w:rPr>
+          <w:rFonts w:ascii="Arial" w:hAnsi="Arial" w:cs="Arial"/>
+          <w:sz w:val="24"/>
+          <w:szCs w:val="24"/>
+        </w:rPr>
+      </w:pPr>
+    </w:p>
+    <w:p ns2:paraId="543C1FB4" ns2:textId="219918EE">
+      <w:pPr>
+        <w:rPr>
+          <w:rFonts w:ascii="Arial" w:hAnsi="Arial" w:cs="Arial"/>
+          <w:sz w:val="24"/>
+          <w:szCs w:val="24"/>
+        </w:rPr>
+      </w:pPr>
+    </w:p>
+    <w:p ns2:paraId="095E3975" ns2:textId="77777777">
+      <w:pPr>
+        <w:rPr>
+          <w:rFonts w:ascii="Arial" w:hAnsi="Arial" w:cs="Arial"/>
+          <w:sz w:val="24"/>
+          <w:szCs w:val="24"/>
+        </w:rPr>
+      </w:pPr>
+    </w:p>
+    <w:p ns2:paraId="50452965" ns2:textId="0851E44E">
+      <w:pPr>
+        <w:rPr>
+          <w:rFonts w:ascii="Arial" w:hAnsi="Arial" w:cs="Arial"/>
+          <w:sz w:val="24"/>
+          <w:szCs w:val="24"/>
+        </w:rPr>
+      </w:pPr>
+    </w:p>
+    <w:p ns2:paraId="48B04B4B" ns2:textId="6356067C">
       <w:pPr>
         <w:rPr>
           <w:rFonts w:ascii="Arial" w:hAnsi="Arial" w:cs="Arial"/>
@@ -3689,7 +3690,7 @@
         <w:t>____________________________________</w:t>
       </w:r>
     </w:p>
-    <w:p>
+    <w:p ns2:paraId="072A4763" ns2:textId="77777777">
       <w:pPr>
         <w:ind w:right="-522"/>
         <w:rPr>
@@ -3709,7 +3710,7 @@
         <w:t xml:space="preserve">Supervisor de Estágio da Unidade Concedente de Estágio                                                                                   </w:t>
       </w:r>
     </w:p>
-    <w:p>
+    <w:p ns2:paraId="7C014B72" ns2:textId="77777777">
       <w:pPr>
         <w:ind w:right="-522"/>
         <w:rPr>
@@ -3719,7 +3720,7 @@
         </w:rPr>
       </w:pPr>
     </w:p>
-    <w:p>
+    <w:p ns2:paraId="58B8543E" ns2:textId="1CC96C6A">
       <w:pPr>
         <w:ind w:right="-522"/>
         <w:rPr>
@@ -3729,7 +3730,7 @@
         </w:rPr>
       </w:pPr>
     </w:p>
-    <w:p>
+    <w:p ns2:paraId="7650CFE2" ns2:textId="502F2F96">
       <w:pPr>
         <w:ind w:right="-522"/>
         <w:rPr>
@@ -3739,7 +3740,7 @@
         </w:rPr>
       </w:pPr>
     </w:p>
-    <w:p>
+    <w:p ns2:paraId="3D416708" ns2:textId="77777777">
       <w:pPr>
         <w:ind w:right="-522"/>
         <w:rPr>
@@ -3749,7 +3750,7 @@
         </w:rPr>
       </w:pPr>
     </w:p>
-    <w:p>
+    <w:p ns2:paraId="3284A3DE" ns2:textId="77777777">
       <w:pPr>
         <w:ind w:right="-522"/>
         <w:rPr>
@@ -3759,7 +3760,7 @@
         </w:rPr>
       </w:pPr>
     </w:p>
-    <w:p>
+    <w:p ns2:paraId="258F5138" ns2:textId="77777777">
       <w:pPr>
         <w:ind w:right="-522"/>
         <w:rPr>
@@ -3777,7 +3778,7 @@
         <w:t xml:space="preserve">____________________________________                                               </w:t>
       </w:r>
     </w:p>
-    <w:p>
+    <w:p ns2:paraId="062B9575" ns2:textId="77777777">
       <w:pPr>
         <w:ind w:right="-522"/>
         <w:rPr>
@@ -3796,7 +3797,7 @@
         <w:t>Estagiário</w:t>
       </w:r>
     </w:p>
-    <w:p>
+    <w:p ns2:paraId="51116140" ns2:textId="77777777">
       <w:pPr>
         <w:ind w:right="-522"/>
         <w:rPr>
@@ -3806,7 +3807,7 @@
         </w:rPr>
       </w:pPr>
     </w:p>
-    <w:p>
+    <w:p ns2:paraId="22CCB37C" ns2:textId="77777777">
       <w:pPr>
         <w:ind w:right="-522"/>
         <w:rPr>
@@ -3816,7 +3817,7 @@
         </w:rPr>
       </w:pPr>
     </w:p>
-    <w:p>
+    <w:p ns2:paraId="220E70B8" ns2:textId="4F25E514">
       <w:pPr>
         <w:ind w:right="-522"/>
         <w:rPr>
@@ -3827,7 +3828,7 @@
         </w:rPr>
       </w:pPr>
     </w:p>
-    <w:p>
+    <w:p ns2:paraId="7BD20A53" ns2:textId="77777777">
       <w:pPr>
         <w:ind w:right="-522"/>
         <w:rPr>
@@ -3838,7 +3839,7 @@
         </w:rPr>
       </w:pPr>
     </w:p>
-    <w:p>
+    <w:p ns2:paraId="6DA0E2F1" ns2:textId="77777777">
       <w:pPr>
         <w:ind w:right="-522"/>
         <w:rPr>
@@ -3849,7 +3850,7 @@
         </w:rPr>
       </w:pPr>
     </w:p>
-    <w:p>
+    <w:p ns2:paraId="1F070010" ns2:textId="7643A979">
       <w:pPr>
         <w:ind w:right="-522"/>
         <w:rPr>
@@ -3867,7 +3868,7 @@
         <w:t>_____________________________________</w:t>
       </w:r>
     </w:p>
-    <w:p>
+    <w:p ns2:paraId="6A9A28A5" ns2:textId="77777777">
       <w:pPr>
         <w:ind w:right="-522"/>
         <w:rPr>
@@ -3886,10 +3887,10 @@
         <w:t>Professor orientador da AEMS – Associação de Ensino e Cultura de Mato Grosso do Sul</w:t>
       </w:r>
     </w:p>
-    <w:p/>
+    <w:p ns2:paraId="35187AC2" ns2:textId="77777777"/>
     <w:sectPr>
-      <w:headerReference w:type="default" r:id="rId7"/>
-      <w:footerReference w:type="default" r:id="rId8"/>
+      <w:headerReference w:type="default" ns10:id="rId7"/>
+      <w:footerReference w:type="default" ns10:id="rId8"/>
       <w:pgSz w:w="11907" w:h="16840" w:code="9"/>
       <w:pgMar w:top="1559" w:right="708" w:bottom="719" w:left="709" w:header="426" w:footer="225" w:gutter="0"/>
       <w:cols w:space="720"/>

</xml_diff>

<commit_message>
Compacta termo e plano de atividades
</commit_message>
<xml_diff>
--- a/models/plano-atividades-estagio-aems.docx
+++ b/models/plano-atividades-estagio-aems.docx
@@ -8,6 +8,7 @@
         <w:tabs>
           <w:tab w:val="left" w:pos="0"/>
         </w:tabs>
+        <w:spacing w:before="0" w:after="0" w:line="240" w:lineRule="auto"/>
         <w:rPr>
           <w:rFonts w:ascii="Arial Narrow" w:hAnsi="Arial Narrow" w:cs="Arial"/>
           <w:i/>
@@ -18,8 +19,9 @@
       <w:r>
         <w:rPr>
           <w:rFonts w:ascii="Arial" w:hAnsi="Arial" w:cs="Arial"/>
+          <w:b/>
           <w:i/>
-          <w:sz w:val="26"/>
+          <w:sz w:val="28"/>
           <w:szCs w:val="26"/>
         </w:rPr>
         <w:t>PLANO DE ATIVIDADES DE ESTÁGIO</w:t>
@@ -31,6 +33,7 @@
         <w:tabs>
           <w:tab w:val="left" w:pos="0"/>
         </w:tabs>
+        <w:spacing w:before="0" w:after="0" w:line="240" w:lineRule="auto"/>
         <w:rPr>
           <w:rFonts w:ascii="Arial Narrow" w:hAnsi="Arial Narrow" w:cs="Arial"/>
           <w:i/>
@@ -43,7 +46,7 @@
           <w:rFonts w:ascii="Arial" w:hAnsi="Arial" w:cs="Arial"/>
           <w:b w:val="0"/>
           <w:i/>
-          <w:sz w:val="26"/>
+          <w:sz w:val="18"/>
           <w:szCs w:val="26"/>
         </w:rPr>
         <w:t>(Em conformidade com a Lei N</w:t>
@@ -52,7 +55,7 @@
         <w:rPr>
           <w:rFonts w:ascii="Arial" w:hAnsi="Arial" w:cs="Arial"/>
           <w:i/>
-          <w:sz w:val="26"/>
+          <w:sz w:val="18"/>
           <w:szCs w:val="26"/>
         </w:rPr>
         <w:t>º</w:t>
@@ -62,7 +65,7 @@
           <w:rFonts w:ascii="Arial" w:hAnsi="Arial" w:cs="Arial"/>
           <w:b w:val="0"/>
           <w:i/>
-          <w:sz w:val="26"/>
+          <w:sz w:val="18"/>
           <w:szCs w:val="26"/>
         </w:rPr>
         <w:t>11.788, Art. 7º)</w:t>
@@ -71,6 +74,7 @@
     <w:p ns2:paraId="3E58BB62" ns2:textId="77777777">
       <w:pPr>
         <w:pStyle w:val="Corpodetexto"/>
+        <w:spacing w:before="0" w:after="0" w:line="20" w:lineRule="exact"/>
         <w:ind w:left="0" w:right="283"/>
         <w:jc w:val="center"/>
         <w:rPr>
@@ -84,7 +88,7 @@
         <w:rPr>
           <w:rFonts w:ascii="Arial" w:hAnsi="Arial" w:cs="Arial"/>
           <w:b/>
-          <w:sz w:val="26"/>
+          <w:sz w:val="21"/>
           <w:szCs w:val="26"/>
         </w:rPr>
       </w:r>
@@ -92,6 +96,7 @@
     <w:p ns2:paraId="6D197238" ns2:textId="593818C4">
       <w:pPr>
         <w:pStyle w:val="Corpodetexto"/>
+        <w:spacing w:before="0" w:after="0" w:line="240" w:lineRule="auto"/>
         <w:ind w:left="0" w:right="283"/>
         <w:jc w:val="center"/>
         <w:rPr>
@@ -105,7 +110,7 @@
         <w:rPr>
           <w:rFonts w:ascii="Arial" w:hAnsi="Arial" w:cs="Arial"/>
           <w:b/>
-          <w:sz w:val="26"/>
+          <w:sz w:val="21"/>
           <w:szCs w:val="26"/>
         </w:rPr>
         <w:t>(</w:t>
@@ -114,7 +119,7 @@
         <w:rPr>
           <w:rFonts w:ascii="Arial" w:hAnsi="Arial" w:cs="Arial"/>
           <w:b/>
-          <w:sz w:val="26"/>
+          <w:sz w:val="21"/>
           <w:szCs w:val="26"/>
         </w:rPr>
         <w:t>X</w:t>
@@ -123,7 +128,7 @@
         <w:rPr>
           <w:rFonts w:ascii="Arial" w:hAnsi="Arial" w:cs="Arial"/>
           <w:b/>
-          <w:sz w:val="26"/>
+          <w:sz w:val="21"/>
           <w:szCs w:val="26"/>
         </w:rPr>
         <w:t>) ESTÁGIO OBRIGATÓRIO</w:t>
@@ -133,7 +138,7 @@
         <w:rPr>
           <w:rFonts w:ascii="Arial" w:hAnsi="Arial" w:cs="Arial"/>
           <w:b/>
-          <w:sz w:val="26"/>
+          <w:sz w:val="21"/>
           <w:szCs w:val="26"/>
         </w:rPr>
         <w:t xml:space="preserve">   (</w:t>
@@ -143,7 +148,7 @@
         <w:rPr>
           <w:rFonts w:ascii="Arial" w:hAnsi="Arial" w:cs="Arial"/>
           <w:b/>
-          <w:sz w:val="26"/>
+          <w:sz w:val="21"/>
           <w:szCs w:val="26"/>
         </w:rPr>
         <w:t xml:space="preserve">     ) ESTÁGIO NÃO OBRIGATÓRIO</w:t>
@@ -151,6 +156,7 @@
     </w:p>
     <w:p ns2:paraId="043FC376" ns2:textId="77777777">
       <w:pPr>
+        <w:spacing w:before="0" w:after="0" w:line="20" w:lineRule="exact"/>
         <w:jc w:val="both"/>
         <w:rPr>
           <w:rFonts w:ascii="Arial Narrow" w:hAnsi="Arial Narrow" w:cs="Arial"/>
@@ -162,7 +168,7 @@
     <w:p ns2:paraId="1D3A35C0" ns2:textId="65E81A91">
       <w:pPr>
         <w:pStyle w:val="Corpodetexto"/>
-        <w:spacing w:after="120" w:line="276" w:lineRule="auto"/>
+        <w:spacing w:after="0" w:line="240" w:lineRule="auto" w:before="0"/>
         <w:jc w:val="both"/>
         <w:rPr>
           <w:rFonts w:ascii="Arial" w:hAnsi="Arial" w:cs="Arial"/>
@@ -173,7 +179,7 @@
       <w:r>
         <w:rPr>
           <w:rFonts w:ascii="Arial" w:hAnsi="Arial" w:cs="Arial"/>
-          <w:sz w:val="24"/>
+          <w:sz w:val="21"/>
           <w:szCs w:val="24"/>
         </w:rPr>
         <w:t>Por este</w:t>
@@ -181,7 +187,7 @@
       <w:r>
         <w:rPr>
           <w:rFonts w:ascii="Arial" w:hAnsi="Arial" w:cs="Arial"/>
-          <w:sz w:val="24"/>
+          <w:sz w:val="21"/>
           <w:szCs w:val="24"/>
         </w:rPr>
         <w:t>Plano de Atividade de Estágio</w:t>
@@ -189,7 +195,7 @@
       <w:r>
         <w:rPr>
           <w:rFonts w:ascii="Arial" w:hAnsi="Arial" w:cs="Arial"/>
-          <w:sz w:val="24"/>
+          <w:sz w:val="21"/>
           <w:szCs w:val="24"/>
         </w:rPr>
         <w:t>, sem vínculo empregatício, referente ao Curso de</w:t>
@@ -197,7 +203,7 @@
       <w:r>
         <w:rPr>
           <w:rFonts w:ascii="Arial" w:hAnsi="Arial" w:cs="Arial"/>
-          <w:sz w:val="24"/>
+          <w:sz w:val="21"/>
           <w:szCs w:val="24"/>
         </w:rPr>
         <w:t>{{curso}}</w:t>
@@ -206,14 +212,14 @@
         <w:rPr>
           <w:rFonts w:ascii="Arial" w:hAnsi="Arial" w:cs="Arial"/>
           <w:color w:val="000000"/>
-          <w:sz w:val="24"/>
-          <w:szCs w:val="24"/>
-        </w:rPr>
-      </w:r>
-      <w:r>
-        <w:rPr>
-          <w:rFonts w:ascii="Arial" w:hAnsi="Arial" w:cs="Arial"/>
-          <w:sz w:val="24"/>
+          <w:sz w:val="21"/>
+          <w:szCs w:val="24"/>
+        </w:rPr>
+      </w:r>
+      <w:r>
+        <w:rPr>
+          <w:rFonts w:ascii="Arial" w:hAnsi="Arial" w:cs="Arial"/>
+          <w:sz w:val="21"/>
           <w:szCs w:val="24"/>
         </w:rPr>
         <w:t xml:space="preserve"> as partes a seguir identificadas pretendem proporcionar formação prática e aperfeiçoamento técnico e acadêmico aos estudantes estagiários, nos termos de Lei nº 11.788 de 25/09/08, conforme segue.</w:t>
@@ -225,7 +231,7 @@
         <w:tabs>
           <w:tab w:val="left" w:pos="0"/>
         </w:tabs>
-        <w:spacing w:line="276" w:lineRule="auto"/>
+        <w:spacing w:line="20" w:lineRule="exact" w:before="0" w:after="0"/>
         <w:jc w:val="both"/>
         <w:rPr>
           <w:rFonts w:ascii="Arial" w:hAnsi="Arial" w:cs="Arial"/>
@@ -236,7 +242,7 @@
       <w:r>
         <w:rPr>
           <w:rFonts w:ascii="Arial" w:hAnsi="Arial" w:cs="Arial"/>
-          <w:sz w:val="24"/>
+          <w:sz w:val="21"/>
           <w:szCs w:val="24"/>
         </w:rPr>
         <w:t xml:space="preserve"/>
@@ -248,7 +254,7 @@
         <w:tabs>
           <w:tab w:val="left" w:pos="0"/>
         </w:tabs>
-        <w:spacing w:after="0"/>
+        <w:spacing w:after="0" w:before="0" w:line="20" w:lineRule="exact"/>
         <w:rPr>
           <w:rFonts w:ascii="Arial" w:hAnsi="Arial" w:cs="Arial"/>
           <w:sz w:val="24"/>
@@ -295,7 +301,7 @@
                 <w:tab w:val="left" w:pos="0"/>
               </w:tabs>
               <w:snapToGrid w:val="0"/>
-              <w:spacing w:before="0" w:after="0"/>
+              <w:spacing w:before="0" w:after="0" w:line="240" w:lineRule="auto"/>
               <w:rPr>
                 <w:rFonts w:ascii="Arial" w:hAnsi="Arial" w:cs="Arial"/>
                 <w:sz w:val="24"/>
@@ -305,7 +311,8 @@
             <w:r>
               <w:rPr>
                 <w:rFonts w:ascii="Arial" w:hAnsi="Arial" w:cs="Arial"/>
-                <w:sz w:val="24"/>
+                <w:b/>
+                <w:sz w:val="20"/>
                 <w:szCs w:val="24"/>
               </w:rPr>
               <w:t>A - UNIDADE CONCEDENTE DO ESTÁGIO</w:t>
@@ -324,17 +331,17 @@
           <w:tab w:val="left" w:pos="4320"/>
           <w:tab w:val="left" w:pos="4500"/>
         </w:tabs>
-        <w:spacing w:after="0"/>
-        <w:rPr>
-          <w:rFonts w:ascii="Arial" w:hAnsi="Arial" w:cs="Arial"/>
-          <w:sz w:val="24"/>
-          <w:szCs w:val="24"/>
-        </w:rPr>
-      </w:pPr>
-      <w:r>
-        <w:rPr>
-          <w:rFonts w:ascii="Arial" w:hAnsi="Arial" w:cs="Arial"/>
-          <w:sz w:val="24"/>
+        <w:spacing w:after="0" w:before="0" w:line="240" w:lineRule="auto"/>
+        <w:rPr>
+          <w:rFonts w:ascii="Arial" w:hAnsi="Arial" w:cs="Arial"/>
+          <w:sz w:val="24"/>
+          <w:szCs w:val="24"/>
+        </w:rPr>
+      </w:pPr>
+      <w:r>
+        <w:rPr>
+          <w:rFonts w:ascii="Arial" w:hAnsi="Arial" w:cs="Arial"/>
+          <w:sz w:val="21"/>
           <w:szCs w:val="24"/>
         </w:rPr>
         <w:t>Razão social:</w:t>
@@ -344,7 +351,7 @@
           <w:rFonts w:ascii="Arial" w:hAnsi="Arial" w:cs="Arial"/>
           <w:b/>
           <w:bCs/>
-          <w:sz w:val="24"/>
+          <w:sz w:val="21"/>
           <w:szCs w:val="24"/>
         </w:rPr>
         <w:t>{{razao_social}}</w:t>
@@ -360,17 +367,17 @@
           <w:tab w:val="left" w:pos="4320"/>
           <w:tab w:val="left" w:pos="4500"/>
         </w:tabs>
-        <w:spacing w:after="0"/>
-        <w:rPr>
-          <w:rFonts w:ascii="Arial" w:hAnsi="Arial" w:cs="Arial"/>
-          <w:sz w:val="24"/>
-          <w:szCs w:val="24"/>
-        </w:rPr>
-      </w:pPr>
-      <w:r>
-        <w:rPr>
-          <w:rFonts w:ascii="Arial" w:hAnsi="Arial" w:cs="Arial"/>
-          <w:sz w:val="24"/>
+        <w:spacing w:after="0" w:before="0" w:line="240" w:lineRule="auto"/>
+        <w:rPr>
+          <w:rFonts w:ascii="Arial" w:hAnsi="Arial" w:cs="Arial"/>
+          <w:sz w:val="24"/>
+          <w:szCs w:val="24"/>
+        </w:rPr>
+      </w:pPr>
+      <w:r>
+        <w:rPr>
+          <w:rFonts w:ascii="Arial" w:hAnsi="Arial" w:cs="Arial"/>
+          <w:sz w:val="21"/>
           <w:szCs w:val="24"/>
         </w:rPr>
         <w:t>CNPJ:</w:t>
@@ -378,7 +385,7 @@
       <w:r>
         <w:rPr>
           <w:rFonts w:ascii="Arial" w:hAnsi="Arial" w:cs="Arial"/>
-          <w:sz w:val="24"/>
+          <w:sz w:val="21"/>
           <w:szCs w:val="24"/>
         </w:rPr>
       </w:r>
@@ -387,7 +394,7 @@
           <w:rFonts w:ascii="Arial" w:hAnsi="Arial" w:cs="Arial"/>
           <w:b/>
           <w:bCs/>
-          <w:sz w:val="24"/>
+          <w:sz w:val="21"/>
           <w:szCs w:val="24"/>
         </w:rPr>
         <w:t>{{cnpj}}</w:t>
@@ -395,21 +402,21 @@
       <w:r>
         <w:rPr>
           <w:rFonts w:ascii="Arial" w:hAnsi="Arial" w:cs="Arial"/>
-          <w:sz w:val="24"/>
-          <w:szCs w:val="24"/>
-        </w:rPr>
-      </w:r>
-      <w:r>
-        <w:rPr>
-          <w:rFonts w:ascii="Arial" w:hAnsi="Arial" w:cs="Arial"/>
-          <w:sz w:val="24"/>
-          <w:szCs w:val="24"/>
-        </w:rPr>
-      </w:r>
-      <w:r>
-        <w:rPr>
-          <w:rFonts w:ascii="Arial" w:hAnsi="Arial" w:cs="Arial"/>
-          <w:sz w:val="24"/>
+          <w:sz w:val="21"/>
+          <w:szCs w:val="24"/>
+        </w:rPr>
+      </w:r>
+      <w:r>
+        <w:rPr>
+          <w:rFonts w:ascii="Arial" w:hAnsi="Arial" w:cs="Arial"/>
+          <w:sz w:val="21"/>
+          <w:szCs w:val="24"/>
+        </w:rPr>
+      </w:r>
+      <w:r>
+        <w:rPr>
+          <w:rFonts w:ascii="Arial" w:hAnsi="Arial" w:cs="Arial"/>
+          <w:sz w:val="21"/>
           <w:szCs w:val="24"/>
         </w:rPr>
       </w:r>
@@ -424,17 +431,17 @@
           <w:tab w:val="left" w:pos="4320"/>
           <w:tab w:val="left" w:pos="4500"/>
         </w:tabs>
-        <w:spacing w:after="0"/>
-        <w:rPr>
-          <w:rFonts w:ascii="Arial" w:hAnsi="Arial" w:cs="Arial"/>
-          <w:sz w:val="24"/>
-          <w:szCs w:val="24"/>
-        </w:rPr>
-      </w:pPr>
-      <w:r>
-        <w:rPr>
-          <w:rFonts w:ascii="Arial" w:hAnsi="Arial" w:cs="Arial"/>
-          <w:sz w:val="24"/>
+        <w:spacing w:after="0" w:before="0" w:line="240" w:lineRule="auto"/>
+        <w:rPr>
+          <w:rFonts w:ascii="Arial" w:hAnsi="Arial" w:cs="Arial"/>
+          <w:sz w:val="24"/>
+          <w:szCs w:val="24"/>
+        </w:rPr>
+      </w:pPr>
+      <w:r>
+        <w:rPr>
+          <w:rFonts w:ascii="Arial" w:hAnsi="Arial" w:cs="Arial"/>
+          <w:sz w:val="21"/>
           <w:szCs w:val="24"/>
         </w:rPr>
         <w:t>Telefone: {{telefone_empresa}}</w:t>
@@ -442,7 +449,7 @@
       <w:r>
         <w:rPr>
           <w:rFonts w:ascii="Arial" w:hAnsi="Arial" w:cs="Arial"/>
-          <w:sz w:val="24"/>
+          <w:sz w:val="21"/>
           <w:szCs w:val="24"/>
         </w:rPr>
         <w:t xml:space="preserve"/>
@@ -452,7 +459,7 @@
           <w:rFonts w:ascii="Arial" w:hAnsi="Arial" w:cs="Arial"/>
           <w:b/>
           <w:bCs/>
-          <w:sz w:val="24"/>
+          <w:sz w:val="21"/>
           <w:szCs w:val="24"/>
         </w:rPr>
         <w:t/>
@@ -460,7 +467,7 @@
       <w:r>
         <w:rPr>
           <w:rFonts w:ascii="Arial" w:hAnsi="Arial" w:cs="Arial"/>
-          <w:sz w:val="24"/>
+          <w:sz w:val="21"/>
           <w:szCs w:val="24"/>
         </w:rPr>
         <w:t xml:space="preserve"/>
@@ -476,17 +483,17 @@
           <w:tab w:val="left" w:pos="4320"/>
           <w:tab w:val="left" w:pos="4500"/>
         </w:tabs>
-        <w:spacing w:after="0"/>
-        <w:rPr>
-          <w:rFonts w:ascii="Arial" w:hAnsi="Arial" w:cs="Arial"/>
-          <w:sz w:val="24"/>
-          <w:szCs w:val="24"/>
-        </w:rPr>
-      </w:pPr>
-      <w:r>
-        <w:rPr>
-          <w:rFonts w:ascii="Arial" w:hAnsi="Arial" w:cs="Arial"/>
-          <w:sz w:val="24"/>
+        <w:spacing w:after="0" w:before="0" w:line="240" w:lineRule="auto"/>
+        <w:rPr>
+          <w:rFonts w:ascii="Arial" w:hAnsi="Arial" w:cs="Arial"/>
+          <w:sz w:val="24"/>
+          <w:szCs w:val="24"/>
+        </w:rPr>
+      </w:pPr>
+      <w:r>
+        <w:rPr>
+          <w:rFonts w:ascii="Arial" w:hAnsi="Arial" w:cs="Arial"/>
+          <w:sz w:val="21"/>
           <w:szCs w:val="24"/>
         </w:rPr>
         <w:t>Ramo de atividade: {{ramo_atividade}}</w:t>
@@ -496,7 +503,7 @@
           <w:rFonts w:ascii="Arial" w:hAnsi="Arial" w:cs="Arial"/>
           <w:b/>
           <w:bCs/>
-          <w:sz w:val="24"/>
+          <w:sz w:val="21"/>
           <w:szCs w:val="24"/>
         </w:rPr>
         <w:t/>
@@ -504,7 +511,7 @@
       <w:r>
         <w:rPr>
           <w:rFonts w:ascii="Arial" w:hAnsi="Arial" w:cs="Arial"/>
-          <w:sz w:val="24"/>
+          <w:sz w:val="21"/>
           <w:szCs w:val="24"/>
         </w:rPr>
         <w:t xml:space="preserve"/>
@@ -520,17 +527,17 @@
           <w:tab w:val="left" w:pos="4320"/>
           <w:tab w:val="left" w:pos="4500"/>
         </w:tabs>
-        <w:spacing w:after="0"/>
-        <w:rPr>
-          <w:rFonts w:ascii="Arial" w:hAnsi="Arial" w:cs="Arial"/>
-          <w:sz w:val="24"/>
-          <w:szCs w:val="24"/>
-        </w:rPr>
-      </w:pPr>
-      <w:r>
-        <w:rPr>
-          <w:rFonts w:ascii="Arial" w:hAnsi="Arial" w:cs="Arial"/>
-          <w:sz w:val="24"/>
+        <w:spacing w:after="0" w:before="0" w:line="240" w:lineRule="auto"/>
+        <w:rPr>
+          <w:rFonts w:ascii="Arial" w:hAnsi="Arial" w:cs="Arial"/>
+          <w:sz w:val="24"/>
+          <w:szCs w:val="24"/>
+        </w:rPr>
+      </w:pPr>
+      <w:r>
+        <w:rPr>
+          <w:rFonts w:ascii="Arial" w:hAnsi="Arial" w:cs="Arial"/>
+          <w:sz w:val="21"/>
           <w:szCs w:val="24"/>
         </w:rPr>
         <w:t>E-mail: {{email_empresa}}</w:t>
@@ -538,7 +545,7 @@
       <w:r>
         <w:rPr>
           <w:rFonts w:ascii="Arial" w:hAnsi="Arial" w:cs="Arial"/>
-          <w:sz w:val="24"/>
+          <w:sz w:val="21"/>
           <w:szCs w:val="24"/>
         </w:rPr>
         <w:t xml:space="preserve"/>
@@ -548,7 +555,7 @@
           <w:rFonts w:ascii="Arial" w:hAnsi="Arial" w:cs="Arial"/>
           <w:b/>
           <w:bCs/>
-          <w:sz w:val="24"/>
+          <w:sz w:val="21"/>
           <w:szCs w:val="24"/>
         </w:rPr>
         <w:t/>
@@ -564,17 +571,17 @@
           <w:tab w:val="left" w:pos="4320"/>
           <w:tab w:val="left" w:pos="4500"/>
         </w:tabs>
-        <w:spacing w:after="0"/>
-        <w:rPr>
-          <w:rFonts w:ascii="Arial" w:hAnsi="Arial" w:cs="Arial"/>
-          <w:sz w:val="24"/>
-          <w:szCs w:val="24"/>
-        </w:rPr>
-      </w:pPr>
-      <w:r>
-        <w:rPr>
-          <w:rFonts w:ascii="Arial" w:hAnsi="Arial" w:cs="Arial"/>
-          <w:sz w:val="24"/>
+        <w:spacing w:after="0" w:before="0" w:line="240" w:lineRule="auto"/>
+        <w:rPr>
+          <w:rFonts w:ascii="Arial" w:hAnsi="Arial" w:cs="Arial"/>
+          <w:sz w:val="24"/>
+          <w:szCs w:val="24"/>
+        </w:rPr>
+      </w:pPr>
+      <w:r>
+        <w:rPr>
+          <w:rFonts w:ascii="Arial" w:hAnsi="Arial" w:cs="Arial"/>
+          <w:sz w:val="21"/>
           <w:szCs w:val="24"/>
         </w:rPr>
         <w:t>Endereço: {{endereco_empresa}}</w:t>
@@ -584,7 +591,7 @@
           <w:rFonts w:ascii="Arial" w:hAnsi="Arial" w:cs="Arial"/>
           <w:b/>
           <w:bCs/>
-          <w:sz w:val="24"/>
+          <w:sz w:val="21"/>
           <w:szCs w:val="24"/>
         </w:rPr>
         <w:t/>
@@ -595,14 +602,14 @@
           <w:b/>
           <w:bCs/>
           <w:color w:val="000000"/>
-          <w:sz w:val="24"/>
-          <w:szCs w:val="24"/>
-        </w:rPr>
-      </w:r>
-      <w:r>
-        <w:rPr>
-          <w:rFonts w:ascii="Arial" w:hAnsi="Arial" w:cs="Arial"/>
-          <w:sz w:val="24"/>
+          <w:sz w:val="21"/>
+          <w:szCs w:val="24"/>
+        </w:rPr>
+      </w:r>
+      <w:r>
+        <w:rPr>
+          <w:rFonts w:ascii="Arial" w:hAnsi="Arial" w:cs="Arial"/>
+          <w:sz w:val="21"/>
           <w:szCs w:val="24"/>
         </w:rPr>
         <w:t xml:space="preserve"/>
@@ -614,17 +621,17 @@
         <w:tabs>
           <w:tab w:val="left" w:pos="0"/>
         </w:tabs>
-        <w:spacing w:after="0"/>
-        <w:rPr>
-          <w:rFonts w:ascii="Arial" w:hAnsi="Arial" w:cs="Arial"/>
-          <w:sz w:val="24"/>
-          <w:szCs w:val="24"/>
-        </w:rPr>
-      </w:pPr>
-      <w:r>
-        <w:rPr>
-          <w:rFonts w:ascii="Arial" w:hAnsi="Arial" w:cs="Arial"/>
-          <w:sz w:val="24"/>
+        <w:spacing w:after="0" w:before="0" w:line="240" w:lineRule="auto"/>
+        <w:rPr>
+          <w:rFonts w:ascii="Arial" w:hAnsi="Arial" w:cs="Arial"/>
+          <w:sz w:val="24"/>
+          <w:szCs w:val="24"/>
+        </w:rPr>
+      </w:pPr>
+      <w:r>
+        <w:rPr>
+          <w:rFonts w:ascii="Arial" w:hAnsi="Arial" w:cs="Arial"/>
+          <w:sz w:val="21"/>
           <w:szCs w:val="24"/>
         </w:rPr>
         <w:t>Bairro: {{bairro_empresa}}</w:t>
@@ -634,7 +641,7 @@
           <w:rFonts w:ascii="Arial" w:hAnsi="Arial" w:cs="Arial"/>
           <w:b/>
           <w:bCs/>
-          <w:sz w:val="24"/>
+          <w:sz w:val="21"/>
           <w:szCs w:val="24"/>
         </w:rPr>
         <w:t/>
@@ -642,7 +649,7 @@
       <w:r>
         <w:rPr>
           <w:rFonts w:ascii="Arial" w:hAnsi="Arial" w:cs="Arial"/>
-          <w:sz w:val="24"/>
+          <w:sz w:val="21"/>
           <w:szCs w:val="24"/>
         </w:rPr>
         <w:t xml:space="preserve"/>
@@ -654,17 +661,17 @@
         <w:tabs>
           <w:tab w:val="left" w:pos="0"/>
         </w:tabs>
-        <w:spacing w:after="0"/>
-        <w:rPr>
-          <w:rFonts w:ascii="Arial" w:hAnsi="Arial" w:cs="Arial"/>
-          <w:sz w:val="24"/>
-          <w:szCs w:val="24"/>
-        </w:rPr>
-      </w:pPr>
-      <w:r>
-        <w:rPr>
-          <w:rFonts w:ascii="Arial" w:hAnsi="Arial" w:cs="Arial"/>
-          <w:sz w:val="24"/>
+        <w:spacing w:after="0" w:before="0" w:line="240" w:lineRule="auto"/>
+        <w:rPr>
+          <w:rFonts w:ascii="Arial" w:hAnsi="Arial" w:cs="Arial"/>
+          <w:sz w:val="24"/>
+          <w:szCs w:val="24"/>
+        </w:rPr>
+      </w:pPr>
+      <w:r>
+        <w:rPr>
+          <w:rFonts w:ascii="Arial" w:hAnsi="Arial" w:cs="Arial"/>
+          <w:sz w:val="21"/>
           <w:szCs w:val="24"/>
         </w:rPr>
         <w:t>Município: {{municipio_empresa}}</w:t>
@@ -674,7 +681,7 @@
           <w:rFonts w:ascii="Arial" w:hAnsi="Arial" w:cs="Arial"/>
           <w:b/>
           <w:bCs/>
-          <w:sz w:val="24"/>
+          <w:sz w:val="21"/>
           <w:szCs w:val="24"/>
         </w:rPr>
         <w:t/>
@@ -682,7 +689,7 @@
       <w:r>
         <w:rPr>
           <w:rFonts w:ascii="Arial" w:hAnsi="Arial" w:cs="Arial"/>
-          <w:sz w:val="24"/>
+          <w:sz w:val="21"/>
           <w:szCs w:val="24"/>
         </w:rPr>
         <w:t xml:space="preserve"/>
@@ -694,17 +701,17 @@
         <w:tabs>
           <w:tab w:val="left" w:pos="0"/>
         </w:tabs>
-        <w:spacing w:after="0"/>
-        <w:rPr>
-          <w:rFonts w:ascii="Arial" w:hAnsi="Arial" w:cs="Arial"/>
-          <w:sz w:val="24"/>
-          <w:szCs w:val="24"/>
-        </w:rPr>
-      </w:pPr>
-      <w:r>
-        <w:rPr>
-          <w:rFonts w:ascii="Arial" w:hAnsi="Arial" w:cs="Arial"/>
-          <w:sz w:val="24"/>
+        <w:spacing w:after="0" w:before="0" w:line="240" w:lineRule="auto"/>
+        <w:rPr>
+          <w:rFonts w:ascii="Arial" w:hAnsi="Arial" w:cs="Arial"/>
+          <w:sz w:val="24"/>
+          <w:szCs w:val="24"/>
+        </w:rPr>
+      </w:pPr>
+      <w:r>
+        <w:rPr>
+          <w:rFonts w:ascii="Arial" w:hAnsi="Arial" w:cs="Arial"/>
+          <w:sz w:val="21"/>
           <w:szCs w:val="24"/>
         </w:rPr>
         <w:t>UF: {{uf_empresa}}</w:t>
@@ -714,7 +721,7 @@
           <w:rFonts w:ascii="Arial" w:hAnsi="Arial" w:cs="Arial"/>
           <w:b/>
           <w:bCs/>
-          <w:sz w:val="24"/>
+          <w:sz w:val="21"/>
           <w:szCs w:val="24"/>
         </w:rPr>
         <w:t/>
@@ -722,7 +729,7 @@
       <w:r>
         <w:rPr>
           <w:rFonts w:ascii="Arial" w:hAnsi="Arial" w:cs="Arial"/>
-          <w:sz w:val="24"/>
+          <w:sz w:val="21"/>
           <w:szCs w:val="24"/>
         </w:rPr>
         <w:t xml:space="preserve"/>
@@ -734,17 +741,17 @@
         <w:tabs>
           <w:tab w:val="left" w:pos="0"/>
         </w:tabs>
-        <w:spacing w:after="0"/>
-        <w:rPr>
-          <w:rFonts w:ascii="Arial" w:hAnsi="Arial" w:cs="Arial"/>
-          <w:sz w:val="24"/>
-          <w:szCs w:val="24"/>
-        </w:rPr>
-      </w:pPr>
-      <w:r>
-        <w:rPr>
-          <w:rFonts w:ascii="Arial" w:hAnsi="Arial" w:cs="Arial"/>
-          <w:sz w:val="24"/>
+        <w:spacing w:after="0" w:before="0" w:line="240" w:lineRule="auto"/>
+        <w:rPr>
+          <w:rFonts w:ascii="Arial" w:hAnsi="Arial" w:cs="Arial"/>
+          <w:sz w:val="24"/>
+          <w:szCs w:val="24"/>
+        </w:rPr>
+      </w:pPr>
+      <w:r>
+        <w:rPr>
+          <w:rFonts w:ascii="Arial" w:hAnsi="Arial" w:cs="Arial"/>
+          <w:sz w:val="21"/>
           <w:szCs w:val="24"/>
         </w:rPr>
         <w:t>CEP: {{cep_empresa}}</w:t>
@@ -754,7 +761,7 @@
           <w:rFonts w:ascii="Arial" w:hAnsi="Arial" w:cs="Arial"/>
           <w:b/>
           <w:bCs/>
-          <w:sz w:val="24"/>
+          <w:sz w:val="21"/>
           <w:szCs w:val="24"/>
         </w:rPr>
         <w:t/>
@@ -762,7 +769,7 @@
       <w:r>
         <w:rPr>
           <w:rFonts w:ascii="Arial" w:hAnsi="Arial" w:cs="Arial"/>
-          <w:sz w:val="24"/>
+          <w:sz w:val="21"/>
           <w:szCs w:val="24"/>
         </w:rPr>
         <w:t xml:space="preserve"/>
@@ -774,6 +781,7 @@
           <w:tab w:val="left" w:pos="0"/>
           <w:tab w:val="left" w:pos="4500"/>
         </w:tabs>
+        <w:spacing w:before="0" w:after="0" w:line="240" w:lineRule="auto"/>
         <w:jc w:val="both"/>
         <w:rPr>
           <w:rFonts w:ascii="Arial" w:hAnsi="Arial" w:cs="Arial"/>
@@ -784,7 +792,7 @@
       <w:r>
         <w:rPr>
           <w:rFonts w:ascii="Arial" w:hAnsi="Arial" w:cs="Arial"/>
-          <w:sz w:val="24"/>
+          <w:sz w:val="21"/>
           <w:szCs w:val="24"/>
         </w:rPr>
         <w:t>Representada por: {{representante_legal}}</w:t>
@@ -794,7 +802,7 @@
           <w:rFonts w:ascii="Arial" w:hAnsi="Arial" w:cs="Arial"/>
           <w:b/>
           <w:bCs/>
-          <w:sz w:val="24"/>
+          <w:sz w:val="21"/>
           <w:szCs w:val="24"/>
         </w:rPr>
         <w:t/>
@@ -802,7 +810,7 @@
       <w:r>
         <w:rPr>
           <w:rFonts w:ascii="Arial" w:hAnsi="Arial" w:cs="Arial"/>
-          <w:sz w:val="24"/>
+          <w:sz w:val="21"/>
           <w:szCs w:val="24"/>
         </w:rPr>
         <w:t xml:space="preserve"/>
@@ -810,7 +818,7 @@
       <w:r>
         <w:rPr>
           <w:rFonts w:ascii="Arial" w:hAnsi="Arial" w:cs="Arial"/>
-          <w:sz w:val="24"/>
+          <w:sz w:val="21"/>
           <w:szCs w:val="24"/>
         </w:rPr>
       </w:r>
@@ -821,6 +829,7 @@
           <w:tab w:val="left" w:pos="0"/>
           <w:tab w:val="left" w:pos="4500"/>
         </w:tabs>
+        <w:spacing w:before="0" w:after="0" w:line="240" w:lineRule="auto"/>
         <w:jc w:val="both"/>
         <w:rPr>
           <w:rFonts w:ascii="Arial" w:hAnsi="Arial" w:cs="Arial"/>
@@ -832,7 +841,7 @@
       <w:r>
         <w:rPr>
           <w:rFonts w:ascii="Arial" w:hAnsi="Arial" w:cs="Arial"/>
-          <w:sz w:val="24"/>
+          <w:sz w:val="21"/>
           <w:szCs w:val="24"/>
         </w:rPr>
         <w:t>Cargo:  {{cargo_representante}}</w:t>
@@ -842,7 +851,7 @@
           <w:rFonts w:ascii="Arial" w:hAnsi="Arial" w:cs="Arial"/>
           <w:b/>
           <w:bCs/>
-          <w:sz w:val="24"/>
+          <w:sz w:val="21"/>
           <w:szCs w:val="24"/>
         </w:rPr>
         <w:t/>
@@ -854,6 +863,7 @@
           <w:tab w:val="left" w:pos="0"/>
           <w:tab w:val="left" w:pos="4500"/>
         </w:tabs>
+        <w:spacing w:before="0" w:after="0" w:line="20" w:lineRule="exact"/>
         <w:jc w:val="both"/>
         <w:rPr>
           <w:rFonts w:ascii="Arial" w:hAnsi="Arial" w:cs="Arial"/>
@@ -901,7 +911,7 @@
                 <w:tab w:val="left" w:pos="0"/>
               </w:tabs>
               <w:snapToGrid w:val="0"/>
-              <w:spacing w:before="0" w:after="0"/>
+              <w:spacing w:before="0" w:after="0" w:line="240" w:lineRule="auto"/>
               <w:rPr>
                 <w:rFonts w:ascii="Arial" w:hAnsi="Arial" w:cs="Arial"/>
                 <w:sz w:val="24"/>
@@ -911,7 +921,8 @@
             <w:r>
               <w:rPr>
                 <w:rFonts w:ascii="Arial" w:hAnsi="Arial" w:cs="Arial"/>
-                <w:sz w:val="24"/>
+                <w:b/>
+                <w:sz w:val="20"/>
                 <w:szCs w:val="24"/>
               </w:rPr>
               <w:t>B – ESTAGIÁRIO</w:t>
@@ -936,7 +947,7 @@
       <w:r>
         <w:rPr>
           <w:rFonts w:ascii="Arial" w:hAnsi="Arial" w:cs="Arial"/>
-          <w:sz w:val="24"/>
+          <w:sz w:val="21"/>
           <w:szCs w:val="24"/>
         </w:rPr>
         <w:t>Nome: {{nome_estudante}}</w:t>
@@ -944,7 +955,7 @@
       <w:r>
         <w:rPr>
           <w:rFonts w:ascii="Arial" w:hAnsi="Arial" w:cs="Arial"/>
-          <w:sz w:val="24"/>
+          <w:sz w:val="21"/>
           <w:szCs w:val="24"/>
         </w:rPr>
         <w:t xml:space="preserve"/>
@@ -954,7 +965,7 @@
           <w:rFonts w:ascii="Arial" w:hAnsi="Arial" w:cs="Arial"/>
           <w:b/>
           <w:bCs/>
-          <w:sz w:val="24"/>
+          <w:sz w:val="21"/>
           <w:szCs w:val="24"/>
         </w:rPr>
         <w:t/>
@@ -962,7 +973,7 @@
       <w:r>
         <w:rPr>
           <w:rFonts w:ascii="Arial" w:hAnsi="Arial" w:cs="Arial"/>
-          <w:sz w:val="24"/>
+          <w:sz w:val="21"/>
           <w:szCs w:val="24"/>
         </w:rPr>
         <w:t xml:space="preserve"/>
@@ -970,35 +981,35 @@
       <w:r>
         <w:rPr>
           <w:rFonts w:ascii="Arial" w:hAnsi="Arial" w:cs="Arial"/>
-          <w:sz w:val="24"/>
-          <w:szCs w:val="24"/>
-        </w:rPr>
-      </w:r>
-      <w:r>
-        <w:rPr>
-          <w:rFonts w:ascii="Arial" w:hAnsi="Arial" w:cs="Arial"/>
-          <w:sz w:val="24"/>
-          <w:szCs w:val="24"/>
-        </w:rPr>
-      </w:r>
-      <w:r>
-        <w:rPr>
-          <w:rFonts w:ascii="Arial" w:hAnsi="Arial" w:cs="Arial"/>
-          <w:sz w:val="24"/>
-          <w:szCs w:val="24"/>
-        </w:rPr>
-      </w:r>
-      <w:r>
-        <w:rPr>
-          <w:rFonts w:ascii="Arial" w:hAnsi="Arial" w:cs="Arial"/>
-          <w:sz w:val="24"/>
-          <w:szCs w:val="24"/>
-        </w:rPr>
-      </w:r>
-      <w:r>
-        <w:rPr>
-          <w:rFonts w:ascii="Arial" w:hAnsi="Arial" w:cs="Arial"/>
-          <w:sz w:val="24"/>
+          <w:sz w:val="21"/>
+          <w:szCs w:val="24"/>
+        </w:rPr>
+      </w:r>
+      <w:r>
+        <w:rPr>
+          <w:rFonts w:ascii="Arial" w:hAnsi="Arial" w:cs="Arial"/>
+          <w:sz w:val="21"/>
+          <w:szCs w:val="24"/>
+        </w:rPr>
+      </w:r>
+      <w:r>
+        <w:rPr>
+          <w:rFonts w:ascii="Arial" w:hAnsi="Arial" w:cs="Arial"/>
+          <w:sz w:val="21"/>
+          <w:szCs w:val="24"/>
+        </w:rPr>
+      </w:r>
+      <w:r>
+        <w:rPr>
+          <w:rFonts w:ascii="Arial" w:hAnsi="Arial" w:cs="Arial"/>
+          <w:sz w:val="21"/>
+          <w:szCs w:val="24"/>
+        </w:rPr>
+      </w:r>
+      <w:r>
+        <w:rPr>
+          <w:rFonts w:ascii="Arial" w:hAnsi="Arial" w:cs="Arial"/>
+          <w:sz w:val="21"/>
           <w:szCs w:val="24"/>
         </w:rPr>
       </w:r>
@@ -1019,7 +1030,7 @@
       <w:r>
         <w:rPr>
           <w:rFonts w:ascii="Arial" w:hAnsi="Arial" w:cs="Arial"/>
-          <w:sz w:val="24"/>
+          <w:sz w:val="21"/>
           <w:szCs w:val="24"/>
         </w:rPr>
         <w:t>Telefone: {{telefone_estudante}}</w:t>
@@ -1027,7 +1038,7 @@
       <w:r>
         <w:rPr>
           <w:rFonts w:ascii="Arial" w:hAnsi="Arial" w:cs="Arial"/>
-          <w:sz w:val="24"/>
+          <w:sz w:val="21"/>
           <w:szCs w:val="24"/>
         </w:rPr>
         <w:t xml:space="preserve"/>
@@ -1037,7 +1048,7 @@
           <w:rFonts w:ascii="Arial" w:hAnsi="Arial" w:cs="Arial"/>
           <w:b/>
           <w:bCs/>
-          <w:sz w:val="24"/>
+          <w:sz w:val="21"/>
           <w:szCs w:val="24"/>
         </w:rPr>
         <w:t/>
@@ -1045,7 +1056,7 @@
       <w:r>
         <w:rPr>
           <w:rFonts w:ascii="Arial" w:hAnsi="Arial" w:cs="Arial"/>
-          <w:sz w:val="24"/>
+          <w:sz w:val="21"/>
           <w:szCs w:val="24"/>
         </w:rPr>
         <w:t xml:space="preserve"/>
@@ -1067,7 +1078,7 @@
       <w:r>
         <w:rPr>
           <w:rFonts w:ascii="Arial" w:hAnsi="Arial" w:cs="Arial"/>
-          <w:sz w:val="24"/>
+          <w:sz w:val="21"/>
           <w:szCs w:val="24"/>
         </w:rPr>
         <w:t>Identidade: {{rg}}</w:t>
@@ -1075,7 +1086,7 @@
       <w:r>
         <w:rPr>
           <w:rFonts w:ascii="Arial" w:hAnsi="Arial" w:cs="Arial"/>
-          <w:sz w:val="24"/>
+          <w:sz w:val="21"/>
           <w:szCs w:val="24"/>
         </w:rPr>
         <w:t xml:space="preserve"/>
@@ -1085,7 +1096,7 @@
           <w:rFonts w:ascii="Arial" w:hAnsi="Arial" w:cs="Arial"/>
           <w:b/>
           <w:bCs/>
-          <w:sz w:val="24"/>
+          <w:sz w:val="21"/>
           <w:szCs w:val="24"/>
         </w:rPr>
         <w:t/>
@@ -1093,21 +1104,21 @@
       <w:r>
         <w:rPr>
           <w:rFonts w:ascii="Arial" w:hAnsi="Arial" w:cs="Arial"/>
-          <w:sz w:val="24"/>
-          <w:szCs w:val="24"/>
-        </w:rPr>
-      </w:r>
-      <w:r>
-        <w:rPr>
-          <w:rFonts w:ascii="Arial" w:hAnsi="Arial" w:cs="Arial"/>
-          <w:sz w:val="24"/>
-          <w:szCs w:val="24"/>
-        </w:rPr>
-      </w:r>
-      <w:r>
-        <w:rPr>
-          <w:rFonts w:ascii="Arial" w:hAnsi="Arial" w:cs="Arial"/>
-          <w:sz w:val="24"/>
+          <w:sz w:val="21"/>
+          <w:szCs w:val="24"/>
+        </w:rPr>
+      </w:r>
+      <w:r>
+        <w:rPr>
+          <w:rFonts w:ascii="Arial" w:hAnsi="Arial" w:cs="Arial"/>
+          <w:sz w:val="21"/>
+          <w:szCs w:val="24"/>
+        </w:rPr>
+      </w:r>
+      <w:r>
+        <w:rPr>
+          <w:rFonts w:ascii="Arial" w:hAnsi="Arial" w:cs="Arial"/>
+          <w:sz w:val="21"/>
           <w:szCs w:val="24"/>
         </w:rPr>
       </w:r>
@@ -1128,7 +1139,7 @@
       <w:r>
         <w:rPr>
           <w:rFonts w:ascii="Arial" w:hAnsi="Arial" w:cs="Arial"/>
-          <w:sz w:val="24"/>
+          <w:sz w:val="21"/>
           <w:szCs w:val="24"/>
         </w:rPr>
         <w:t>CPF: {{cpf}}</w:t>
@@ -1136,7 +1147,7 @@
       <w:r>
         <w:rPr>
           <w:rFonts w:ascii="Arial" w:hAnsi="Arial" w:cs="Arial"/>
-          <w:sz w:val="24"/>
+          <w:sz w:val="21"/>
           <w:szCs w:val="24"/>
         </w:rPr>
         <w:t xml:space="preserve"/>
@@ -1146,7 +1157,7 @@
           <w:rFonts w:ascii="Arial" w:hAnsi="Arial" w:cs="Arial"/>
           <w:b/>
           <w:bCs/>
-          <w:sz w:val="24"/>
+          <w:sz w:val="21"/>
           <w:szCs w:val="24"/>
         </w:rPr>
         <w:t/>
@@ -1154,21 +1165,21 @@
       <w:r>
         <w:rPr>
           <w:rFonts w:ascii="Arial" w:hAnsi="Arial" w:cs="Arial"/>
-          <w:sz w:val="24"/>
-          <w:szCs w:val="24"/>
-        </w:rPr>
-      </w:r>
-      <w:r>
-        <w:rPr>
-          <w:rFonts w:ascii="Arial" w:hAnsi="Arial" w:cs="Arial"/>
-          <w:sz w:val="24"/>
-          <w:szCs w:val="24"/>
-        </w:rPr>
-      </w:r>
-      <w:r>
-        <w:rPr>
-          <w:rFonts w:ascii="Arial" w:hAnsi="Arial" w:cs="Arial"/>
-          <w:sz w:val="24"/>
+          <w:sz w:val="21"/>
+          <w:szCs w:val="24"/>
+        </w:rPr>
+      </w:r>
+      <w:r>
+        <w:rPr>
+          <w:rFonts w:ascii="Arial" w:hAnsi="Arial" w:cs="Arial"/>
+          <w:sz w:val="21"/>
+          <w:szCs w:val="24"/>
+        </w:rPr>
+      </w:r>
+      <w:r>
+        <w:rPr>
+          <w:rFonts w:ascii="Arial" w:hAnsi="Arial" w:cs="Arial"/>
+          <w:sz w:val="21"/>
           <w:szCs w:val="24"/>
         </w:rPr>
       </w:r>
@@ -1189,7 +1200,7 @@
       <w:r>
         <w:rPr>
           <w:rFonts w:ascii="Arial" w:hAnsi="Arial" w:cs="Arial"/>
-          <w:sz w:val="24"/>
+          <w:sz w:val="21"/>
           <w:szCs w:val="24"/>
         </w:rPr>
         <w:t>Data de Nascimento: {{data_nascimento}}</w:t>
@@ -1197,7 +1208,7 @@
       <w:r>
         <w:rPr>
           <w:rFonts w:ascii="Arial" w:hAnsi="Arial" w:cs="Arial"/>
-          <w:sz w:val="24"/>
+          <w:sz w:val="21"/>
           <w:szCs w:val="24"/>
         </w:rPr>
         <w:t xml:space="preserve"/>
@@ -1205,7 +1216,7 @@
       <w:r>
         <w:rPr>
           <w:rFonts w:ascii="Arial" w:hAnsi="Arial" w:cs="Arial"/>
-          <w:sz w:val="24"/>
+          <w:sz w:val="21"/>
           <w:szCs w:val="24"/>
         </w:rPr>
         <w:t/>
@@ -1213,7 +1224,7 @@
       <w:r>
         <w:rPr>
           <w:rFonts w:ascii="Arial" w:hAnsi="Arial" w:cs="Arial"/>
-          <w:sz w:val="24"/>
+          <w:sz w:val="21"/>
           <w:szCs w:val="24"/>
         </w:rPr>
         <w:t xml:space="preserve"/>
@@ -1223,7 +1234,7 @@
           <w:rFonts w:ascii="Arial" w:hAnsi="Arial" w:cs="Arial"/>
           <w:b/>
           <w:bCs/>
-          <w:sz w:val="24"/>
+          <w:sz w:val="21"/>
           <w:szCs w:val="24"/>
         </w:rPr>
         <w:t/>
@@ -1231,7 +1242,7 @@
       <w:r>
         <w:rPr>
           <w:rFonts w:ascii="Arial" w:hAnsi="Arial" w:cs="Arial"/>
-          <w:sz w:val="24"/>
+          <w:sz w:val="21"/>
           <w:szCs w:val="24"/>
         </w:rPr>
         <w:t xml:space="preserve"/>
@@ -1253,7 +1264,7 @@
       <w:r>
         <w:rPr>
           <w:rFonts w:ascii="Arial" w:hAnsi="Arial" w:cs="Arial"/>
-          <w:sz w:val="24"/>
+          <w:sz w:val="21"/>
           <w:szCs w:val="24"/>
         </w:rPr>
         <w:t>Curso: {{curso}}</w:t>
@@ -1261,14 +1272,14 @@
       <w:r>
         <w:rPr>
           <w:rFonts w:ascii="Arial" w:hAnsi="Arial" w:cs="Arial"/>
-          <w:sz w:val="24"/>
-          <w:szCs w:val="24"/>
-        </w:rPr>
-      </w:r>
-      <w:r>
-        <w:rPr>
-          <w:rFonts w:ascii="Arial" w:hAnsi="Arial" w:cs="Arial"/>
-          <w:sz w:val="24"/>
+          <w:sz w:val="21"/>
+          <w:szCs w:val="24"/>
+        </w:rPr>
+      </w:r>
+      <w:r>
+        <w:rPr>
+          <w:rFonts w:ascii="Arial" w:hAnsi="Arial" w:cs="Arial"/>
+          <w:sz w:val="21"/>
           <w:szCs w:val="24"/>
         </w:rPr>
         <w:t xml:space="preserve"/>
@@ -1278,7 +1289,7 @@
           <w:rFonts w:ascii="Arial" w:hAnsi="Arial" w:cs="Arial"/>
           <w:b/>
           <w:bCs/>
-          <w:sz w:val="24"/>
+          <w:sz w:val="21"/>
           <w:szCs w:val="24"/>
         </w:rPr>
         <w:t/>
@@ -1286,14 +1297,14 @@
       <w:r>
         <w:rPr>
           <w:rFonts w:ascii="Arial" w:hAnsi="Arial" w:cs="Arial"/>
-          <w:sz w:val="24"/>
-          <w:szCs w:val="24"/>
-        </w:rPr>
-      </w:r>
-      <w:r>
-        <w:rPr>
-          <w:rFonts w:ascii="Arial" w:hAnsi="Arial" w:cs="Arial"/>
-          <w:sz w:val="24"/>
+          <w:sz w:val="21"/>
+          <w:szCs w:val="24"/>
+        </w:rPr>
+      </w:r>
+      <w:r>
+        <w:rPr>
+          <w:rFonts w:ascii="Arial" w:hAnsi="Arial" w:cs="Arial"/>
+          <w:sz w:val="21"/>
           <w:szCs w:val="24"/>
         </w:rPr>
       </w:r>
@@ -1314,7 +1325,7 @@
       <w:r>
         <w:rPr>
           <w:rFonts w:ascii="Arial" w:hAnsi="Arial" w:cs="Arial"/>
-          <w:sz w:val="24"/>
+          <w:sz w:val="21"/>
           <w:szCs w:val="24"/>
         </w:rPr>
         <w:t>Série: {{periodo}}</w:t>
@@ -1322,7 +1333,7 @@
       <w:r>
         <w:rPr>
           <w:rFonts w:ascii="Arial" w:hAnsi="Arial" w:cs="Arial"/>
-          <w:sz w:val="24"/>
+          <w:sz w:val="21"/>
           <w:szCs w:val="24"/>
         </w:rPr>
         <w:t xml:space="preserve"/>
@@ -1332,7 +1343,7 @@
           <w:rFonts w:ascii="Arial" w:hAnsi="Arial" w:cs="Arial"/>
           <w:b/>
           <w:bCs/>
-          <w:sz w:val="24"/>
+          <w:sz w:val="21"/>
           <w:szCs w:val="24"/>
         </w:rPr>
         <w:t/>
@@ -1340,7 +1351,7 @@
       <w:r>
         <w:rPr>
           <w:rFonts w:ascii="Arial" w:hAnsi="Arial" w:cs="Arial"/>
-          <w:sz w:val="24"/>
+          <w:sz w:val="21"/>
           <w:szCs w:val="24"/>
         </w:rPr>
         <w:t xml:space="preserve"/>
@@ -1362,7 +1373,7 @@
       <w:r>
         <w:rPr>
           <w:rFonts w:ascii="Arial" w:hAnsi="Arial" w:cs="Arial"/>
-          <w:sz w:val="24"/>
+          <w:sz w:val="21"/>
           <w:szCs w:val="24"/>
         </w:rPr>
         <w:t>Matrícula: {{matricula}}</w:t>
@@ -1370,7 +1381,7 @@
       <w:r>
         <w:rPr>
           <w:rFonts w:ascii="Arial" w:hAnsi="Arial" w:cs="Arial"/>
-          <w:sz w:val="24"/>
+          <w:sz w:val="21"/>
           <w:szCs w:val="24"/>
         </w:rPr>
         <w:t xml:space="preserve"/>
@@ -1380,7 +1391,7 @@
           <w:rFonts w:ascii="Arial" w:hAnsi="Arial" w:cs="Arial"/>
           <w:b/>
           <w:bCs/>
-          <w:sz w:val="24"/>
+          <w:sz w:val="21"/>
           <w:szCs w:val="24"/>
         </w:rPr>
         <w:t/>
@@ -1388,7 +1399,7 @@
       <w:r>
         <w:rPr>
           <w:rFonts w:ascii="Arial" w:hAnsi="Arial" w:cs="Arial"/>
-          <w:sz w:val="24"/>
+          <w:sz w:val="21"/>
           <w:szCs w:val="24"/>
         </w:rPr>
         <w:t xml:space="preserve"/>
@@ -1410,7 +1421,7 @@
       <w:r>
         <w:rPr>
           <w:rFonts w:ascii="Arial" w:hAnsi="Arial" w:cs="Arial"/>
-          <w:sz w:val="24"/>
+          <w:sz w:val="21"/>
           <w:szCs w:val="24"/>
         </w:rPr>
         <w:t>Turno: {{turno}}</w:t>
@@ -1418,7 +1429,7 @@
       <w:r>
         <w:rPr>
           <w:rFonts w:ascii="Arial" w:hAnsi="Arial" w:cs="Arial"/>
-          <w:sz w:val="24"/>
+          <w:sz w:val="21"/>
           <w:szCs w:val="24"/>
         </w:rPr>
         <w:t xml:space="preserve"/>
@@ -1428,7 +1439,7 @@
           <w:rFonts w:ascii="Arial" w:hAnsi="Arial" w:cs="Arial"/>
           <w:b/>
           <w:bCs/>
-          <w:sz w:val="24"/>
+          <w:sz w:val="21"/>
           <w:szCs w:val="24"/>
         </w:rPr>
         <w:t/>
@@ -1450,7 +1461,7 @@
       <w:r>
         <w:rPr>
           <w:rFonts w:ascii="Arial" w:hAnsi="Arial" w:cs="Arial"/>
-          <w:sz w:val="24"/>
+          <w:sz w:val="21"/>
           <w:szCs w:val="24"/>
         </w:rPr>
         <w:t>Endereço: {{endereco_estudante}}</w:t>
@@ -1458,7 +1469,7 @@
       <w:r>
         <w:rPr>
           <w:rFonts w:ascii="Arial" w:hAnsi="Arial" w:cs="Arial"/>
-          <w:sz w:val="24"/>
+          <w:sz w:val="21"/>
           <w:szCs w:val="24"/>
         </w:rPr>
         <w:t xml:space="preserve"/>
@@ -1468,7 +1479,7 @@
           <w:rFonts w:ascii="Arial" w:hAnsi="Arial" w:cs="Arial"/>
           <w:b/>
           <w:bCs/>
-          <w:sz w:val="24"/>
+          <w:sz w:val="21"/>
           <w:szCs w:val="24"/>
         </w:rPr>
         <w:t/>
@@ -1476,7 +1487,7 @@
       <w:r>
         <w:rPr>
           <w:rFonts w:ascii="Arial" w:hAnsi="Arial" w:cs="Arial"/>
-          <w:sz w:val="24"/>
+          <w:sz w:val="21"/>
           <w:szCs w:val="24"/>
         </w:rPr>
       </w:r>
@@ -1497,7 +1508,7 @@
       <w:r>
         <w:rPr>
           <w:rFonts w:ascii="Arial" w:hAnsi="Arial" w:cs="Arial"/>
-          <w:sz w:val="24"/>
+          <w:sz w:val="21"/>
           <w:szCs w:val="24"/>
         </w:rPr>
         <w:t>E-mail: {{email_estudante}}</w:t>
@@ -1505,7 +1516,7 @@
       <w:r>
         <w:rPr>
           <w:rFonts w:ascii="Arial" w:hAnsi="Arial" w:cs="Arial"/>
-          <w:sz w:val="24"/>
+          <w:sz w:val="21"/>
           <w:szCs w:val="24"/>
         </w:rPr>
         <w:t xml:space="preserve"/>
@@ -1515,7 +1526,7 @@
           <w:rFonts w:ascii="Arial" w:hAnsi="Arial" w:cs="Arial"/>
           <w:b/>
           <w:bCs/>
-          <w:sz w:val="24"/>
+          <w:sz w:val="21"/>
           <w:szCs w:val="24"/>
         </w:rPr>
         <w:t/>
@@ -1523,21 +1534,21 @@
       <w:r>
         <w:rPr>
           <w:rFonts w:ascii="Arial" w:hAnsi="Arial" w:cs="Arial"/>
-          <w:sz w:val="24"/>
-          <w:szCs w:val="24"/>
-        </w:rPr>
-      </w:r>
-      <w:r>
-        <w:rPr>
-          <w:rFonts w:ascii="Arial" w:hAnsi="Arial" w:cs="Arial"/>
-          <w:sz w:val="24"/>
-          <w:szCs w:val="24"/>
-        </w:rPr>
-      </w:r>
-      <w:r>
-        <w:rPr>
-          <w:rFonts w:ascii="Arial" w:hAnsi="Arial" w:cs="Arial"/>
-          <w:sz w:val="24"/>
+          <w:sz w:val="21"/>
+          <w:szCs w:val="24"/>
+        </w:rPr>
+      </w:r>
+      <w:r>
+        <w:rPr>
+          <w:rFonts w:ascii="Arial" w:hAnsi="Arial" w:cs="Arial"/>
+          <w:sz w:val="21"/>
+          <w:szCs w:val="24"/>
+        </w:rPr>
+      </w:r>
+      <w:r>
+        <w:rPr>
+          <w:rFonts w:ascii="Arial" w:hAnsi="Arial" w:cs="Arial"/>
+          <w:sz w:val="21"/>
           <w:szCs w:val="24"/>
         </w:rPr>
       </w:r>
@@ -1558,7 +1569,7 @@
       <w:r>
         <w:rPr>
           <w:rFonts w:ascii="Arial" w:hAnsi="Arial" w:cs="Arial"/>
-          <w:sz w:val="24"/>
+          <w:sz w:val="21"/>
           <w:szCs w:val="24"/>
         </w:rPr>
         <w:t>Bairro: {{bairro_estudante}}</w:t>
@@ -1568,7 +1579,7 @@
           <w:rFonts w:ascii="Arial" w:hAnsi="Arial" w:cs="Arial"/>
           <w:b/>
           <w:bCs/>
-          <w:sz w:val="24"/>
+          <w:sz w:val="21"/>
           <w:szCs w:val="24"/>
         </w:rPr>
         <w:t/>
@@ -1579,14 +1590,14 @@
           <w:b/>
           <w:bCs/>
           <w:color w:val="000000"/>
-          <w:sz w:val="24"/>
-          <w:szCs w:val="24"/>
-        </w:rPr>
-      </w:r>
-      <w:r>
-        <w:rPr>
-          <w:rFonts w:ascii="Arial" w:hAnsi="Arial" w:cs="Arial"/>
-          <w:sz w:val="24"/>
+          <w:sz w:val="21"/>
+          <w:szCs w:val="24"/>
+        </w:rPr>
+      </w:r>
+      <w:r>
+        <w:rPr>
+          <w:rFonts w:ascii="Arial" w:hAnsi="Arial" w:cs="Arial"/>
+          <w:sz w:val="21"/>
           <w:szCs w:val="24"/>
         </w:rPr>
         <w:t xml:space="preserve"/>
@@ -1609,7 +1620,7 @@
       <w:r>
         <w:rPr>
           <w:rFonts w:ascii="Arial" w:hAnsi="Arial" w:cs="Arial"/>
-          <w:sz w:val="24"/>
+          <w:sz w:val="21"/>
           <w:szCs w:val="24"/>
         </w:rPr>
         <w:t>Município: {{municipio_estudante}}</w:t>
@@ -1619,7 +1630,7 @@
           <w:rFonts w:ascii="Arial" w:hAnsi="Arial" w:cs="Arial"/>
           <w:b/>
           <w:bCs/>
-          <w:sz w:val="24"/>
+          <w:sz w:val="21"/>
           <w:szCs w:val="24"/>
         </w:rPr>
         <w:t/>
@@ -1628,7 +1639,7 @@
       <w:r>
         <w:rPr>
           <w:rFonts w:ascii="Arial" w:hAnsi="Arial" w:cs="Arial"/>
-          <w:sz w:val="24"/>
+          <w:sz w:val="21"/>
           <w:szCs w:val="24"/>
         </w:rPr>
         <w:t xml:space="preserve"/>
@@ -1652,7 +1663,7 @@
       <w:r>
         <w:rPr>
           <w:rFonts w:ascii="Arial" w:hAnsi="Arial" w:cs="Arial"/>
-          <w:sz w:val="24"/>
+          <w:sz w:val="21"/>
           <w:szCs w:val="24"/>
         </w:rPr>
         <w:t>UF: {{uf_estudante}}</w:t>
@@ -1662,7 +1673,7 @@
           <w:rFonts w:ascii="Arial" w:hAnsi="Arial" w:cs="Arial"/>
           <w:b/>
           <w:bCs/>
-          <w:sz w:val="24"/>
+          <w:sz w:val="21"/>
           <w:szCs w:val="24"/>
         </w:rPr>
         <w:t xml:space="preserve"/>
@@ -1672,7 +1683,7 @@
           <w:rFonts w:ascii="Arial" w:hAnsi="Arial" w:cs="Arial"/>
           <w:b/>
           <w:bCs/>
-          <w:sz w:val="24"/>
+          <w:sz w:val="21"/>
           <w:szCs w:val="24"/>
         </w:rPr>
         <w:t/>
@@ -1682,7 +1693,7 @@
           <w:rFonts w:ascii="Arial" w:hAnsi="Arial" w:cs="Arial"/>
           <w:b/>
           <w:bCs/>
-          <w:sz w:val="24"/>
+          <w:sz w:val="21"/>
           <w:szCs w:val="24"/>
         </w:rPr>
         <w:t xml:space="preserve"/>
@@ -1704,7 +1715,7 @@
       <w:r>
         <w:rPr>
           <w:rFonts w:ascii="Arial" w:hAnsi="Arial" w:cs="Arial"/>
-          <w:sz w:val="24"/>
+          <w:sz w:val="21"/>
           <w:szCs w:val="24"/>
         </w:rPr>
         <w:t>CEP: {{cep_estudante}}</w:t>
@@ -1714,7 +1725,7 @@
           <w:rFonts w:ascii="Arial" w:hAnsi="Arial" w:cs="Arial"/>
           <w:b/>
           <w:bCs/>
-          <w:sz w:val="24"/>
+          <w:sz w:val="21"/>
           <w:szCs w:val="24"/>
         </w:rPr>
         <w:t/>
@@ -1725,7 +1736,7 @@
           <w:b/>
           <w:bCs/>
           <w:color w:val="000000"/>
-          <w:sz w:val="24"/>
+          <w:sz w:val="21"/>
           <w:szCs w:val="24"/>
         </w:rPr>
       </w:r>
@@ -1735,6 +1746,7 @@
         <w:tabs>
           <w:tab w:val="left" w:pos="0"/>
         </w:tabs>
+        <w:spacing w:before="0" w:after="0" w:line="20" w:lineRule="exact"/>
         <w:jc w:val="both"/>
         <w:rPr>
           <w:rFonts w:ascii="Arial" w:hAnsi="Arial" w:cs="Arial"/>
@@ -1782,7 +1794,7 @@
                 <w:tab w:val="left" w:pos="0"/>
               </w:tabs>
               <w:snapToGrid w:val="0"/>
-              <w:spacing w:before="0" w:after="0"/>
+              <w:spacing w:before="0" w:after="0" w:line="240" w:lineRule="auto"/>
               <w:rPr>
                 <w:rFonts w:ascii="Arial" w:hAnsi="Arial" w:cs="Arial"/>
                 <w:sz w:val="24"/>
@@ -1792,7 +1804,8 @@
             <w:r>
               <w:rPr>
                 <w:rFonts w:ascii="Arial" w:hAnsi="Arial" w:cs="Arial"/>
-                <w:sz w:val="24"/>
+                <w:b/>
+                <w:sz w:val="20"/>
                 <w:szCs w:val="24"/>
               </w:rPr>
               <w:t>C - INSTITUIÇÃO DE ENSINO</w:t>
@@ -1806,6 +1819,7 @@
         <w:tabs>
           <w:tab w:val="left" w:pos="0"/>
         </w:tabs>
+        <w:spacing w:before="0" w:after="0" w:line="240" w:lineRule="auto"/>
         <w:jc w:val="both"/>
         <w:rPr>
           <w:rFonts w:ascii="Arial" w:hAnsi="Arial" w:cs="Arial"/>
@@ -1818,7 +1832,7 @@
         <w:rPr>
           <w:rFonts w:ascii="Arial" w:hAnsi="Arial" w:cs="Arial"/>
           <w:color w:val="000000"/>
-          <w:sz w:val="24"/>
+          <w:sz w:val="21"/>
           <w:szCs w:val="24"/>
         </w:rPr>
         <w:t>Nome:</w:t>
@@ -1828,7 +1842,7 @@
           <w:rFonts w:ascii="Arial" w:hAnsi="Arial" w:cs="Arial"/>
           <w:b/>
           <w:color w:val="000000"/>
-          <w:sz w:val="24"/>
+          <w:sz w:val="21"/>
           <w:szCs w:val="24"/>
         </w:rPr>
         <w:t>ASSOCIAÇÃO DE ENSINO E CULTURA DE MATO GROSSO DO SUL</w:t>
@@ -1839,6 +1853,7 @@
         <w:tabs>
           <w:tab w:val="left" w:pos="0"/>
         </w:tabs>
+        <w:spacing w:before="0" w:after="0" w:line="240" w:lineRule="auto"/>
         <w:jc w:val="both"/>
         <w:rPr>
           <w:rFonts w:ascii="Arial" w:hAnsi="Arial" w:cs="Arial"/>
@@ -1852,7 +1867,7 @@
         <w:rPr>
           <w:rFonts w:ascii="Arial" w:hAnsi="Arial" w:cs="Arial"/>
           <w:color w:val="000000"/>
-          <w:sz w:val="24"/>
+          <w:sz w:val="21"/>
           <w:szCs w:val="24"/>
         </w:rPr>
         <w:t>CNPJ/MF n.º</w:t>
@@ -1860,7 +1875,7 @@
       <w:r>
         <w:rPr>
           <w:rFonts w:ascii="Arial" w:hAnsi="Arial" w:cs="Arial"/>
-          <w:sz w:val="24"/>
+          <w:sz w:val="21"/>
           <w:szCs w:val="24"/>
         </w:rPr>
         <w:t>01.923.317/0001-62</w:t>
@@ -1868,7 +1883,7 @@
       <w:r>
         <w:rPr>
           <w:rFonts w:ascii="Arial" w:hAnsi="Arial" w:cs="Arial"/>
-          <w:sz w:val="24"/>
+          <w:sz w:val="21"/>
           <w:szCs w:val="24"/>
         </w:rPr>
         <w:t xml:space="preserve"> -</w:t>
@@ -1878,7 +1893,7 @@
           <w:rFonts w:ascii="Arial" w:hAnsi="Arial" w:cs="Arial"/>
           <w:bCs/>
           <w:color w:val="000000"/>
-          <w:sz w:val="24"/>
+          <w:sz w:val="21"/>
           <w:szCs w:val="24"/>
         </w:rPr>
         <w:t>Telefone (67) 2105</w:t>
@@ -1888,7 +1903,7 @@
           <w:rFonts w:ascii="Arial" w:hAnsi="Arial" w:cs="Arial"/>
           <w:bCs/>
           <w:color w:val="000000"/>
-          <w:sz w:val="24"/>
+          <w:sz w:val="21"/>
           <w:szCs w:val="24"/>
         </w:rPr>
         <w:t>-</w:t>
@@ -1898,7 +1913,7 @@
           <w:rFonts w:ascii="Arial" w:hAnsi="Arial" w:cs="Arial"/>
           <w:bCs/>
           <w:color w:val="000000"/>
-          <w:sz w:val="24"/>
+          <w:sz w:val="21"/>
           <w:szCs w:val="24"/>
         </w:rPr>
         <w:t>6060</w:t>
@@ -1910,7 +1925,7 @@
         <w:tabs>
           <w:tab w:val="left" w:pos="0"/>
         </w:tabs>
-        <w:spacing w:before="0" w:after="120" w:line="276" w:lineRule="auto"/>
+        <w:spacing w:before="0" w:after="0" w:line="240" w:lineRule="auto"/>
         <w:rPr>
           <w:b w:val="0"/>
           <w:color w:val="000000"/>
@@ -1922,7 +1937,7 @@
         <w:rPr>
           <w:b w:val="0"/>
           <w:color w:val="000000"/>
-          <w:sz w:val="24"/>
+          <w:sz w:val="21"/>
           <w:szCs w:val="24"/>
           <w:rFonts w:ascii="Arial" w:hAnsi="Arial" w:cs="Arial"/>
         </w:rPr>
@@ -1931,7 +1946,7 @@
       <w:r>
         <w:rPr>
           <w:b w:val="0"/>
-          <w:sz w:val="24"/>
+          <w:sz w:val="21"/>
           <w:szCs w:val="24"/>
           <w:rFonts w:ascii="Arial" w:hAnsi="Arial" w:cs="Arial"/>
         </w:rPr>
@@ -1950,13 +1965,13 @@
           <w:sz w:val="24"/>
           <w:szCs w:val="24"/>
         </w:rPr>
-        <w:spacing w:after="120" w:line="276" w:lineRule="auto"/>
+        <w:spacing w:after="0" w:line="240" w:lineRule="auto" w:before="0"/>
       </w:pPr>
       <w:r>
         <w:rPr>
           <w:rFonts w:ascii="Arial" w:hAnsi="Arial" w:cs="Arial"/>
           <w:color w:val="000000"/>
-          <w:sz w:val="24"/>
+          <w:sz w:val="21"/>
           <w:szCs w:val="24"/>
         </w:rPr>
         <w:t>Responsável pela Assinatura deste TCECO</w:t>
@@ -1965,7 +1980,7 @@
         <w:rPr>
           <w:rFonts w:ascii="Arial" w:hAnsi="Arial" w:cs="Arial"/>
           <w:color w:val="000000"/>
-          <w:sz w:val="24"/>
+          <w:sz w:val="21"/>
           <w:szCs w:val="24"/>
         </w:rPr>
         <w:t xml:space="preserve"> e</w:t>
@@ -1973,7 +1988,7 @@
       <w:r>
         <w:rPr>
           <w:rFonts w:ascii="Arial" w:hAnsi="Arial" w:cs="Arial"/>
-          <w:sz w:val="24"/>
+          <w:sz w:val="21"/>
           <w:szCs w:val="24"/>
         </w:rPr>
         <w:t>Supervisor de estágio da Instituição de Ensino</w:t>
@@ -1982,7 +1997,7 @@
         <w:rPr>
           <w:rFonts w:ascii="Arial" w:hAnsi="Arial" w:cs="Arial"/>
           <w:color w:val="000000"/>
-          <w:sz w:val="24"/>
+          <w:sz w:val="21"/>
           <w:szCs w:val="24"/>
         </w:rPr>
         <w:t>:</w:t>
@@ -1991,7 +2006,7 @@
         <w:rPr>
           <w:rFonts w:ascii="Arial" w:hAnsi="Arial" w:cs="Arial"/>
           <w:color w:val="000000"/>
-          <w:sz w:val="24"/>
+          <w:sz w:val="21"/>
           <w:szCs w:val="24"/>
         </w:rPr>
         <w:t xml:space="preserve"> Coordenador do Curso</w:t>
@@ -2000,7 +2015,7 @@
         <w:rPr>
           <w:rFonts w:ascii="Arial" w:hAnsi="Arial" w:cs="Arial"/>
           <w:color w:val="000000"/>
-          <w:sz w:val="24"/>
+          <w:sz w:val="21"/>
           <w:szCs w:val="24"/>
         </w:rPr>
         <w:t xml:space="preserve"> -</w:t>
@@ -2008,7 +2023,7 @@
       <w:r>
         <w:rPr>
           <w:rFonts w:ascii="Arial" w:hAnsi="Arial" w:cs="Arial"/>
-          <w:sz w:val="24"/>
+          <w:sz w:val="21"/>
           <w:szCs w:val="24"/>
         </w:rPr>
         <w:t>Prof. Muriel Vieira Teixeira</w:t>
@@ -2017,7 +2032,7 @@
         <w:rPr>
           <w:rFonts w:ascii="Arial" w:hAnsi="Arial" w:cs="Arial"/>
           <w:color w:val="000000"/>
-          <w:sz w:val="24"/>
+          <w:sz w:val="21"/>
           <w:szCs w:val="24"/>
         </w:rPr>
       </w:r>
@@ -2027,6 +2042,7 @@
         <w:tabs>
           <w:tab w:val="left" w:pos="0"/>
         </w:tabs>
+        <w:spacing w:before="0" w:after="0" w:line="20" w:lineRule="exact"/>
         <w:jc w:val="both"/>
         <w:rPr>
           <w:rFonts w:ascii="Arial" w:hAnsi="Arial" w:cs="Arial"/>
@@ -2075,7 +2091,7 @@
                 <w:tab w:val="left" w:pos="0"/>
               </w:tabs>
               <w:snapToGrid w:val="0"/>
-              <w:spacing w:before="0" w:after="0"/>
+              <w:spacing w:before="0" w:after="0" w:line="240" w:lineRule="auto"/>
               <w:rPr>
                 <w:rFonts w:ascii="Arial" w:hAnsi="Arial" w:cs="Arial"/>
                 <w:sz w:val="24"/>
@@ -2085,7 +2101,8 @@
             <w:r>
               <w:rPr>
                 <w:rFonts w:ascii="Arial" w:hAnsi="Arial" w:cs="Arial"/>
-                <w:sz w:val="24"/>
+                <w:b/>
+                <w:sz w:val="20"/>
                 <w:szCs w:val="24"/>
               </w:rPr>
               <w:t>D - DADOS SOBRE O ESTÁGIO</w:t>
@@ -2096,6 +2113,7 @@
     </w:tbl>
     <w:p ns2:paraId="0FB99F1D" ns2:textId="39726DE2">
       <w:pPr>
+        <w:spacing w:before="0" w:after="0" w:line="240" w:lineRule="auto"/>
         <w:ind w:left="15" w:right="0"/>
         <w:jc w:val="both"/>
         <w:rPr>
@@ -2107,7 +2125,7 @@
       <w:r>
         <w:rPr>
           <w:rFonts w:ascii="Arial" w:hAnsi="Arial" w:cs="Arial"/>
-          <w:sz w:val="24"/>
+          <w:sz w:val="21"/>
           <w:szCs w:val="24"/>
         </w:rPr>
         <w:t>Vigência do plano de atividade de estágio: {{data_inicio}} a {{data_fim}}</w:t>
@@ -2115,7 +2133,7 @@
       <w:r>
         <w:rPr>
           <w:rFonts w:ascii="Arial" w:hAnsi="Arial" w:cs="Arial"/>
-          <w:sz w:val="24"/>
+          <w:sz w:val="21"/>
           <w:szCs w:val="24"/>
         </w:rPr>
         <w:t/>
@@ -2123,7 +2141,7 @@
       <w:r>
         <w:rPr>
           <w:rFonts w:ascii="Arial" w:hAnsi="Arial" w:cs="Arial"/>
-          <w:sz w:val="24"/>
+          <w:sz w:val="21"/>
           <w:szCs w:val="24"/>
         </w:rPr>
         <w:t xml:space="preserve"/>
@@ -2131,7 +2149,7 @@
       <w:r>
         <w:rPr>
           <w:rFonts w:ascii="Arial" w:hAnsi="Arial" w:cs="Arial"/>
-          <w:sz w:val="24"/>
+          <w:sz w:val="21"/>
           <w:szCs w:val="24"/>
         </w:rPr>
         <w:t/>
@@ -2139,6 +2157,7 @@
     </w:p>
     <w:p ns2:paraId="662C265F" ns2:textId="1CB600E6">
       <w:pPr>
+        <w:spacing w:before="0" w:after="0" w:line="240" w:lineRule="auto"/>
         <w:ind w:left="15" w:right="0"/>
         <w:jc w:val="both"/>
         <w:rPr>
@@ -2150,7 +2169,7 @@
       <w:r>
         <w:rPr>
           <w:rFonts w:ascii="Arial" w:hAnsi="Arial" w:cs="Arial"/>
-          <w:sz w:val="24"/>
+          <w:sz w:val="21"/>
           <w:szCs w:val="24"/>
         </w:rPr>
         <w:t>Horário do estágio (Ex: 8h às 12h - Máx 6h/dia): {{horario}}</w:t>
@@ -2158,7 +2177,7 @@
       <w:r>
         <w:rPr>
           <w:rFonts w:ascii="Arial" w:hAnsi="Arial" w:cs="Arial"/>
-          <w:sz w:val="24"/>
+          <w:sz w:val="21"/>
           <w:szCs w:val="24"/>
         </w:rPr>
         <w:t xml:space="preserve"/>
@@ -2167,7 +2186,7 @@
       <w:r>
         <w:rPr>
           <w:rFonts w:ascii="Arial" w:hAnsi="Arial" w:cs="Arial"/>
-          <w:sz w:val="24"/>
+          <w:sz w:val="21"/>
           <w:szCs w:val="24"/>
         </w:rPr>
         <w:t/>
@@ -2176,7 +2195,7 @@
       <w:r>
         <w:rPr>
           <w:rFonts w:ascii="Arial" w:hAnsi="Arial" w:cs="Arial"/>
-          <w:sz w:val="24"/>
+          <w:sz w:val="21"/>
           <w:szCs w:val="24"/>
         </w:rPr>
         <w:t xml:space="preserve"/>
@@ -2185,7 +2204,7 @@
       <w:r>
         <w:rPr>
           <w:rFonts w:ascii="Arial" w:hAnsi="Arial" w:cs="Arial"/>
-          <w:sz w:val="24"/>
+          <w:sz w:val="21"/>
           <w:szCs w:val="24"/>
         </w:rPr>
         <w:t/>
@@ -2194,7 +2213,7 @@
       <w:r>
         <w:rPr>
           <w:rFonts w:ascii="Arial" w:hAnsi="Arial" w:cs="Arial"/>
-          <w:sz w:val="24"/>
+          <w:sz w:val="21"/>
           <w:szCs w:val="24"/>
         </w:rPr>
         <w:t xml:space="preserve"/>
@@ -2202,7 +2221,7 @@
       <w:r>
         <w:rPr>
           <w:rFonts w:ascii="Arial" w:hAnsi="Arial" w:cs="Arial"/>
-          <w:sz w:val="24"/>
+          <w:sz w:val="21"/>
           <w:szCs w:val="24"/>
         </w:rPr>
         <w:t xml:space="preserve"/>
@@ -2210,7 +2229,7 @@
       <w:r>
         <w:rPr>
           <w:rFonts w:ascii="Arial" w:hAnsi="Arial" w:cs="Arial"/>
-          <w:sz w:val="24"/>
+          <w:sz w:val="21"/>
           <w:szCs w:val="24"/>
         </w:rPr>
         <w:t/>
@@ -2219,14 +2238,14 @@
         <w:rPr>
           <w:rFonts w:ascii="Arial" w:hAnsi="Arial" w:cs="Arial"/>
           <w:color w:val="000000"/>
-          <w:sz w:val="24"/>
-          <w:szCs w:val="24"/>
-        </w:rPr>
-      </w:r>
-      <w:r>
-        <w:rPr>
-          <w:rFonts w:ascii="Arial" w:hAnsi="Arial" w:cs="Arial"/>
-          <w:sz w:val="24"/>
+          <w:sz w:val="21"/>
+          <w:szCs w:val="24"/>
+        </w:rPr>
+      </w:r>
+      <w:r>
+        <w:rPr>
+          <w:rFonts w:ascii="Arial" w:hAnsi="Arial" w:cs="Arial"/>
+          <w:sz w:val="21"/>
           <w:szCs w:val="24"/>
         </w:rPr>
         <w:t xml:space="preserve"/>
@@ -2234,7 +2253,7 @@
       <w:r>
         <w:rPr>
           <w:rFonts w:ascii="Arial" w:hAnsi="Arial" w:cs="Arial"/>
-          <w:sz w:val="24"/>
+          <w:sz w:val="21"/>
           <w:szCs w:val="24"/>
         </w:rPr>
         <w:t xml:space="preserve"/>
@@ -2242,6 +2261,7 @@
     </w:p>
     <w:p ns2:paraId="02E83BF9" ns2:textId="2911506B">
       <w:pPr>
+        <w:spacing w:before="0" w:after="0" w:line="240" w:lineRule="auto"/>
         <w:ind w:left="15" w:right="0"/>
         <w:jc w:val="both"/>
         <w:rPr>
@@ -2253,7 +2273,7 @@
       <w:r>
         <w:rPr>
           <w:rFonts w:ascii="Arial" w:hAnsi="Arial" w:cs="Arial"/>
-          <w:sz w:val="24"/>
+          <w:sz w:val="21"/>
           <w:szCs w:val="24"/>
         </w:rPr>
         <w:t>Carga Horária Semanal (Máx 30h/semana): {{carga_horaria}}</w:t>
@@ -2261,7 +2281,7 @@
       <w:r>
         <w:rPr>
           <w:rFonts w:ascii="Arial" w:hAnsi="Arial" w:cs="Arial"/>
-          <w:sz w:val="24"/>
+          <w:sz w:val="21"/>
           <w:szCs w:val="24"/>
         </w:rPr>
         <w:t xml:space="preserve"/>
@@ -2270,7 +2290,7 @@
       <w:r>
         <w:rPr>
           <w:rFonts w:ascii="Arial" w:hAnsi="Arial" w:cs="Arial"/>
-          <w:sz w:val="24"/>
+          <w:sz w:val="21"/>
           <w:szCs w:val="24"/>
         </w:rPr>
         <w:t/>
@@ -2279,7 +2299,7 @@
       <w:r>
         <w:rPr>
           <w:rFonts w:ascii="Arial" w:hAnsi="Arial" w:cs="Arial"/>
-          <w:sz w:val="24"/>
+          <w:sz w:val="21"/>
           <w:szCs w:val="24"/>
         </w:rPr>
         <w:t xml:space="preserve"/>
@@ -2287,7 +2307,7 @@
       <w:r>
         <w:rPr>
           <w:rFonts w:ascii="Arial" w:hAnsi="Arial" w:cs="Arial"/>
-          <w:sz w:val="24"/>
+          <w:sz w:val="21"/>
           <w:szCs w:val="24"/>
         </w:rPr>
         <w:t/>
@@ -2295,7 +2315,7 @@
       <w:r>
         <w:rPr>
           <w:rFonts w:ascii="Arial" w:hAnsi="Arial" w:cs="Arial"/>
-          <w:sz w:val="24"/>
+          <w:sz w:val="21"/>
           <w:szCs w:val="24"/>
         </w:rPr>
         <w:t xml:space="preserve"/>
@@ -2303,7 +2323,7 @@
       <w:r>
         <w:rPr>
           <w:rFonts w:ascii="Arial" w:hAnsi="Arial" w:cs="Arial"/>
-          <w:sz w:val="24"/>
+          <w:sz w:val="21"/>
           <w:szCs w:val="24"/>
         </w:rPr>
         <w:t xml:space="preserve"/>
@@ -2311,7 +2331,7 @@
       <w:r>
         <w:rPr>
           <w:rFonts w:ascii="Arial" w:hAnsi="Arial" w:cs="Arial"/>
-          <w:sz w:val="24"/>
+          <w:sz w:val="21"/>
           <w:szCs w:val="24"/>
         </w:rPr>
         <w:t xml:space="preserve"/>
@@ -2319,7 +2339,7 @@
       <w:r>
         <w:rPr>
           <w:rFonts w:ascii="Arial" w:hAnsi="Arial" w:cs="Arial"/>
-          <w:sz w:val="24"/>
+          <w:sz w:val="21"/>
           <w:szCs w:val="24"/>
         </w:rPr>
         <w:t xml:space="preserve"/>
@@ -2327,34 +2347,35 @@
       <w:r>
         <w:rPr>
           <w:rFonts w:ascii="Arial" w:hAnsi="Arial" w:cs="Arial"/>
-          <w:sz w:val="24"/>
-          <w:szCs w:val="24"/>
-        </w:rPr>
-      </w:r>
-      <w:r>
-        <w:rPr>
-          <w:rFonts w:ascii="Arial" w:hAnsi="Arial" w:cs="Arial"/>
-          <w:sz w:val="24"/>
-          <w:szCs w:val="24"/>
-        </w:rPr>
-      </w:r>
-      <w:r>
-        <w:rPr>
-          <w:rFonts w:ascii="Arial" w:hAnsi="Arial" w:cs="Arial"/>
-          <w:sz w:val="24"/>
-          <w:szCs w:val="24"/>
-        </w:rPr>
-      </w:r>
-      <w:r>
-        <w:rPr>
-          <w:rFonts w:ascii="Arial" w:hAnsi="Arial" w:cs="Arial"/>
-          <w:sz w:val="24"/>
+          <w:sz w:val="21"/>
+          <w:szCs w:val="24"/>
+        </w:rPr>
+      </w:r>
+      <w:r>
+        <w:rPr>
+          <w:rFonts w:ascii="Arial" w:hAnsi="Arial" w:cs="Arial"/>
+          <w:sz w:val="21"/>
+          <w:szCs w:val="24"/>
+        </w:rPr>
+      </w:r>
+      <w:r>
+        <w:rPr>
+          <w:rFonts w:ascii="Arial" w:hAnsi="Arial" w:cs="Arial"/>
+          <w:sz w:val="21"/>
+          <w:szCs w:val="24"/>
+        </w:rPr>
+      </w:r>
+      <w:r>
+        <w:rPr>
+          <w:rFonts w:ascii="Arial" w:hAnsi="Arial" w:cs="Arial"/>
+          <w:sz w:val="21"/>
           <w:szCs w:val="24"/>
         </w:rPr>
       </w:r>
     </w:p>
     <w:p ns2:paraId="46C8F80F" ns2:textId="71D7A472">
       <w:pPr>
+        <w:spacing w:before="0" w:after="0" w:line="240" w:lineRule="auto"/>
         <w:ind w:left="15" w:right="0"/>
         <w:jc w:val="both"/>
         <w:rPr>
@@ -2366,7 +2387,7 @@
       <w:r>
         <w:rPr>
           <w:rFonts w:ascii="Arial" w:hAnsi="Arial" w:cs="Arial"/>
-          <w:sz w:val="24"/>
+          <w:sz w:val="21"/>
           <w:szCs w:val="24"/>
         </w:rPr>
         <w:t>Setor de Estágio: {{setor_estagio}}</w:t>
@@ -2374,7 +2395,7 @@
       <w:r>
         <w:rPr>
           <w:rFonts w:ascii="Arial" w:hAnsi="Arial" w:cs="Arial"/>
-          <w:sz w:val="24"/>
+          <w:sz w:val="21"/>
           <w:szCs w:val="24"/>
         </w:rPr>
         <w:t xml:space="preserve"/>
@@ -2382,7 +2403,7 @@
       <w:r>
         <w:rPr>
           <w:rFonts w:ascii="Arial" w:hAnsi="Arial" w:cs="Arial"/>
-          <w:sz w:val="24"/>
+          <w:sz w:val="21"/>
           <w:szCs w:val="24"/>
         </w:rPr>
         <w:t/>
@@ -2390,7 +2411,7 @@
       <w:r>
         <w:rPr>
           <w:rFonts w:ascii="Arial" w:hAnsi="Arial" w:cs="Arial"/>
-          <w:sz w:val="24"/>
+          <w:sz w:val="21"/>
           <w:szCs w:val="24"/>
         </w:rPr>
         <w:t xml:space="preserve"/>
@@ -2398,7 +2419,7 @@
       <w:r>
         <w:rPr>
           <w:rFonts w:ascii="Arial" w:hAnsi="Arial" w:cs="Arial"/>
-          <w:sz w:val="24"/>
+          <w:sz w:val="21"/>
           <w:szCs w:val="24"/>
         </w:rPr>
         <w:t xml:space="preserve"/>
@@ -2406,7 +2427,7 @@
       <w:r>
         <w:rPr>
           <w:rFonts w:ascii="Arial" w:hAnsi="Arial" w:cs="Arial"/>
-          <w:sz w:val="24"/>
+          <w:sz w:val="21"/>
           <w:szCs w:val="24"/>
         </w:rPr>
         <w:t xml:space="preserve"/>
@@ -2414,6 +2435,7 @@
     </w:p>
     <w:p ns2:paraId="2A3A266C" ns2:textId="77777777">
       <w:pPr>
+        <w:spacing w:before="0" w:after="0" w:line="240" w:lineRule="auto"/>
         <w:ind w:left="15" w:right="0"/>
         <w:jc w:val="both"/>
         <w:rPr>
@@ -2425,7 +2447,7 @@
       <w:r>
         <w:rPr>
           <w:rFonts w:ascii="Arial" w:hAnsi="Arial" w:cs="Arial"/>
-          <w:sz w:val="24"/>
+          <w:sz w:val="21"/>
           <w:szCs w:val="24"/>
         </w:rPr>
         <w:t>Bolsa-auxílio: {{bolsa_auxilio}}</w:t>
@@ -2433,6 +2455,7 @@
     </w:p>
     <w:p ns2:paraId="31016419" ns2:textId="685C2CB7">
       <w:pPr>
+        <w:spacing w:before="0" w:after="0" w:line="240" w:lineRule="auto"/>
         <w:ind w:left="15" w:right="0"/>
         <w:jc w:val="both"/>
         <w:rPr>
@@ -2444,7 +2467,7 @@
       <w:r>
         <w:rPr>
           <w:rFonts w:ascii="Arial" w:hAnsi="Arial" w:cs="Arial"/>
-          <w:sz w:val="24"/>
+          <w:sz w:val="21"/>
           <w:szCs w:val="24"/>
         </w:rPr>
         <w:t>Auxílio-transporte: {{auxilio_transporte}}</w:t>
@@ -2452,7 +2475,7 @@
       <w:r>
         <w:rPr>
           <w:rFonts w:ascii="Arial" w:hAnsi="Arial" w:cs="Arial"/>
-          <w:sz w:val="24"/>
+          <w:sz w:val="21"/>
           <w:szCs w:val="24"/>
         </w:rPr>
         <w:t/>
@@ -2461,13 +2484,14 @@
         <w:rPr>
           <w:rFonts w:ascii="Arial" w:hAnsi="Arial" w:cs="Arial"/>
           <w:color w:val="000000"/>
-          <w:sz w:val="24"/>
+          <w:sz w:val="21"/>
           <w:szCs w:val="24"/>
         </w:rPr>
       </w:r>
     </w:p>
     <w:p ns2:paraId="057524B5" ns2:textId="3E244A4E">
       <w:pPr>
+        <w:spacing w:before="0" w:after="0" w:line="240" w:lineRule="auto"/>
         <w:ind w:left="15" w:right="0"/>
         <w:jc w:val="both"/>
         <w:rPr>
@@ -2479,7 +2503,7 @@
       <w:r>
         <w:rPr>
           <w:rFonts w:ascii="Arial" w:hAnsi="Arial" w:cs="Arial"/>
-          <w:sz w:val="24"/>
+          <w:sz w:val="21"/>
           <w:szCs w:val="24"/>
         </w:rPr>
         <w:t>Vale-transporte: {{vale_transporte_x}}</w:t>
@@ -2487,7 +2511,7 @@
       <w:r>
         <w:rPr>
           <w:rFonts w:ascii="Arial" w:hAnsi="Arial" w:cs="Arial"/>
-          <w:sz w:val="24"/>
+          <w:sz w:val="21"/>
           <w:szCs w:val="24"/>
         </w:rPr>
         <w:t/>
@@ -2495,7 +2519,7 @@
       <w:r>
         <w:rPr>
           <w:rFonts w:ascii="Arial" w:hAnsi="Arial" w:cs="Arial"/>
-          <w:sz w:val="24"/>
+          <w:sz w:val="21"/>
           <w:szCs w:val="24"/>
         </w:rPr>
         <w:t xml:space="preserve"/>
@@ -2503,7 +2527,7 @@
       <w:r>
         <w:rPr>
           <w:rFonts w:ascii="Arial" w:hAnsi="Arial" w:cs="Arial"/>
-          <w:sz w:val="24"/>
+          <w:sz w:val="21"/>
           <w:szCs w:val="24"/>
         </w:rPr>
         <w:t/>
@@ -2512,7 +2536,7 @@
         <w:rPr>
           <w:rFonts w:ascii="Arial" w:hAnsi="Arial" w:cs="Arial"/>
           <w:color w:val="000000"/>
-          <w:sz w:val="24"/>
+          <w:sz w:val="21"/>
           <w:szCs w:val="24"/>
         </w:rPr>
       </w:r>
@@ -2520,14 +2544,14 @@
         <w:rPr>
           <w:rFonts w:ascii="Arial" w:hAnsi="Arial" w:cs="Arial"/>
           <w:color w:val="000000"/>
-          <w:sz w:val="24"/>
-          <w:szCs w:val="24"/>
-        </w:rPr>
-      </w:r>
-      <w:r>
-        <w:rPr>
-          <w:rFonts w:ascii="Arial" w:hAnsi="Arial" w:cs="Arial"/>
-          <w:sz w:val="24"/>
+          <w:sz w:val="21"/>
+          <w:szCs w:val="24"/>
+        </w:rPr>
+      </w:r>
+      <w:r>
+        <w:rPr>
+          <w:rFonts w:ascii="Arial" w:hAnsi="Arial" w:cs="Arial"/>
+          <w:sz w:val="21"/>
           <w:szCs w:val="24"/>
         </w:rPr>
         <w:t xml:space="preserve"/>
@@ -2535,6 +2559,7 @@
     </w:p>
     <w:p ns2:paraId="02BD107D" ns2:textId="4615CAA0">
       <w:pPr>
+        <w:spacing w:before="0" w:after="0" w:line="240" w:lineRule="auto"/>
         <w:ind w:left="15" w:right="0"/>
         <w:jc w:val="both"/>
         <w:rPr>
@@ -2546,7 +2571,7 @@
       <w:r>
         <w:rPr>
           <w:rFonts w:ascii="Arial" w:hAnsi="Arial" w:cs="Arial"/>
-          <w:sz w:val="24"/>
+          <w:sz w:val="21"/>
           <w:szCs w:val="24"/>
         </w:rPr>
         <w:t>Transporte da Empresa: {{transporte_empresa_x}}</w:t>
@@ -2554,7 +2579,7 @@
       <w:r>
         <w:rPr>
           <w:rFonts w:ascii="Arial" w:hAnsi="Arial" w:cs="Arial"/>
-          <w:sz w:val="24"/>
+          <w:sz w:val="21"/>
           <w:szCs w:val="24"/>
         </w:rPr>
         <w:t xml:space="preserve"/>
@@ -2562,7 +2587,7 @@
       <w:r>
         <w:rPr>
           <w:rFonts w:ascii="Arial" w:hAnsi="Arial" w:cs="Arial"/>
-          <w:sz w:val="24"/>
+          <w:sz w:val="21"/>
           <w:szCs w:val="24"/>
         </w:rPr>
         <w:t/>
@@ -2571,7 +2596,7 @@
         <w:rPr>
           <w:rFonts w:ascii="Arial" w:hAnsi="Arial" w:cs="Arial"/>
           <w:color w:val="000000"/>
-          <w:sz w:val="24"/>
+          <w:sz w:val="21"/>
           <w:szCs w:val="24"/>
         </w:rPr>
       </w:r>
@@ -2579,14 +2604,14 @@
         <w:rPr>
           <w:rFonts w:ascii="Arial" w:hAnsi="Arial" w:cs="Arial"/>
           <w:color w:val="000000"/>
-          <w:sz w:val="24"/>
-          <w:szCs w:val="24"/>
-        </w:rPr>
-      </w:r>
-      <w:r>
-        <w:rPr>
-          <w:rFonts w:ascii="Arial" w:hAnsi="Arial" w:cs="Arial"/>
-          <w:sz w:val="24"/>
+          <w:sz w:val="21"/>
+          <w:szCs w:val="24"/>
+        </w:rPr>
+      </w:r>
+      <w:r>
+        <w:rPr>
+          <w:rFonts w:ascii="Arial" w:hAnsi="Arial" w:cs="Arial"/>
+          <w:sz w:val="21"/>
           <w:szCs w:val="24"/>
         </w:rPr>
         <w:t xml:space="preserve"/>
@@ -2594,6 +2619,7 @@
     </w:p>
     <w:p ns2:paraId="26E1205B" ns2:textId="01BAFEA3">
       <w:pPr>
+        <w:spacing w:before="0" w:after="0" w:line="240" w:lineRule="auto"/>
         <w:ind w:left="15" w:right="0"/>
         <w:jc w:val="both"/>
         <w:rPr>
@@ -2605,7 +2631,7 @@
       <w:r>
         <w:rPr>
           <w:rFonts w:ascii="Arial" w:hAnsi="Arial" w:cs="Arial"/>
-          <w:sz w:val="24"/>
+          <w:sz w:val="21"/>
           <w:szCs w:val="24"/>
         </w:rPr>
         <w:t>Outros: {{outros_transporte_x}}</w:t>
@@ -2613,7 +2639,7 @@
       <w:r>
         <w:rPr>
           <w:rFonts w:ascii="Arial" w:hAnsi="Arial" w:cs="Arial"/>
-          <w:sz w:val="24"/>
+          <w:sz w:val="21"/>
           <w:szCs w:val="24"/>
         </w:rPr>
         <w:t/>
@@ -2621,6 +2647,7 @@
     </w:p>
     <w:p ns2:paraId="4B185D2C" ns2:textId="29683A95">
       <w:pPr>
+        <w:spacing w:before="0" w:after="0" w:line="240" w:lineRule="auto"/>
         <w:ind w:left="15" w:right="0"/>
         <w:jc w:val="both"/>
         <w:rPr>
@@ -2633,7 +2660,7 @@
       <w:r>
         <w:rPr>
           <w:rFonts w:ascii="Arial" w:hAnsi="Arial" w:cs="Arial"/>
-          <w:sz w:val="24"/>
+          <w:sz w:val="21"/>
           <w:szCs w:val="24"/>
         </w:rPr>
         <w:t>Outro(s) benefício(s) (se tiver): {{beneficios}}</w:t>
@@ -2641,7 +2668,7 @@
       <w:r>
         <w:rPr>
           <w:rFonts w:ascii="Arial" w:hAnsi="Arial" w:cs="Arial"/>
-          <w:sz w:val="24"/>
+          <w:sz w:val="21"/>
           <w:szCs w:val="24"/>
         </w:rPr>
         <w:t xml:space="preserve"/>
@@ -2649,7 +2676,7 @@
       <w:r>
         <w:rPr>
           <w:rFonts w:ascii="Arial" w:hAnsi="Arial" w:cs="Arial"/>
-          <w:sz w:val="24"/>
+          <w:sz w:val="21"/>
           <w:szCs w:val="24"/>
         </w:rPr>
         <w:t xml:space="preserve"/>
@@ -2657,7 +2684,7 @@
       <w:r>
         <w:rPr>
           <w:rFonts w:ascii="Arial" w:hAnsi="Arial" w:cs="Arial"/>
-          <w:sz w:val="24"/>
+          <w:sz w:val="21"/>
           <w:szCs w:val="24"/>
         </w:rPr>
         <w:t/>
@@ -2665,7 +2692,7 @@
       <w:r>
         <w:rPr>
           <w:rFonts w:ascii="Arial" w:hAnsi="Arial" w:cs="Arial"/>
-          <w:sz w:val="24"/>
+          <w:sz w:val="21"/>
           <w:szCs w:val="24"/>
         </w:rPr>
         <w:t xml:space="preserve"/>
@@ -2673,7 +2700,7 @@
       <w:r>
         <w:rPr>
           <w:rFonts w:ascii="Arial" w:hAnsi="Arial" w:cs="Arial"/>
-          <w:sz w:val="24"/>
+          <w:sz w:val="21"/>
           <w:szCs w:val="24"/>
         </w:rPr>
         <w:t xml:space="preserve"/>
@@ -2682,13 +2709,14 @@
         <w:rPr>
           <w:rFonts w:ascii="Arial" w:hAnsi="Arial" w:cs="Arial"/>
           <w:b/>
-          <w:sz w:val="24"/>
+          <w:sz w:val="21"/>
           <w:szCs w:val="24"/>
         </w:rPr>
       </w:r>
     </w:p>
     <w:p ns2:paraId="25A312C9" ns2:textId="2A2E3E4A">
       <w:pPr>
+        <w:spacing w:before="0" w:after="0" w:line="20" w:lineRule="exact"/>
         <w:ind w:left="15" w:right="0"/>
         <w:jc w:val="both"/>
         <w:rPr>
@@ -2701,13 +2729,14 @@
         <w:rPr>
           <w:rFonts w:ascii="Arial" w:hAnsi="Arial" w:cs="Arial"/>
           <w:b/>
-          <w:sz w:val="24"/>
+          <w:sz w:val="21"/>
           <w:szCs w:val="24"/>
         </w:rPr>
       </w:r>
     </w:p>
     <w:p ns2:paraId="7C1466AF" ns2:textId="09541DA6">
       <w:pPr>
+        <w:spacing w:before="0" w:after="0" w:line="240" w:lineRule="auto"/>
         <w:ind w:left="0"/>
         <w:rPr>
           <w:rFonts w:ascii="Arial" w:hAnsi="Arial" w:cs="Arial"/>
@@ -2718,7 +2747,7 @@
       <w:r>
         <w:rPr>
           <w:rFonts w:ascii="Arial" w:hAnsi="Arial" w:cs="Arial"/>
-          <w:sz w:val="24"/>
+          <w:sz w:val="21"/>
           <w:szCs w:val="24"/>
         </w:rPr>
         <w:t>Descrição das atividades a serem desempenhadas pelo estagiário:</w:t>
@@ -2726,7 +2755,7 @@
       <w:r>
         <w:rPr>
           <w:rFonts w:ascii="Arial" w:hAnsi="Arial" w:cs="Arial"/>
-          <w:sz w:val="24"/>
+          <w:sz w:val="21"/>
           <w:szCs w:val="24"/>
         </w:rPr>
         <w:softHyphen/>
@@ -2734,7 +2763,7 @@
       <w:r>
         <w:rPr>
           <w:rFonts w:ascii="Arial" w:hAnsi="Arial" w:cs="Arial"/>
-          <w:sz w:val="24"/>
+          <w:sz w:val="21"/>
           <w:szCs w:val="24"/>
         </w:rPr>
         <w:softHyphen/>
@@ -2742,7 +2771,7 @@
       <w:r>
         <w:rPr>
           <w:rFonts w:ascii="Arial" w:hAnsi="Arial" w:cs="Arial"/>
-          <w:sz w:val="24"/>
+          <w:sz w:val="21"/>
           <w:szCs w:val="24"/>
         </w:rPr>
         <w:softHyphen/>
@@ -2750,7 +2779,7 @@
       <w:r>
         <w:rPr>
           <w:rFonts w:ascii="Arial" w:hAnsi="Arial" w:cs="Arial"/>
-          <w:sz w:val="24"/>
+          <w:sz w:val="21"/>
           <w:szCs w:val="24"/>
         </w:rPr>
         <w:softHyphen/>
@@ -2758,7 +2787,7 @@
       <w:r>
         <w:rPr>
           <w:rFonts w:ascii="Arial" w:hAnsi="Arial" w:cs="Arial"/>
-          <w:sz w:val="24"/>
+          <w:sz w:val="21"/>
           <w:szCs w:val="24"/>
         </w:rPr>
         <w:softHyphen/>
@@ -2766,7 +2795,7 @@
       <w:r>
         <w:rPr>
           <w:rFonts w:ascii="Arial" w:hAnsi="Arial" w:cs="Arial"/>
-          <w:sz w:val="24"/>
+          <w:sz w:val="21"/>
           <w:szCs w:val="24"/>
         </w:rPr>
         <w:softHyphen/>
@@ -2774,7 +2803,7 @@
       <w:r>
         <w:rPr>
           <w:rFonts w:ascii="Arial" w:hAnsi="Arial" w:cs="Arial"/>
-          <w:sz w:val="24"/>
+          <w:sz w:val="21"/>
           <w:szCs w:val="24"/>
         </w:rPr>
         <w:softHyphen/>
@@ -2782,7 +2811,7 @@
       <w:r>
         <w:rPr>
           <w:rFonts w:ascii="Arial" w:hAnsi="Arial" w:cs="Arial"/>
-          <w:sz w:val="24"/>
+          <w:sz w:val="21"/>
           <w:szCs w:val="24"/>
         </w:rPr>
         <w:softHyphen/>
@@ -2790,7 +2819,7 @@
       <w:r>
         <w:rPr>
           <w:rFonts w:ascii="Arial" w:hAnsi="Arial" w:cs="Arial"/>
-          <w:sz w:val="24"/>
+          <w:sz w:val="21"/>
           <w:szCs w:val="24"/>
         </w:rPr>
         <w:softHyphen/>
@@ -2798,7 +2827,7 @@
       <w:r>
         <w:rPr>
           <w:rFonts w:ascii="Arial" w:hAnsi="Arial" w:cs="Arial"/>
-          <w:sz w:val="24"/>
+          <w:sz w:val="21"/>
           <w:szCs w:val="24"/>
         </w:rPr>
         <w:softHyphen/>
@@ -2806,7 +2835,7 @@
       <w:r>
         <w:rPr>
           <w:rFonts w:ascii="Arial" w:hAnsi="Arial" w:cs="Arial"/>
-          <w:sz w:val="24"/>
+          <w:sz w:val="21"/>
           <w:szCs w:val="24"/>
         </w:rPr>
         <w:softHyphen/>
@@ -2814,7 +2843,7 @@
       <w:r>
         <w:rPr>
           <w:rFonts w:ascii="Arial" w:hAnsi="Arial" w:cs="Arial"/>
-          <w:sz w:val="24"/>
+          <w:sz w:val="21"/>
           <w:szCs w:val="24"/>
         </w:rPr>
         <w:softHyphen/>
@@ -2822,7 +2851,7 @@
       <w:r>
         <w:rPr>
           <w:rFonts w:ascii="Arial" w:hAnsi="Arial" w:cs="Arial"/>
-          <w:sz w:val="24"/>
+          <w:sz w:val="21"/>
           <w:szCs w:val="24"/>
         </w:rPr>
         <w:softHyphen/>
@@ -2830,7 +2859,7 @@
       <w:r>
         <w:rPr>
           <w:rFonts w:ascii="Arial" w:hAnsi="Arial" w:cs="Arial"/>
-          <w:sz w:val="24"/>
+          <w:sz w:val="21"/>
           <w:szCs w:val="24"/>
         </w:rPr>
         <w:softHyphen/>
@@ -2838,7 +2867,7 @@
       <w:r>
         <w:rPr>
           <w:rFonts w:ascii="Arial" w:hAnsi="Arial" w:cs="Arial"/>
-          <w:sz w:val="24"/>
+          <w:sz w:val="21"/>
           <w:szCs w:val="24"/>
         </w:rPr>
         <w:softHyphen/>
@@ -2846,7 +2875,7 @@
       <w:r>
         <w:rPr>
           <w:rFonts w:ascii="Arial" w:hAnsi="Arial" w:cs="Arial"/>
-          <w:sz w:val="24"/>
+          <w:sz w:val="21"/>
           <w:szCs w:val="24"/>
         </w:rPr>
         <w:softHyphen/>
@@ -2854,7 +2883,7 @@
       <w:r>
         <w:rPr>
           <w:rFonts w:ascii="Arial" w:hAnsi="Arial" w:cs="Arial"/>
-          <w:sz w:val="24"/>
+          <w:sz w:val="21"/>
           <w:szCs w:val="24"/>
         </w:rPr>
         <w:softHyphen/>
@@ -2862,7 +2891,7 @@
       <w:r>
         <w:rPr>
           <w:rFonts w:ascii="Arial" w:hAnsi="Arial" w:cs="Arial"/>
-          <w:sz w:val="24"/>
+          <w:sz w:val="21"/>
           <w:szCs w:val="24"/>
         </w:rPr>
         <w:softHyphen/>
@@ -2870,7 +2899,7 @@
       <w:r>
         <w:rPr>
           <w:rFonts w:ascii="Arial" w:hAnsi="Arial" w:cs="Arial"/>
-          <w:sz w:val="24"/>
+          <w:sz w:val="21"/>
           <w:szCs w:val="24"/>
         </w:rPr>
         <w:softHyphen/>
@@ -2885,13 +2914,13 @@
           <w:szCs w:val="24"/>
         </w:rPr>
         <w:jc w:val="both"/>
-        <w:spacing w:after="160" w:line="276" w:lineRule="auto"/>
+        <w:spacing w:after="0" w:line="240" w:lineRule="auto" w:before="0"/>
       </w:pPr>
       <w:r>
         <w:rPr>
           <w:noProof/>
           <w:rFonts w:ascii="Arial" w:hAnsi="Arial" w:cs="Arial"/>
-          <w:sz w:val="24"/>
+          <w:sz w:val="21"/>
           <w:szCs w:val="24"/>
         </w:rPr>
         <w:t>{{atividades}}</w:t>
@@ -2899,6 +2928,7 @@
     </w:p>
     <w:p ns2:paraId="4510187F" ns2:textId="1588A465">
       <w:pPr>
+        <w:spacing w:before="0" w:after="0" w:line="20" w:lineRule="exact"/>
         <w:ind w:left="0"/>
         <w:rPr>
           <w:rFonts w:ascii="Arial" w:hAnsi="Arial" w:cs="Arial"/>
@@ -2946,7 +2976,7 @@
                 <w:tab w:val="left" w:pos="0"/>
               </w:tabs>
               <w:snapToGrid w:val="0"/>
-              <w:spacing w:before="0" w:after="0"/>
+              <w:spacing w:before="0" w:after="0" w:line="240" w:lineRule="auto"/>
               <w:rPr>
                 <w:rFonts w:ascii="Arial" w:hAnsi="Arial" w:cs="Arial"/>
                 <w:sz w:val="24"/>
@@ -2956,7 +2986,8 @@
             <w:r>
               <w:rPr>
                 <w:rFonts w:ascii="Arial" w:hAnsi="Arial" w:cs="Arial"/>
-                <w:sz w:val="24"/>
+                <w:b/>
+                <w:sz w:val="20"/>
                 <w:szCs w:val="24"/>
               </w:rPr>
               <w:t>E – PARECER DO PROFESSOR ORIENTADOR DO CURSO</w:t>
@@ -2968,7 +2999,7 @@
     <w:p ns2:paraId="0B6DC3F9" ns2:textId="77777777">
       <w:pPr>
         <w:pStyle w:val="Corpodetexto21"/>
-        <w:spacing w:after="100"/>
+        <w:spacing w:after="0" w:before="0" w:line="240" w:lineRule="auto"/>
         <w:ind w:right="0"/>
         <w:rPr>
           <w:rFonts w:ascii="Arial" w:hAnsi="Arial" w:cs="Arial"/>
@@ -2978,7 +3009,7 @@
       <w:r>
         <w:rPr>
           <w:rFonts w:ascii="Arial" w:hAnsi="Arial" w:cs="Arial"/>
-          <w:sz w:val="24"/>
+          <w:sz w:val="21"/>
           <w:szCs w:val="24"/>
         </w:rPr>
         <w:t>(</w:t>
@@ -2986,7 +3017,7 @@
       <w:r>
         <w:rPr>
           <w:rFonts w:ascii="Arial" w:hAnsi="Arial" w:cs="Arial"/>
-          <w:sz w:val="24"/>
+          <w:sz w:val="21"/>
           <w:szCs w:val="24"/>
         </w:rPr>
         <w:t>X</w:t>
@@ -2994,7 +3025,7 @@
       <w:r>
         <w:rPr>
           <w:rFonts w:ascii="Arial" w:hAnsi="Arial" w:cs="Arial"/>
-          <w:sz w:val="24"/>
+          <w:sz w:val="21"/>
           <w:szCs w:val="24"/>
         </w:rPr>
         <w:t>) Deferido</w:t>
@@ -3002,14 +3033,14 @@
       <w:r>
         <w:rPr>
           <w:rFonts w:ascii="Arial" w:hAnsi="Arial" w:cs="Arial"/>
-          <w:sz w:val="24"/>
-          <w:szCs w:val="24"/>
-        </w:rPr>
-      </w:r>
-      <w:r>
-        <w:rPr>
-          <w:rFonts w:ascii="Arial" w:hAnsi="Arial" w:cs="Arial"/>
-          <w:sz w:val="24"/>
+          <w:sz w:val="21"/>
+          <w:szCs w:val="24"/>
+        </w:rPr>
+      </w:r>
+      <w:r>
+        <w:rPr>
+          <w:rFonts w:ascii="Arial" w:hAnsi="Arial" w:cs="Arial"/>
+          <w:sz w:val="21"/>
           <w:szCs w:val="24"/>
         </w:rPr>
       </w:r>
@@ -3017,7 +3048,7 @@
     <w:p ns2:paraId="378A2959" ns2:textId="10D19FA9">
       <w:pPr>
         <w:pStyle w:val="Corpodetexto21"/>
-        <w:spacing w:after="100"/>
+        <w:spacing w:after="0" w:before="0" w:line="240" w:lineRule="auto"/>
         <w:ind w:right="0"/>
         <w:rPr>
           <w:rFonts w:ascii="Arial" w:hAnsi="Arial" w:cs="Arial"/>
@@ -3028,7 +3059,7 @@
       <w:r>
         <w:rPr>
           <w:rFonts w:ascii="Arial" w:hAnsi="Arial" w:cs="Arial"/>
-          <w:sz w:val="24"/>
+          <w:sz w:val="21"/>
           <w:szCs w:val="24"/>
         </w:rPr>
         <w:t>(</w:t>
@@ -3037,14 +3068,14 @@
       <w:r>
         <w:rPr>
           <w:rFonts w:ascii="Arial" w:hAnsi="Arial" w:cs="Arial"/>
-          <w:sz w:val="24"/>
-          <w:szCs w:val="24"/>
-        </w:rPr>
-      </w:r>
-      <w:r>
-        <w:rPr>
-          <w:rFonts w:ascii="Arial" w:hAnsi="Arial" w:cs="Arial"/>
-          <w:sz w:val="24"/>
+          <w:sz w:val="21"/>
+          <w:szCs w:val="24"/>
+        </w:rPr>
+      </w:r>
+      <w:r>
+        <w:rPr>
+          <w:rFonts w:ascii="Arial" w:hAnsi="Arial" w:cs="Arial"/>
+          <w:sz w:val="21"/>
           <w:szCs w:val="24"/>
         </w:rPr>
         <w:t>) Indeferido</w:t>
@@ -3053,7 +3084,7 @@
     <w:p ns2:paraId="4A610643" ns2:textId="77777777">
       <w:pPr>
         <w:pStyle w:val="Corpodetexto21"/>
-        <w:spacing w:after="100"/>
+        <w:spacing w:after="0" w:before="0" w:line="240" w:lineRule="auto"/>
         <w:ind w:right="0"/>
         <w:rPr>
           <w:rFonts w:ascii="Arial" w:hAnsi="Arial" w:cs="Arial"/>
@@ -3063,7 +3094,7 @@
       <w:r>
         <w:rPr>
           <w:rFonts w:ascii="Arial" w:hAnsi="Arial" w:cs="Arial"/>
-          <w:sz w:val="24"/>
+          <w:sz w:val="21"/>
           <w:szCs w:val="24"/>
         </w:rPr>
         <w:t>Comentários:</w:t>
@@ -3071,16 +3102,17 @@
     </w:p>
     <w:p ns2:paraId="57C7582D" ns2:textId="7F69250A">
       <w:pPr>
-        <w:rPr>
-          <w:rFonts w:ascii="Arial" w:hAnsi="Arial" w:cs="Arial"/>
-          <w:sz w:val="24"/>
-          <w:szCs w:val="24"/>
-        </w:rPr>
-      </w:pPr>
-      <w:r>
-        <w:rPr>
-          <w:rFonts w:ascii="Arial" w:hAnsi="Arial" w:cs="Arial"/>
-          <w:sz w:val="24"/>
+        <w:spacing w:before="0" w:after="0" w:line="20" w:lineRule="exact"/>
+        <w:rPr>
+          <w:rFonts w:ascii="Arial" w:hAnsi="Arial" w:cs="Arial"/>
+          <w:sz w:val="24"/>
+          <w:szCs w:val="24"/>
+        </w:rPr>
+      </w:pPr>
+      <w:r>
+        <w:rPr>
+          <w:rFonts w:ascii="Arial" w:hAnsi="Arial" w:cs="Arial"/>
+          <w:sz w:val="21"/>
           <w:szCs w:val="24"/>
         </w:rPr>
         <w:br w:type="page"/>
@@ -3121,7 +3153,7 @@
           <w:p ns2:paraId="158EAD1D" ns2:textId="77777777">
             <w:pPr>
               <w:pStyle w:val="p7"/>
-              <w:spacing w:line="240" w:lineRule="auto"/>
+              <w:spacing w:line="240" w:lineRule="auto" w:before="0" w:after="0"/>
               <w:ind w:left="0" w:firstLine="0"/>
               <w:jc w:val="both"/>
               <w:rPr>
@@ -3135,7 +3167,7 @@
               <w:rPr>
                 <w:rFonts w:ascii="Arial" w:hAnsi="Arial" w:cs="Arial"/>
                 <w:b/>
-                <w:sz w:val="24"/>
+                <w:sz w:val="20"/>
                 <w:szCs w:val="24"/>
               </w:rPr>
               <w:lastRenderedPageBreak/>
@@ -3154,12 +3186,12 @@
           <w:sz w:val="24"/>
           <w:szCs w:val="24"/>
         </w:rPr>
-        <w:spacing w:after="120" w:line="276" w:lineRule="auto"/>
-      </w:pPr>
-      <w:r>
-        <w:rPr>
-          <w:rFonts w:ascii="Arial" w:hAnsi="Arial" w:cs="Arial"/>
-          <w:sz w:val="24"/>
+        <w:spacing w:after="0" w:line="240" w:lineRule="auto" w:before="0"/>
+      </w:pPr>
+      <w:r>
+        <w:rPr>
+          <w:rFonts w:ascii="Arial" w:hAnsi="Arial" w:cs="Arial"/>
+          <w:sz w:val="21"/>
           <w:szCs w:val="24"/>
         </w:rPr>
         <w:t>As partes, por si, por seus representantes, colaboradores e por quaisquer terceiros que por sua determinação participarem deste convênio de viabilização de concessão de estágio de complementação educacional, objeto desta relação, comprometem-se a atuar de modo a proteger e a garantir o tratamento adequado dos dados pessoais a que tiverem acesso durante a relação contratual, bem como a cumprir as disposições da Lei n° 13.709/2018 (Lei Geral de Proteção de Dados – LGPD). Cada parte será individualmente responsável pelo cumprimento de suas obrigações decorrentes da LGPD e das regulamentações emitidas posteriormente pela autoridade reguladora competente (ANPD).</w:t>
@@ -3170,6 +3202,7 @@
         <w:tabs>
           <w:tab w:val="left" w:pos="9811"/>
         </w:tabs>
+        <w:spacing w:before="0" w:after="0" w:line="20" w:lineRule="exact"/>
         <w:ind w:left="30"/>
         <w:jc w:val="right"/>
         <w:rPr>
@@ -3184,6 +3217,7 @@
         <w:tabs>
           <w:tab w:val="left" w:pos="9811"/>
         </w:tabs>
+        <w:spacing w:before="0" w:after="0" w:line="20" w:lineRule="exact"/>
         <w:ind w:left="30"/>
         <w:jc w:val="right"/>
         <w:rPr>
@@ -3198,6 +3232,7 @@
         <w:tabs>
           <w:tab w:val="left" w:pos="9811"/>
         </w:tabs>
+        <w:spacing w:before="0" w:after="0" w:line="20" w:lineRule="exact"/>
         <w:ind w:left="30"/>
         <w:jc w:val="right"/>
         <w:rPr>
@@ -3212,6 +3247,7 @@
         <w:tabs>
           <w:tab w:val="left" w:pos="9811"/>
         </w:tabs>
+        <w:spacing w:before="0" w:after="0" w:line="20" w:lineRule="exact"/>
         <w:ind w:left="30"/>
         <w:jc w:val="right"/>
         <w:rPr>
@@ -3226,6 +3262,7 @@
         <w:tabs>
           <w:tab w:val="left" w:pos="9811"/>
         </w:tabs>
+        <w:spacing w:before="0" w:after="0" w:line="240" w:lineRule="auto"/>
         <w:ind w:left="30"/>
         <w:jc w:val="right"/>
         <w:rPr>
@@ -3239,7 +3276,7 @@
         <w:rPr>
           <w:rFonts w:ascii="Arial" w:hAnsi="Arial" w:cs="Arial"/>
           <w:color w:val="000000"/>
-          <w:sz w:val="24"/>
+          <w:sz w:val="21"/>
           <w:szCs w:val="24"/>
         </w:rPr>
         <w:t>Três Lagoas/MS,</w:t>
@@ -3248,7 +3285,7 @@
         <w:rPr>
           <w:rFonts w:ascii="Arial" w:hAnsi="Arial" w:cs="Arial"/>
           <w:color w:val="000000"/>
-          <w:sz w:val="24"/>
+          <w:sz w:val="21"/>
           <w:szCs w:val="24"/>
         </w:rPr>
         <w:t xml:space="preserve"> XX (dia)</w:t>
@@ -3257,7 +3294,7 @@
         <w:rPr>
           <w:rFonts w:ascii="Arial" w:hAnsi="Arial" w:cs="Arial"/>
           <w:color w:val="000000"/>
-          <w:sz w:val="24"/>
+          <w:sz w:val="21"/>
           <w:szCs w:val="24"/>
         </w:rPr>
         <w:t>de</w:t>
@@ -3266,7 +3303,7 @@
         <w:rPr>
           <w:rFonts w:ascii="Arial" w:hAnsi="Arial" w:cs="Arial"/>
           <w:color w:val="000000"/>
-          <w:sz w:val="24"/>
+          <w:sz w:val="21"/>
           <w:szCs w:val="24"/>
         </w:rPr>
         <w:t>XX (Mês)</w:t>
@@ -3275,7 +3312,7 @@
         <w:rPr>
           <w:rFonts w:ascii="Arial" w:hAnsi="Arial" w:cs="Arial"/>
           <w:color w:val="000000"/>
-          <w:sz w:val="24"/>
+          <w:sz w:val="21"/>
           <w:szCs w:val="24"/>
         </w:rPr>
         <w:t>de</w:t>
@@ -3284,7 +3321,7 @@
         <w:rPr>
           <w:rFonts w:ascii="Arial" w:hAnsi="Arial" w:cs="Arial"/>
           <w:color w:val="000000"/>
-          <w:sz w:val="24"/>
+          <w:sz w:val="21"/>
           <w:szCs w:val="24"/>
         </w:rPr>
         <w:t>XXXX (ANO)</w:t>
@@ -3293,7 +3330,7 @@
         <w:rPr>
           <w:rFonts w:ascii="Arial" w:hAnsi="Arial" w:cs="Arial"/>
           <w:color w:val="000000"/>
-          <w:sz w:val="24"/>
+          <w:sz w:val="21"/>
           <w:szCs w:val="24"/>
         </w:rPr>
         <w:t>.</w:t>
@@ -3304,6 +3341,7 @@
         <w:tabs>
           <w:tab w:val="left" w:pos="9639"/>
         </w:tabs>
+        <w:spacing w:before="0" w:after="0" w:line="20" w:lineRule="exact"/>
         <w:ind w:left="0" w:right="283"/>
         <w:jc w:val="right"/>
         <w:rPr>
@@ -3315,6 +3353,7 @@
     </w:p>
     <w:p ns2:paraId="2C83DF85" ns2:textId="4B8756EB">
       <w:pPr>
+        <w:spacing w:before="0" w:after="0" w:line="20" w:lineRule="exact"/>
         <w:rPr>
           <w:rFonts w:ascii="Arial" w:hAnsi="Arial" w:cs="Arial"/>
           <w:sz w:val="24"/>
@@ -3324,6 +3363,7 @@
     </w:p>
     <w:p ns2:paraId="221E616B" ns2:textId="028C1CDE">
       <w:pPr>
+        <w:spacing w:before="0" w:after="0" w:line="20" w:lineRule="exact"/>
         <w:rPr>
           <w:rFonts w:ascii="Arial" w:hAnsi="Arial" w:cs="Arial"/>
           <w:sz w:val="24"/>
@@ -3333,6 +3373,7 @@
     </w:p>
     <w:p ns2:paraId="543C1FB4" ns2:textId="219918EE">
       <w:pPr>
+        <w:spacing w:before="0" w:after="0" w:line="20" w:lineRule="exact"/>
         <w:rPr>
           <w:rFonts w:ascii="Arial" w:hAnsi="Arial" w:cs="Arial"/>
           <w:sz w:val="24"/>
@@ -3342,6 +3383,7 @@
     </w:p>
     <w:p ns2:paraId="095E3975" ns2:textId="77777777">
       <w:pPr>
+        <w:spacing w:before="0" w:after="0" w:line="20" w:lineRule="exact"/>
         <w:rPr>
           <w:rFonts w:ascii="Arial" w:hAnsi="Arial" w:cs="Arial"/>
           <w:sz w:val="24"/>
@@ -3351,6 +3393,7 @@
     </w:p>
     <w:p ns2:paraId="50452965" ns2:textId="0851E44E">
       <w:pPr>
+        <w:spacing w:before="0" w:after="0" w:line="20" w:lineRule="exact"/>
         <w:rPr>
           <w:rFonts w:ascii="Arial" w:hAnsi="Arial" w:cs="Arial"/>
           <w:sz w:val="24"/>
@@ -3360,16 +3403,17 @@
     </w:p>
     <w:p ns2:paraId="48B04B4B" ns2:textId="6356067C">
       <w:pPr>
-        <w:rPr>
-          <w:rFonts w:ascii="Arial" w:hAnsi="Arial" w:cs="Arial"/>
-          <w:sz w:val="24"/>
-          <w:szCs w:val="24"/>
-        </w:rPr>
-      </w:pPr>
-      <w:r>
-        <w:rPr>
-          <w:rFonts w:ascii="Arial" w:hAnsi="Arial" w:cs="Arial"/>
-          <w:sz w:val="24"/>
+        <w:spacing w:before="0" w:after="0" w:line="240" w:lineRule="auto"/>
+        <w:rPr>
+          <w:rFonts w:ascii="Arial" w:hAnsi="Arial" w:cs="Arial"/>
+          <w:sz w:val="24"/>
+          <w:szCs w:val="24"/>
+        </w:rPr>
+      </w:pPr>
+      <w:r>
+        <w:rPr>
+          <w:rFonts w:ascii="Arial" w:hAnsi="Arial" w:cs="Arial"/>
+          <w:sz w:val="21"/>
           <w:szCs w:val="24"/>
         </w:rPr>
         <w:t>____________________________________</w:t>
@@ -3377,6 +3421,7 @@
     </w:p>
     <w:p ns2:paraId="072A4763" ns2:textId="77777777">
       <w:pPr>
+        <w:spacing w:before="0" w:after="0" w:line="240" w:lineRule="auto"/>
         <w:ind w:right="0"/>
         <w:rPr>
           <w:rFonts w:ascii="Arial" w:hAnsi="Arial" w:cs="Arial"/>
@@ -3389,7 +3434,7 @@
         <w:rPr>
           <w:rFonts w:ascii="Arial" w:hAnsi="Arial" w:cs="Arial"/>
           <w:b/>
-          <w:sz w:val="24"/>
+          <w:sz w:val="21"/>
           <w:szCs w:val="24"/>
         </w:rPr>
         <w:t>Supervisor de Estágio da Unidade Concedente de Estágio</w:t>
@@ -3397,6 +3442,7 @@
     </w:p>
     <w:p ns2:paraId="7C014B72" ns2:textId="77777777">
       <w:pPr>
+        <w:spacing w:before="0" w:after="0" w:line="20" w:lineRule="exact"/>
         <w:ind w:right="0"/>
         <w:rPr>
           <w:rFonts w:ascii="Arial" w:hAnsi="Arial" w:cs="Arial"/>
@@ -3407,6 +3453,7 @@
     </w:p>
     <w:p ns2:paraId="58B8543E" ns2:textId="1CC96C6A">
       <w:pPr>
+        <w:spacing w:before="0" w:after="0" w:line="20" w:lineRule="exact"/>
         <w:ind w:right="0"/>
         <w:rPr>
           <w:rFonts w:ascii="Arial" w:hAnsi="Arial" w:cs="Arial"/>
@@ -3417,6 +3464,7 @@
     </w:p>
     <w:p ns2:paraId="7650CFE2" ns2:textId="502F2F96">
       <w:pPr>
+        <w:spacing w:before="0" w:after="0" w:line="20" w:lineRule="exact"/>
         <w:ind w:right="0"/>
         <w:rPr>
           <w:rFonts w:ascii="Arial" w:hAnsi="Arial" w:cs="Arial"/>
@@ -3427,6 +3475,7 @@
     </w:p>
     <w:p ns2:paraId="3D416708" ns2:textId="77777777">
       <w:pPr>
+        <w:spacing w:before="0" w:after="0" w:line="20" w:lineRule="exact"/>
         <w:ind w:right="0"/>
         <w:rPr>
           <w:rFonts w:ascii="Arial" w:hAnsi="Arial" w:cs="Arial"/>
@@ -3437,6 +3486,7 @@
     </w:p>
     <w:p ns2:paraId="3284A3DE" ns2:textId="77777777">
       <w:pPr>
+        <w:spacing w:before="0" w:after="0" w:line="20" w:lineRule="exact"/>
         <w:ind w:right="0"/>
         <w:rPr>
           <w:rFonts w:ascii="Arial" w:hAnsi="Arial" w:cs="Arial"/>
@@ -3447,6 +3497,7 @@
     </w:p>
     <w:p ns2:paraId="258F5138" ns2:textId="77777777">
       <w:pPr>
+        <w:spacing w:before="0" w:after="0" w:line="240" w:lineRule="auto"/>
         <w:ind w:right="0"/>
         <w:rPr>
           <w:rFonts w:ascii="Arial" w:hAnsi="Arial" w:cs="Arial"/>
@@ -3457,7 +3508,7 @@
       <w:r>
         <w:rPr>
           <w:rFonts w:ascii="Arial" w:hAnsi="Arial" w:cs="Arial"/>
-          <w:sz w:val="24"/>
+          <w:sz w:val="21"/>
           <w:szCs w:val="24"/>
         </w:rPr>
         <w:t>____________________________________</w:t>
@@ -3465,6 +3516,7 @@
     </w:p>
     <w:p ns2:paraId="062B9575" ns2:textId="77777777">
       <w:pPr>
+        <w:spacing w:before="0" w:after="0" w:line="240" w:lineRule="auto"/>
         <w:ind w:right="0"/>
         <w:rPr>
           <w:rFonts w:ascii="Arial" w:hAnsi="Arial" w:cs="Arial"/>
@@ -3476,7 +3528,7 @@
         <w:rPr>
           <w:rFonts w:ascii="Arial" w:hAnsi="Arial" w:cs="Arial"/>
           <w:b/>
-          <w:sz w:val="24"/>
+          <w:sz w:val="21"/>
           <w:szCs w:val="24"/>
         </w:rPr>
         <w:t>Estagiário</w:t>
@@ -3484,6 +3536,7 @@
     </w:p>
     <w:p ns2:paraId="51116140" ns2:textId="77777777">
       <w:pPr>
+        <w:spacing w:before="0" w:after="0" w:line="20" w:lineRule="exact"/>
         <w:ind w:right="0"/>
         <w:rPr>
           <w:rFonts w:ascii="Arial" w:hAnsi="Arial" w:cs="Arial"/>
@@ -3494,6 +3547,7 @@
     </w:p>
     <w:p ns2:paraId="22CCB37C" ns2:textId="77777777">
       <w:pPr>
+        <w:spacing w:before="0" w:after="0" w:line="20" w:lineRule="exact"/>
         <w:ind w:right="0"/>
         <w:rPr>
           <w:rFonts w:ascii="Arial" w:hAnsi="Arial" w:cs="Arial"/>
@@ -3504,6 +3558,7 @@
     </w:p>
     <w:p ns2:paraId="220E70B8" ns2:textId="4F25E514">
       <w:pPr>
+        <w:spacing w:before="0" w:after="0" w:line="20" w:lineRule="exact"/>
         <w:ind w:right="0"/>
         <w:rPr>
           <w:rFonts w:ascii="Arial" w:hAnsi="Arial" w:cs="Arial"/>
@@ -3515,6 +3570,7 @@
     </w:p>
     <w:p ns2:paraId="7BD20A53" ns2:textId="77777777">
       <w:pPr>
+        <w:spacing w:before="0" w:after="0" w:line="20" w:lineRule="exact"/>
         <w:ind w:right="0"/>
         <w:rPr>
           <w:rFonts w:ascii="Arial" w:hAnsi="Arial" w:cs="Arial"/>
@@ -3526,6 +3582,7 @@
     </w:p>
     <w:p ns2:paraId="6DA0E2F1" ns2:textId="77777777">
       <w:pPr>
+        <w:spacing w:before="0" w:after="0" w:line="20" w:lineRule="exact"/>
         <w:ind w:right="0"/>
         <w:rPr>
           <w:rFonts w:ascii="Arial" w:hAnsi="Arial" w:cs="Arial"/>
@@ -3537,6 +3594,7 @@
     </w:p>
     <w:p ns2:paraId="1F070010" ns2:textId="7643A979">
       <w:pPr>
+        <w:spacing w:before="0" w:after="0" w:line="240" w:lineRule="auto"/>
         <w:ind w:right="0"/>
         <w:rPr>
           <w:rFonts w:ascii="Arial" w:hAnsi="Arial" w:cs="Arial"/>
@@ -3547,7 +3605,7 @@
       <w:r>
         <w:rPr>
           <w:rFonts w:ascii="Arial" w:hAnsi="Arial" w:cs="Arial"/>
-          <w:sz w:val="24"/>
+          <w:sz w:val="21"/>
           <w:szCs w:val="24"/>
         </w:rPr>
         <w:t>_____________________________________</w:t>
@@ -3561,20 +3619,22 @@
           <w:sz w:val="24"/>
           <w:szCs w:val="24"/>
         </w:rPr>
-        <w:spacing w:after="120" w:line="276" w:lineRule="auto"/>
+        <w:spacing w:after="0" w:line="240" w:lineRule="auto" w:before="0"/>
       </w:pPr>
       <w:r>
         <w:rPr>
           <w:rFonts w:ascii="Arial" w:hAnsi="Arial" w:cs="Arial"/>
           <w:b/>
-          <w:sz w:val="24"/>
+          <w:sz w:val="21"/>
           <w:szCs w:val="24"/>
         </w:rPr>
         <w:t>Professor orientador da AEMS – Associação de Ensino e Cultura de Mato Grosso do Sul</w:t>
       </w:r>
     </w:p>
     <w:p ns2:paraId="35187AC2" ns2:textId="77777777">
-      <w:pPr/>
+      <w:pPr>
+        <w:spacing w:before="0" w:after="0" w:line="20" w:lineRule="exact"/>
+      </w:pPr>
     </w:p>
     <w:sectPr>
       <w:headerReference w:type="default" ns3:id="rId7"/>
@@ -5389,6 +5449,13 @@
     <w:name w:val="Normal"/>
     <w:qFormat/>
     <w:rsid w:val="00D411F3"/>
+    <w:pPr>
+      <w:spacing w:before="0" w:after="0" w:line="240" w:lineRule="auto"/>
+    </w:pPr>
+    <w:rPr>
+      <w:rFonts w:ascii="Arial" w:hAnsi="Arial"/>
+      <w:sz w:val="21"/>
+    </w:rPr>
   </w:style>
   <w:style w:type="paragraph" w:styleId="Ttulo1">
     <w:name w:val="heading 1"/>
@@ -5742,8 +5809,12 @@
     <w:link w:val="CorpodetextoChar"/>
     <w:rsid w:val="00CC6752"/>
     <w:pPr>
-      <w:spacing w:after="120"/>
+      <w:spacing w:after="0" w:before="0" w:line="240" w:lineRule="auto"/>
     </w:pPr>
+    <w:rPr>
+      <w:rFonts w:ascii="Arial" w:hAnsi="Arial"/>
+      <w:sz w:val="21"/>
+    </w:rPr>
   </w:style>
   <w:style w:type="character" w:customStyle="1" w:styleId="CorpodetextoChar">
     <w:name w:val="Corpo de texto Char"/>

</xml_diff>

<commit_message>
Preserva espacamentos internos dos documentos de estagio
</commit_message>
<xml_diff>
--- a/models/plano-atividades-estagio-aems.docx
+++ b/models/plano-atividades-estagio-aems.docx
@@ -58,7 +58,7 @@
           <w:sz w:val="18"/>
           <w:szCs w:val="26"/>
         </w:rPr>
-        <w:t>º</w:t>
+        <w:t xml:space="preserve">º </w:t>
       </w:r>
       <w:r>
         <w:rPr>
@@ -74,7 +74,7 @@
     <w:p ns2:paraId="3E58BB62" ns2:textId="77777777">
       <w:pPr>
         <w:pStyle w:val="Corpodetexto"/>
-        <w:spacing w:before="0" w:after="0" w:line="20" w:lineRule="exact"/>
+        <w:spacing w:before="0" w:after="0" w:line="240" w:lineRule="auto"/>
         <w:ind w:left="0" w:right="283"/>
         <w:jc w:val="center"/>
         <w:rPr>
@@ -91,6 +91,7 @@
           <w:sz w:val="21"/>
           <w:szCs w:val="26"/>
         </w:rPr>
+        <w:t xml:space="preserve"> </w:t>
       </w:r>
     </w:p>
     <w:p ns2:paraId="6D197238" ns2:textId="593818C4">
@@ -131,7 +132,7 @@
           <w:sz w:val="21"/>
           <w:szCs w:val="26"/>
         </w:rPr>
-        <w:t>) ESTÁGIO OBRIGATÓRIO</w:t>
+        <w:t xml:space="preserve">) ESTÁGIO OBRIGATÓRIO                      </w:t>
       </w:r>
       <w:proofErr w:type="gramStart"/>
       <w:r>
@@ -156,7 +157,7 @@
     </w:p>
     <w:p ns2:paraId="043FC376" ns2:textId="77777777">
       <w:pPr>
-        <w:spacing w:before="0" w:after="0" w:line="20" w:lineRule="exact"/>
+        <w:spacing w:before="0" w:after="0" w:line="240" w:lineRule="auto"/>
         <w:jc w:val="both"/>
         <w:rPr>
           <w:rFonts w:ascii="Arial Narrow" w:hAnsi="Arial Narrow" w:cs="Arial"/>
@@ -182,7 +183,7 @@
           <w:sz w:val="21"/>
           <w:szCs w:val="24"/>
         </w:rPr>
-        <w:t>Por este</w:t>
+        <w:t xml:space="preserve">Por este </w:t>
       </w:r>
       <w:r>
         <w:rPr>
@@ -198,7 +199,7 @@
           <w:sz w:val="21"/>
           <w:szCs w:val="24"/>
         </w:rPr>
-        <w:t>, sem vínculo empregatício, referente ao Curso de</w:t>
+        <w:t xml:space="preserve">, sem vínculo empregatício, referente ao Curso de </w:t>
       </w:r>
       <w:r>
         <w:rPr>
@@ -231,7 +232,7 @@
         <w:tabs>
           <w:tab w:val="left" w:pos="0"/>
         </w:tabs>
-        <w:spacing w:line="20" w:lineRule="exact" w:before="0" w:after="0"/>
+        <w:spacing w:line="240" w:lineRule="auto" w:before="0" w:after="0"/>
         <w:jc w:val="both"/>
         <w:rPr>
           <w:rFonts w:ascii="Arial" w:hAnsi="Arial" w:cs="Arial"/>
@@ -254,7 +255,7 @@
         <w:tabs>
           <w:tab w:val="left" w:pos="0"/>
         </w:tabs>
-        <w:spacing w:after="0" w:before="0" w:line="20" w:lineRule="exact"/>
+        <w:spacing w:after="0" w:before="0" w:line="240" w:lineRule="auto"/>
         <w:rPr>
           <w:rFonts w:ascii="Arial" w:hAnsi="Arial" w:cs="Arial"/>
           <w:sz w:val="24"/>
@@ -344,7 +345,7 @@
           <w:sz w:val="21"/>
           <w:szCs w:val="24"/>
         </w:rPr>
-        <w:t>Razão social:</w:t>
+        <w:t xml:space="preserve">Razão social: </w:t>
       </w:r>
       <w:r>
         <w:rPr>
@@ -388,6 +389,7 @@
           <w:sz w:val="21"/>
           <w:szCs w:val="24"/>
         </w:rPr>
+        <w:t xml:space="preserve"> </w:t>
       </w:r>
       <w:r>
         <w:rPr>
@@ -405,20 +407,23 @@
           <w:sz w:val="21"/>
           <w:szCs w:val="24"/>
         </w:rPr>
-      </w:r>
-      <w:r>
-        <w:rPr>
-          <w:rFonts w:ascii="Arial" w:hAnsi="Arial" w:cs="Arial"/>
-          <w:sz w:val="21"/>
-          <w:szCs w:val="24"/>
-        </w:rPr>
-      </w:r>
-      <w:r>
-        <w:rPr>
-          <w:rFonts w:ascii="Arial" w:hAnsi="Arial" w:cs="Arial"/>
-          <w:sz w:val="21"/>
-          <w:szCs w:val="24"/>
-        </w:rPr>
+        <w:tab/>
+      </w:r>
+      <w:r>
+        <w:rPr>
+          <w:rFonts w:ascii="Arial" w:hAnsi="Arial" w:cs="Arial"/>
+          <w:sz w:val="21"/>
+          <w:szCs w:val="24"/>
+        </w:rPr>
+        <w:tab/>
+      </w:r>
+      <w:r>
+        <w:rPr>
+          <w:rFonts w:ascii="Arial" w:hAnsi="Arial" w:cs="Arial"/>
+          <w:sz w:val="21"/>
+          <w:szCs w:val="24"/>
+        </w:rPr>
+        <w:tab/>
       </w:r>
     </w:p>
     <w:p ns2:paraId="64042C85" ns2:textId="77777777">
@@ -444,7 +449,7 @@
           <w:sz w:val="21"/>
           <w:szCs w:val="24"/>
         </w:rPr>
-        <w:t>Telefone: {{telefone_empresa}}</w:t>
+        <w:t xml:space="preserve">Telefone: {{telefone_empresa}}        </w:t>
       </w:r>
       <w:r>
         <w:rPr>
@@ -496,7 +501,7 @@
           <w:sz w:val="21"/>
           <w:szCs w:val="24"/>
         </w:rPr>
-        <w:t>Ramo de atividade: {{ramo_atividade}}</w:t>
+        <w:t xml:space="preserve">Ramo de atividade: {{ramo_atividade}}                                                                                 </w:t>
       </w:r>
       <w:r>
         <w:rPr>
@@ -540,7 +545,7 @@
           <w:sz w:val="21"/>
           <w:szCs w:val="24"/>
         </w:rPr>
-        <w:t>E-mail: {{email_empresa}}</w:t>
+        <w:t xml:space="preserve">E-mail: {{email_empresa}}</w:t>
       </w:r>
       <w:r>
         <w:rPr>
@@ -584,7 +589,7 @@
           <w:sz w:val="21"/>
           <w:szCs w:val="24"/>
         </w:rPr>
-        <w:t>Endereço: {{endereco_empresa}}</w:t>
+        <w:t xml:space="preserve">Endereço: {{endereco_empresa}}  </w:t>
       </w:r>
       <w:r>
         <w:rPr>
@@ -634,7 +639,7 @@
           <w:sz w:val="21"/>
           <w:szCs w:val="24"/>
         </w:rPr>
-        <w:t>Bairro: {{bairro_empresa}}</w:t>
+        <w:t xml:space="preserve">Bairro: {{bairro_empresa}}                                              </w:t>
       </w:r>
       <w:r>
         <w:rPr>
@@ -674,7 +679,7 @@
           <w:sz w:val="21"/>
           <w:szCs w:val="24"/>
         </w:rPr>
-        <w:t>Município: {{municipio_empresa}}</w:t>
+        <w:t xml:space="preserve">Município: {{municipio_empresa}}                                                          </w:t>
       </w:r>
       <w:r>
         <w:rPr>
@@ -714,7 +719,7 @@
           <w:sz w:val="21"/>
           <w:szCs w:val="24"/>
         </w:rPr>
-        <w:t>UF: {{uf_empresa}}</w:t>
+        <w:t xml:space="preserve">UF: {{uf_empresa}}                            </w:t>
       </w:r>
       <w:r>
         <w:rPr>
@@ -754,7 +759,7 @@
           <w:sz w:val="21"/>
           <w:szCs w:val="24"/>
         </w:rPr>
-        <w:t>CEP: {{cep_empresa}}</w:t>
+        <w:t xml:space="preserve">CEP: {{cep_empresa}} </w:t>
       </w:r>
       <w:r>
         <w:rPr>
@@ -795,7 +800,7 @@
           <w:sz w:val="21"/>
           <w:szCs w:val="24"/>
         </w:rPr>
-        <w:t>Representada por: {{representante_legal}}</w:t>
+        <w:t xml:space="preserve">Representada por: {{representante_legal}}                                      </w:t>
       </w:r>
       <w:r>
         <w:rPr>
@@ -821,6 +826,8 @@
           <w:sz w:val="21"/>
           <w:szCs w:val="24"/>
         </w:rPr>
+        <w:tab/>
+        <w:t xml:space="preserve"/>
       </w:r>
     </w:p>
     <w:p ns2:paraId="05050D25" ns2:textId="77777777">
@@ -844,7 +851,7 @@
           <w:sz w:val="21"/>
           <w:szCs w:val="24"/>
         </w:rPr>
-        <w:t>Cargo:  {{cargo_representante}}</w:t>
+        <w:t xml:space="preserve">Cargo:  {{cargo_representante}}</w:t>
       </w:r>
       <w:r>
         <w:rPr>
@@ -863,7 +870,7 @@
           <w:tab w:val="left" w:pos="0"/>
           <w:tab w:val="left" w:pos="4500"/>
         </w:tabs>
-        <w:spacing w:before="0" w:after="0" w:line="20" w:lineRule="exact"/>
+        <w:spacing w:before="0" w:after="0" w:line="240" w:lineRule="auto"/>
         <w:jc w:val="both"/>
         <w:rPr>
           <w:rFonts w:ascii="Arial" w:hAnsi="Arial" w:cs="Arial"/>
@@ -950,7 +957,7 @@
           <w:sz w:val="21"/>
           <w:szCs w:val="24"/>
         </w:rPr>
-        <w:t>Nome: {{nome_estudante}}</w:t>
+        <w:t xml:space="preserve">Nome: {{nome_estudante}}                                                                       </w:t>
       </w:r>
       <w:r>
         <w:rPr>
@@ -984,34 +991,40 @@
           <w:sz w:val="21"/>
           <w:szCs w:val="24"/>
         </w:rPr>
-      </w:r>
-      <w:r>
-        <w:rPr>
-          <w:rFonts w:ascii="Arial" w:hAnsi="Arial" w:cs="Arial"/>
-          <w:sz w:val="21"/>
-          <w:szCs w:val="24"/>
-        </w:rPr>
-      </w:r>
-      <w:r>
-        <w:rPr>
-          <w:rFonts w:ascii="Arial" w:hAnsi="Arial" w:cs="Arial"/>
-          <w:sz w:val="21"/>
-          <w:szCs w:val="24"/>
-        </w:rPr>
-      </w:r>
-      <w:r>
-        <w:rPr>
-          <w:rFonts w:ascii="Arial" w:hAnsi="Arial" w:cs="Arial"/>
-          <w:sz w:val="21"/>
-          <w:szCs w:val="24"/>
-        </w:rPr>
-      </w:r>
-      <w:r>
-        <w:rPr>
-          <w:rFonts w:ascii="Arial" w:hAnsi="Arial" w:cs="Arial"/>
-          <w:sz w:val="21"/>
-          <w:szCs w:val="24"/>
-        </w:rPr>
+        <w:tab/>
+      </w:r>
+      <w:r>
+        <w:rPr>
+          <w:rFonts w:ascii="Arial" w:hAnsi="Arial" w:cs="Arial"/>
+          <w:sz w:val="21"/>
+          <w:szCs w:val="24"/>
+        </w:rPr>
+        <w:tab/>
+      </w:r>
+      <w:r>
+        <w:rPr>
+          <w:rFonts w:ascii="Arial" w:hAnsi="Arial" w:cs="Arial"/>
+          <w:sz w:val="21"/>
+          <w:szCs w:val="24"/>
+        </w:rPr>
+        <w:tab/>
+      </w:r>
+      <w:r>
+        <w:rPr>
+          <w:rFonts w:ascii="Arial" w:hAnsi="Arial" w:cs="Arial"/>
+          <w:sz w:val="21"/>
+          <w:szCs w:val="24"/>
+        </w:rPr>
+        <w:tab/>
+      </w:r>
+      <w:r>
+        <w:rPr>
+          <w:rFonts w:ascii="Arial" w:hAnsi="Arial" w:cs="Arial"/>
+          <w:sz w:val="21"/>
+          <w:szCs w:val="24"/>
+        </w:rPr>
+        <w:tab/>
+        <w:t xml:space="preserve"/>
       </w:r>
     </w:p>
     <w:p ns2:paraId="38738D6A" ns2:textId="77777777">
@@ -1033,7 +1046,7 @@
           <w:sz w:val="21"/>
           <w:szCs w:val="24"/>
         </w:rPr>
-        <w:t>Telefone: {{telefone_estudante}}</w:t>
+        <w:t xml:space="preserve">Telefone: {{telefone_estudante}} </w:t>
       </w:r>
       <w:r>
         <w:rPr>
@@ -1081,7 +1094,7 @@
           <w:sz w:val="21"/>
           <w:szCs w:val="24"/>
         </w:rPr>
-        <w:t>Identidade: {{rg}}</w:t>
+        <w:t xml:space="preserve">Identidade: {{rg}}                          </w:t>
       </w:r>
       <w:r>
         <w:rPr>
@@ -1107,20 +1120,24 @@
           <w:sz w:val="21"/>
           <w:szCs w:val="24"/>
         </w:rPr>
-      </w:r>
-      <w:r>
-        <w:rPr>
-          <w:rFonts w:ascii="Arial" w:hAnsi="Arial" w:cs="Arial"/>
-          <w:sz w:val="21"/>
-          <w:szCs w:val="24"/>
-        </w:rPr>
-      </w:r>
-      <w:r>
-        <w:rPr>
-          <w:rFonts w:ascii="Arial" w:hAnsi="Arial" w:cs="Arial"/>
-          <w:sz w:val="21"/>
-          <w:szCs w:val="24"/>
-        </w:rPr>
+        <w:tab/>
+      </w:r>
+      <w:r>
+        <w:rPr>
+          <w:rFonts w:ascii="Arial" w:hAnsi="Arial" w:cs="Arial"/>
+          <w:sz w:val="21"/>
+          <w:szCs w:val="24"/>
+        </w:rPr>
+        <w:tab/>
+      </w:r>
+      <w:r>
+        <w:rPr>
+          <w:rFonts w:ascii="Arial" w:hAnsi="Arial" w:cs="Arial"/>
+          <w:sz w:val="21"/>
+          <w:szCs w:val="24"/>
+        </w:rPr>
+        <w:tab/>
+        <w:t xml:space="preserve"/>
       </w:r>
     </w:p>
     <w:p ns2:paraId="0DA9C47B" ns2:textId="77777777">
@@ -1142,7 +1159,7 @@
           <w:sz w:val="21"/>
           <w:szCs w:val="24"/>
         </w:rPr>
-        <w:t>CPF: {{cpf}}</w:t>
+        <w:t xml:space="preserve">CPF: {{cpf}}     </w:t>
       </w:r>
       <w:r>
         <w:rPr>
@@ -1168,20 +1185,24 @@
           <w:sz w:val="21"/>
           <w:szCs w:val="24"/>
         </w:rPr>
-      </w:r>
-      <w:r>
-        <w:rPr>
-          <w:rFonts w:ascii="Arial" w:hAnsi="Arial" w:cs="Arial"/>
-          <w:sz w:val="21"/>
-          <w:szCs w:val="24"/>
-        </w:rPr>
-      </w:r>
-      <w:r>
-        <w:rPr>
-          <w:rFonts w:ascii="Arial" w:hAnsi="Arial" w:cs="Arial"/>
-          <w:sz w:val="21"/>
-          <w:szCs w:val="24"/>
-        </w:rPr>
+        <w:tab/>
+      </w:r>
+      <w:r>
+        <w:rPr>
+          <w:rFonts w:ascii="Arial" w:hAnsi="Arial" w:cs="Arial"/>
+          <w:sz w:val="21"/>
+          <w:szCs w:val="24"/>
+        </w:rPr>
+        <w:tab/>
+      </w:r>
+      <w:r>
+        <w:rPr>
+          <w:rFonts w:ascii="Arial" w:hAnsi="Arial" w:cs="Arial"/>
+          <w:sz w:val="21"/>
+          <w:szCs w:val="24"/>
+        </w:rPr>
+        <w:tab/>
+        <w:t xml:space="preserve"/>
       </w:r>
     </w:p>
     <w:p ns2:paraId="44E35EED" ns2:textId="77777777">
@@ -1203,7 +1224,7 @@
           <w:sz w:val="21"/>
           <w:szCs w:val="24"/>
         </w:rPr>
-        <w:t>Data de Nascimento: {{data_nascimento}}</w:t>
+        <w:t xml:space="preserve">Data de Nascimento: {{data_nascimento}} </w:t>
       </w:r>
       <w:r>
         <w:rPr>
@@ -1267,14 +1288,15 @@
           <w:sz w:val="21"/>
           <w:szCs w:val="24"/>
         </w:rPr>
-        <w:t>Curso: {{curso}}</w:t>
-      </w:r>
-      <w:r>
-        <w:rPr>
-          <w:rFonts w:ascii="Arial" w:hAnsi="Arial" w:cs="Arial"/>
-          <w:sz w:val="21"/>
-          <w:szCs w:val="24"/>
-        </w:rPr>
+        <w:t xml:space="preserve">Curso: {{curso}}              </w:t>
+      </w:r>
+      <w:r>
+        <w:rPr>
+          <w:rFonts w:ascii="Arial" w:hAnsi="Arial" w:cs="Arial"/>
+          <w:sz w:val="21"/>
+          <w:szCs w:val="24"/>
+        </w:rPr>
+        <w:tab/>
       </w:r>
       <w:r>
         <w:rPr>
@@ -1300,13 +1322,16 @@
           <w:sz w:val="21"/>
           <w:szCs w:val="24"/>
         </w:rPr>
-      </w:r>
-      <w:r>
-        <w:rPr>
-          <w:rFonts w:ascii="Arial" w:hAnsi="Arial" w:cs="Arial"/>
-          <w:sz w:val="21"/>
-          <w:szCs w:val="24"/>
-        </w:rPr>
+        <w:tab/>
+      </w:r>
+      <w:r>
+        <w:rPr>
+          <w:rFonts w:ascii="Arial" w:hAnsi="Arial" w:cs="Arial"/>
+          <w:sz w:val="21"/>
+          <w:szCs w:val="24"/>
+        </w:rPr>
+        <w:tab/>
+        <w:t xml:space="preserve"/>
       </w:r>
     </w:p>
     <w:p ns2:paraId="3EB4DD46" ns2:textId="77777777">
@@ -1328,7 +1353,7 @@
           <w:sz w:val="21"/>
           <w:szCs w:val="24"/>
         </w:rPr>
-        <w:t>Série: {{periodo}}</w:t>
+        <w:t xml:space="preserve">Série: {{periodo}}                         </w:t>
       </w:r>
       <w:r>
         <w:rPr>
@@ -1376,7 +1401,7 @@
           <w:sz w:val="21"/>
           <w:szCs w:val="24"/>
         </w:rPr>
-        <w:t>Matrícula: {{matricula}}</w:t>
+        <w:t xml:space="preserve">Matrícula: {{matricula}}                                      </w:t>
       </w:r>
       <w:r>
         <w:rPr>
@@ -1424,7 +1449,7 @@
           <w:sz w:val="21"/>
           <w:szCs w:val="24"/>
         </w:rPr>
-        <w:t>Turno: {{turno}}</w:t>
+        <w:t xml:space="preserve">Turno: {{turno}}</w:t>
       </w:r>
       <w:r>
         <w:rPr>
@@ -1464,7 +1489,7 @@
           <w:sz w:val="21"/>
           <w:szCs w:val="24"/>
         </w:rPr>
-        <w:t>Endereço: {{endereco_estudante}}</w:t>
+        <w:t xml:space="preserve">Endereço: {{endereco_estudante}}</w:t>
       </w:r>
       <w:r>
         <w:rPr>
@@ -1490,6 +1515,7 @@
           <w:sz w:val="21"/>
           <w:szCs w:val="24"/>
         </w:rPr>
+        <w:tab/>
       </w:r>
     </w:p>
     <w:p ns2:paraId="4BD09452" ns2:textId="77777777">
@@ -1511,7 +1537,7 @@
           <w:sz w:val="21"/>
           <w:szCs w:val="24"/>
         </w:rPr>
-        <w:t>E-mail: {{email_estudante}}</w:t>
+        <w:t xml:space="preserve">E-mail: {{email_estudante}}                              </w:t>
       </w:r>
       <w:r>
         <w:rPr>
@@ -1537,20 +1563,24 @@
           <w:sz w:val="21"/>
           <w:szCs w:val="24"/>
         </w:rPr>
-      </w:r>
-      <w:r>
-        <w:rPr>
-          <w:rFonts w:ascii="Arial" w:hAnsi="Arial" w:cs="Arial"/>
-          <w:sz w:val="21"/>
-          <w:szCs w:val="24"/>
-        </w:rPr>
-      </w:r>
-      <w:r>
-        <w:rPr>
-          <w:rFonts w:ascii="Arial" w:hAnsi="Arial" w:cs="Arial"/>
-          <w:sz w:val="21"/>
-          <w:szCs w:val="24"/>
-        </w:rPr>
+        <w:tab/>
+      </w:r>
+      <w:r>
+        <w:rPr>
+          <w:rFonts w:ascii="Arial" w:hAnsi="Arial" w:cs="Arial"/>
+          <w:sz w:val="21"/>
+          <w:szCs w:val="24"/>
+        </w:rPr>
+        <w:tab/>
+      </w:r>
+      <w:r>
+        <w:rPr>
+          <w:rFonts w:ascii="Arial" w:hAnsi="Arial" w:cs="Arial"/>
+          <w:sz w:val="21"/>
+          <w:szCs w:val="24"/>
+        </w:rPr>
+        <w:tab/>
+        <w:t xml:space="preserve"/>
       </w:r>
     </w:p>
     <w:p ns2:paraId="1BD6EDC6" ns2:textId="77777777">
@@ -1572,7 +1602,7 @@
           <w:sz w:val="21"/>
           <w:szCs w:val="24"/>
         </w:rPr>
-        <w:t>Bairro: {{bairro_estudante}}</w:t>
+        <w:t xml:space="preserve">Bairro: {{bairro_estudante}}                                                                  </w:t>
       </w:r>
       <w:r>
         <w:rPr>
@@ -1623,7 +1653,7 @@
           <w:sz w:val="21"/>
           <w:szCs w:val="24"/>
         </w:rPr>
-        <w:t>Município: {{municipio_estudante}}</w:t>
+        <w:t xml:space="preserve">Município: {{municipio_estudante}}                                       </w:t>
       </w:r>
       <w:r>
         <w:rPr>
@@ -1666,7 +1696,7 @@
           <w:sz w:val="21"/>
           <w:szCs w:val="24"/>
         </w:rPr>
-        <w:t>UF: {{uf_estudante}}</w:t>
+        <w:t xml:space="preserve">UF: {{uf_estudante}}                              </w:t>
       </w:r>
       <w:r>
         <w:rPr>
@@ -1718,7 +1748,7 @@
           <w:sz w:val="21"/>
           <w:szCs w:val="24"/>
         </w:rPr>
-        <w:t>CEP: {{cep_estudante}}</w:t>
+        <w:t xml:space="preserve">CEP: {{cep_estudante}}</w:t>
       </w:r>
       <w:r>
         <w:rPr>
@@ -1746,7 +1776,7 @@
         <w:tabs>
           <w:tab w:val="left" w:pos="0"/>
         </w:tabs>
-        <w:spacing w:before="0" w:after="0" w:line="20" w:lineRule="exact"/>
+        <w:spacing w:before="0" w:after="0" w:line="240" w:lineRule="auto"/>
         <w:jc w:val="both"/>
         <w:rPr>
           <w:rFonts w:ascii="Arial" w:hAnsi="Arial" w:cs="Arial"/>
@@ -1835,7 +1865,7 @@
           <w:sz w:val="21"/>
           <w:szCs w:val="24"/>
         </w:rPr>
-        <w:t>Nome:</w:t>
+        <w:t xml:space="preserve">Nome: </w:t>
       </w:r>
       <w:r>
         <w:rPr>
@@ -1870,7 +1900,7 @@
           <w:sz w:val="21"/>
           <w:szCs w:val="24"/>
         </w:rPr>
-        <w:t>CNPJ/MF n.º</w:t>
+        <w:t xml:space="preserve">CNPJ/MF n.º </w:t>
       </w:r>
       <w:r>
         <w:rPr>
@@ -1886,7 +1916,7 @@
           <w:sz w:val="21"/>
           <w:szCs w:val="24"/>
         </w:rPr>
-        <w:t xml:space="preserve"> -</w:t>
+        <w:t xml:space="preserve"> - </w:t>
       </w:r>
       <w:r>
         <w:rPr>
@@ -1941,7 +1971,8 @@
           <w:szCs w:val="24"/>
           <w:rFonts w:ascii="Arial" w:hAnsi="Arial" w:cs="Arial"/>
         </w:rPr>
-        <w:t>Endereço: Rua Júlio Ferreira Xavier, 2750, Distrito Industrial, Três Lagoas, MS, CEP</w:t>
+        <w:lastRenderedPageBreak/>
+        <w:t xml:space="preserve">Endereço: Rua Júlio Ferreira Xavier, 2750, Distrito Industrial, Três Lagoas, MS, CEP </w:t>
       </w:r>
       <w:r>
         <w:rPr>
@@ -1983,7 +2014,7 @@
           <w:sz w:val="21"/>
           <w:szCs w:val="24"/>
         </w:rPr>
-        <w:t xml:space="preserve"> e</w:t>
+        <w:t xml:space="preserve"> e </w:t>
       </w:r>
       <w:r>
         <w:rPr>
@@ -2018,7 +2049,7 @@
           <w:sz w:val="21"/>
           <w:szCs w:val="24"/>
         </w:rPr>
-        <w:t xml:space="preserve"> -</w:t>
+        <w:t xml:space="preserve"> - </w:t>
       </w:r>
       <w:r>
         <w:rPr>
@@ -2035,6 +2066,7 @@
           <w:sz w:val="21"/>
           <w:szCs w:val="24"/>
         </w:rPr>
+        <w:t xml:space="preserve"> </w:t>
       </w:r>
     </w:p>
     <w:p ns2:paraId="3D69C29B" ns2:textId="4A5821D4">
@@ -2042,7 +2074,7 @@
         <w:tabs>
           <w:tab w:val="left" w:pos="0"/>
         </w:tabs>
-        <w:spacing w:before="0" w:after="0" w:line="20" w:lineRule="exact"/>
+        <w:spacing w:before="0" w:after="0" w:line="240" w:lineRule="auto"/>
         <w:jc w:val="both"/>
         <w:rPr>
           <w:rFonts w:ascii="Arial" w:hAnsi="Arial" w:cs="Arial"/>
@@ -2128,7 +2160,7 @@
           <w:sz w:val="21"/>
           <w:szCs w:val="24"/>
         </w:rPr>
-        <w:t>Vigência do plano de atividade de estágio: {{data_inicio}} a {{data_fim}}</w:t>
+        <w:t xml:space="preserve">Vigência do plano de atividade de estágio: {{data_inicio}} a {{data_fim}}</w:t>
       </w:r>
       <w:r>
         <w:rPr>
@@ -2172,7 +2204,7 @@
           <w:sz w:val="21"/>
           <w:szCs w:val="24"/>
         </w:rPr>
-        <w:t>Horário do estágio (Ex: 8h às 12h - Máx 6h/dia): {{horario}}</w:t>
+        <w:t xml:space="preserve">Horário do estágio (Ex: 8h às 12h - Máx 6h/dia): {{horario}}     </w:t>
       </w:r>
       <w:r>
         <w:rPr>
@@ -2276,7 +2308,7 @@
           <w:sz w:val="21"/>
           <w:szCs w:val="24"/>
         </w:rPr>
-        <w:t>Carga Horária Semanal (Máx 30h/semana): {{carga_horaria}}</w:t>
+        <w:t xml:space="preserve">Carga Horária Semanal (Máx 30h/semana): {{carga_horaria}}                          </w:t>
       </w:r>
       <w:r>
         <w:rPr>
@@ -2350,27 +2382,32 @@
           <w:sz w:val="21"/>
           <w:szCs w:val="24"/>
         </w:rPr>
-      </w:r>
-      <w:r>
-        <w:rPr>
-          <w:rFonts w:ascii="Arial" w:hAnsi="Arial" w:cs="Arial"/>
-          <w:sz w:val="21"/>
-          <w:szCs w:val="24"/>
-        </w:rPr>
-      </w:r>
-      <w:r>
-        <w:rPr>
-          <w:rFonts w:ascii="Arial" w:hAnsi="Arial" w:cs="Arial"/>
-          <w:sz w:val="21"/>
-          <w:szCs w:val="24"/>
-        </w:rPr>
-      </w:r>
-      <w:r>
-        <w:rPr>
-          <w:rFonts w:ascii="Arial" w:hAnsi="Arial" w:cs="Arial"/>
-          <w:sz w:val="21"/>
-          <w:szCs w:val="24"/>
-        </w:rPr>
+        <w:tab/>
+      </w:r>
+      <w:r>
+        <w:rPr>
+          <w:rFonts w:ascii="Arial" w:hAnsi="Arial" w:cs="Arial"/>
+          <w:sz w:val="21"/>
+          <w:szCs w:val="24"/>
+        </w:rPr>
+        <w:tab/>
+      </w:r>
+      <w:r>
+        <w:rPr>
+          <w:rFonts w:ascii="Arial" w:hAnsi="Arial" w:cs="Arial"/>
+          <w:sz w:val="21"/>
+          <w:szCs w:val="24"/>
+        </w:rPr>
+        <w:tab/>
+      </w:r>
+      <w:r>
+        <w:rPr>
+          <w:rFonts w:ascii="Arial" w:hAnsi="Arial" w:cs="Arial"/>
+          <w:sz w:val="21"/>
+          <w:szCs w:val="24"/>
+        </w:rPr>
+        <w:tab/>
+        <w:t xml:space="preserve"/>
       </w:r>
     </w:p>
     <w:p ns2:paraId="46C8F80F" ns2:textId="71D7A472">
@@ -2390,7 +2427,7 @@
           <w:sz w:val="21"/>
           <w:szCs w:val="24"/>
         </w:rPr>
-        <w:t>Setor de Estágio: {{setor_estagio}}</w:t>
+        <w:t xml:space="preserve">Setor de Estágio: {{setor_estagio}}                                                                            </w:t>
       </w:r>
       <w:r>
         <w:rPr>
@@ -2450,7 +2487,7 @@
           <w:sz w:val="21"/>
           <w:szCs w:val="24"/>
         </w:rPr>
-        <w:t>Bolsa-auxílio: {{bolsa_auxilio}}</w:t>
+        <w:t xml:space="preserve">Bolsa-auxílio: {{bolsa_auxilio}}              </w:t>
       </w:r>
     </w:p>
     <w:p ns2:paraId="31016419" ns2:textId="685C2CB7">
@@ -2470,7 +2507,7 @@
           <w:sz w:val="21"/>
           <w:szCs w:val="24"/>
         </w:rPr>
-        <w:t>Auxílio-transporte: {{auxilio_transporte}}</w:t>
+        <w:t xml:space="preserve">Auxílio-transporte: {{auxilio_transporte}}</w:t>
       </w:r>
       <w:r>
         <w:rPr>
@@ -2506,7 +2543,7 @@
           <w:sz w:val="21"/>
           <w:szCs w:val="24"/>
         </w:rPr>
-        <w:t>Vale-transporte: {{vale_transporte_x}}</w:t>
+        <w:t xml:space="preserve">Vale-transporte: {{vale_transporte_x}}  </w:t>
       </w:r>
       <w:r>
         <w:rPr>
@@ -2574,7 +2611,7 @@
           <w:sz w:val="21"/>
           <w:szCs w:val="24"/>
         </w:rPr>
-        <w:t>Transporte da Empresa: {{transporte_empresa_x}}</w:t>
+        <w:t xml:space="preserve">Transporte da Empresa: {{transporte_empresa_x}}     </w:t>
       </w:r>
       <w:r>
         <w:rPr>
@@ -2634,7 +2671,7 @@
           <w:sz w:val="21"/>
           <w:szCs w:val="24"/>
         </w:rPr>
-        <w:t>Outros: {{outros_transporte_x}}</w:t>
+        <w:t xml:space="preserve">Outros: {{outros_transporte_x}}</w:t>
       </w:r>
       <w:r>
         <w:rPr>
@@ -2663,7 +2700,7 @@
           <w:sz w:val="21"/>
           <w:szCs w:val="24"/>
         </w:rPr>
-        <w:t>Outro(s) benefício(s) (se tiver): {{beneficios}}</w:t>
+        <w:t xml:space="preserve">Outro(s) benefício(s) (se tiver): {{beneficios}}                </w:t>
       </w:r>
       <w:r>
         <w:rPr>
@@ -2712,11 +2749,13 @@
           <w:sz w:val="21"/>
           <w:szCs w:val="24"/>
         </w:rPr>
+        <w:tab/>
+        <w:t xml:space="preserve"/>
       </w:r>
     </w:p>
     <w:p ns2:paraId="25A312C9" ns2:textId="2A2E3E4A">
       <w:pPr>
-        <w:spacing w:before="0" w:after="0" w:line="20" w:lineRule="exact"/>
+        <w:spacing w:before="0" w:after="0" w:line="240" w:lineRule="auto"/>
         <w:ind w:left="15" w:right="0"/>
         <w:jc w:val="both"/>
         <w:rPr>
@@ -2732,6 +2771,7 @@
           <w:sz w:val="21"/>
           <w:szCs w:val="24"/>
         </w:rPr>
+        <w:t xml:space="preserve">                                                           </w:t>
       </w:r>
     </w:p>
     <w:p ns2:paraId="7C1466AF" ns2:textId="09541DA6">
@@ -2750,7 +2790,7 @@
           <w:sz w:val="21"/>
           <w:szCs w:val="24"/>
         </w:rPr>
-        <w:t>Descrição das atividades a serem desempenhadas pelo estagiário:</w:t>
+        <w:t xml:space="preserve">Descrição das atividades a serem desempenhadas pelo estagiário: </w:t>
       </w:r>
       <w:r>
         <w:rPr>
@@ -2923,12 +2963,12 @@
           <w:sz w:val="21"/>
           <w:szCs w:val="24"/>
         </w:rPr>
-        <w:t>{{atividades}}</w:t>
+        <w:t xml:space="preserve">{{atividades}}</w:t>
       </w:r>
     </w:p>
     <w:p ns2:paraId="4510187F" ns2:textId="1588A465">
       <w:pPr>
-        <w:spacing w:before="0" w:after="0" w:line="20" w:lineRule="exact"/>
+        <w:spacing w:before="0" w:after="0" w:line="240" w:lineRule="auto"/>
         <w:ind w:left="0"/>
         <w:rPr>
           <w:rFonts w:ascii="Arial" w:hAnsi="Arial" w:cs="Arial"/>
@@ -3036,13 +3076,15 @@
           <w:sz w:val="21"/>
           <w:szCs w:val="24"/>
         </w:rPr>
-      </w:r>
-      <w:r>
-        <w:rPr>
-          <w:rFonts w:ascii="Arial" w:hAnsi="Arial" w:cs="Arial"/>
-          <w:sz w:val="21"/>
-          <w:szCs w:val="24"/>
-        </w:rPr>
+        <w:tab/>
+      </w:r>
+      <w:r>
+        <w:rPr>
+          <w:rFonts w:ascii="Arial" w:hAnsi="Arial" w:cs="Arial"/>
+          <w:sz w:val="21"/>
+          <w:szCs w:val="24"/>
+        </w:rPr>
+        <w:tab/>
       </w:r>
     </w:p>
     <w:p ns2:paraId="378A2959" ns2:textId="10D19FA9">
@@ -3062,7 +3104,7 @@
           <w:sz w:val="21"/>
           <w:szCs w:val="24"/>
         </w:rPr>
-        <w:t>(</w:t>
+        <w:t xml:space="preserve">(  </w:t>
       </w:r>
       <w:proofErr w:type="gramEnd"/>
       <w:r>
@@ -3071,6 +3113,7 @@
           <w:sz w:val="21"/>
           <w:szCs w:val="24"/>
         </w:rPr>
+        <w:t xml:space="preserve"> </w:t>
       </w:r>
       <w:r>
         <w:rPr>
@@ -3102,7 +3145,7 @@
     </w:p>
     <w:p ns2:paraId="57C7582D" ns2:textId="7F69250A">
       <w:pPr>
-        <w:spacing w:before="0" w:after="0" w:line="20" w:lineRule="exact"/>
+        <w:spacing w:before="0" w:after="0" w:line="240" w:lineRule="auto"/>
         <w:rPr>
           <w:rFonts w:ascii="Arial" w:hAnsi="Arial" w:cs="Arial"/>
           <w:sz w:val="24"/>
@@ -3202,7 +3245,7 @@
         <w:tabs>
           <w:tab w:val="left" w:pos="9811"/>
         </w:tabs>
-        <w:spacing w:before="0" w:after="0" w:line="20" w:lineRule="exact"/>
+        <w:spacing w:before="0" w:after="0" w:line="240" w:lineRule="auto"/>
         <w:ind w:left="30"/>
         <w:jc w:val="right"/>
         <w:rPr>
@@ -3217,7 +3260,7 @@
         <w:tabs>
           <w:tab w:val="left" w:pos="9811"/>
         </w:tabs>
-        <w:spacing w:before="0" w:after="0" w:line="20" w:lineRule="exact"/>
+        <w:spacing w:before="0" w:after="0" w:line="240" w:lineRule="auto"/>
         <w:ind w:left="30"/>
         <w:jc w:val="right"/>
         <w:rPr>
@@ -3232,7 +3275,7 @@
         <w:tabs>
           <w:tab w:val="left" w:pos="9811"/>
         </w:tabs>
-        <w:spacing w:before="0" w:after="0" w:line="20" w:lineRule="exact"/>
+        <w:spacing w:before="0" w:after="0" w:line="240" w:lineRule="auto"/>
         <w:ind w:left="30"/>
         <w:jc w:val="right"/>
         <w:rPr>
@@ -3247,7 +3290,7 @@
         <w:tabs>
           <w:tab w:val="left" w:pos="9811"/>
         </w:tabs>
-        <w:spacing w:before="0" w:after="0" w:line="20" w:lineRule="exact"/>
+        <w:spacing w:before="0" w:after="0" w:line="240" w:lineRule="auto"/>
         <w:ind w:left="30"/>
         <w:jc w:val="right"/>
         <w:rPr>
@@ -3288,7 +3331,7 @@
           <w:sz w:val="21"/>
           <w:szCs w:val="24"/>
         </w:rPr>
-        <w:t xml:space="preserve"> XX (dia)</w:t>
+        <w:t xml:space="preserve"> XX (dia) </w:t>
       </w:r>
       <w:r>
         <w:rPr>
@@ -3297,7 +3340,7 @@
           <w:sz w:val="21"/>
           <w:szCs w:val="24"/>
         </w:rPr>
-        <w:t>de</w:t>
+        <w:t xml:space="preserve">de </w:t>
       </w:r>
       <w:r>
         <w:rPr>
@@ -3306,7 +3349,7 @@
           <w:sz w:val="21"/>
           <w:szCs w:val="24"/>
         </w:rPr>
-        <w:t>XX (Mês)</w:t>
+        <w:t xml:space="preserve">XX (Mês) </w:t>
       </w:r>
       <w:r>
         <w:rPr>
@@ -3315,7 +3358,7 @@
           <w:sz w:val="21"/>
           <w:szCs w:val="24"/>
         </w:rPr>
-        <w:t>de</w:t>
+        <w:t xml:space="preserve">de </w:t>
       </w:r>
       <w:r>
         <w:rPr>
@@ -3333,7 +3376,7 @@
           <w:sz w:val="21"/>
           <w:szCs w:val="24"/>
         </w:rPr>
-        <w:t>.</w:t>
+        <w:t xml:space="preserve">.  </w:t>
       </w:r>
     </w:p>
     <w:p ns2:paraId="5F0B9354" ns2:textId="77777777">
@@ -3341,7 +3384,7 @@
         <w:tabs>
           <w:tab w:val="left" w:pos="9639"/>
         </w:tabs>
-        <w:spacing w:before="0" w:after="0" w:line="20" w:lineRule="exact"/>
+        <w:spacing w:before="0" w:after="0" w:line="240" w:lineRule="auto"/>
         <w:ind w:left="0" w:right="283"/>
         <w:jc w:val="right"/>
         <w:rPr>
@@ -3353,7 +3396,7 @@
     </w:p>
     <w:p ns2:paraId="2C83DF85" ns2:textId="4B8756EB">
       <w:pPr>
-        <w:spacing w:before="0" w:after="0" w:line="20" w:lineRule="exact"/>
+        <w:spacing w:before="0" w:after="0" w:line="240" w:lineRule="auto"/>
         <w:rPr>
           <w:rFonts w:ascii="Arial" w:hAnsi="Arial" w:cs="Arial"/>
           <w:sz w:val="24"/>
@@ -3363,7 +3406,7 @@
     </w:p>
     <w:p ns2:paraId="221E616B" ns2:textId="028C1CDE">
       <w:pPr>
-        <w:spacing w:before="0" w:after="0" w:line="20" w:lineRule="exact"/>
+        <w:spacing w:before="0" w:after="0" w:line="240" w:lineRule="auto"/>
         <w:rPr>
           <w:rFonts w:ascii="Arial" w:hAnsi="Arial" w:cs="Arial"/>
           <w:sz w:val="24"/>
@@ -3373,7 +3416,7 @@
     </w:p>
     <w:p ns2:paraId="543C1FB4" ns2:textId="219918EE">
       <w:pPr>
-        <w:spacing w:before="0" w:after="0" w:line="20" w:lineRule="exact"/>
+        <w:spacing w:before="0" w:after="0" w:line="240" w:lineRule="auto"/>
         <w:rPr>
           <w:rFonts w:ascii="Arial" w:hAnsi="Arial" w:cs="Arial"/>
           <w:sz w:val="24"/>
@@ -3383,7 +3426,7 @@
     </w:p>
     <w:p ns2:paraId="095E3975" ns2:textId="77777777">
       <w:pPr>
-        <w:spacing w:before="0" w:after="0" w:line="20" w:lineRule="exact"/>
+        <w:spacing w:before="0" w:after="0" w:line="240" w:lineRule="auto"/>
         <w:rPr>
           <w:rFonts w:ascii="Arial" w:hAnsi="Arial" w:cs="Arial"/>
           <w:sz w:val="24"/>
@@ -3393,7 +3436,7 @@
     </w:p>
     <w:p ns2:paraId="50452965" ns2:textId="0851E44E">
       <w:pPr>
-        <w:spacing w:before="0" w:after="0" w:line="20" w:lineRule="exact"/>
+        <w:spacing w:before="0" w:after="0" w:line="240" w:lineRule="auto"/>
         <w:rPr>
           <w:rFonts w:ascii="Arial" w:hAnsi="Arial" w:cs="Arial"/>
           <w:sz w:val="24"/>
@@ -3437,12 +3480,12 @@
           <w:sz w:val="21"/>
           <w:szCs w:val="24"/>
         </w:rPr>
-        <w:t>Supervisor de Estágio da Unidade Concedente de Estágio</w:t>
+        <w:t xml:space="preserve">Supervisor de Estágio da Unidade Concedente de Estágio                                                                                   </w:t>
       </w:r>
     </w:p>
     <w:p ns2:paraId="7C014B72" ns2:textId="77777777">
       <w:pPr>
-        <w:spacing w:before="0" w:after="0" w:line="20" w:lineRule="exact"/>
+        <w:spacing w:before="0" w:after="0" w:line="240" w:lineRule="auto"/>
         <w:ind w:right="0"/>
         <w:rPr>
           <w:rFonts w:ascii="Arial" w:hAnsi="Arial" w:cs="Arial"/>
@@ -3453,7 +3496,7 @@
     </w:p>
     <w:p ns2:paraId="58B8543E" ns2:textId="1CC96C6A">
       <w:pPr>
-        <w:spacing w:before="0" w:after="0" w:line="20" w:lineRule="exact"/>
+        <w:spacing w:before="0" w:after="0" w:line="240" w:lineRule="auto"/>
         <w:ind w:right="0"/>
         <w:rPr>
           <w:rFonts w:ascii="Arial" w:hAnsi="Arial" w:cs="Arial"/>
@@ -3464,7 +3507,7 @@
     </w:p>
     <w:p ns2:paraId="7650CFE2" ns2:textId="502F2F96">
       <w:pPr>
-        <w:spacing w:before="0" w:after="0" w:line="20" w:lineRule="exact"/>
+        <w:spacing w:before="0" w:after="0" w:line="240" w:lineRule="auto"/>
         <w:ind w:right="0"/>
         <w:rPr>
           <w:rFonts w:ascii="Arial" w:hAnsi="Arial" w:cs="Arial"/>
@@ -3475,7 +3518,7 @@
     </w:p>
     <w:p ns2:paraId="3D416708" ns2:textId="77777777">
       <w:pPr>
-        <w:spacing w:before="0" w:after="0" w:line="20" w:lineRule="exact"/>
+        <w:spacing w:before="0" w:after="0" w:line="240" w:lineRule="auto"/>
         <w:ind w:right="0"/>
         <w:rPr>
           <w:rFonts w:ascii="Arial" w:hAnsi="Arial" w:cs="Arial"/>
@@ -3486,7 +3529,7 @@
     </w:p>
     <w:p ns2:paraId="3284A3DE" ns2:textId="77777777">
       <w:pPr>
-        <w:spacing w:before="0" w:after="0" w:line="20" w:lineRule="exact"/>
+        <w:spacing w:before="0" w:after="0" w:line="240" w:lineRule="auto"/>
         <w:ind w:right="0"/>
         <w:rPr>
           <w:rFonts w:ascii="Arial" w:hAnsi="Arial" w:cs="Arial"/>
@@ -3511,7 +3554,7 @@
           <w:sz w:val="21"/>
           <w:szCs w:val="24"/>
         </w:rPr>
-        <w:t>____________________________________</w:t>
+        <w:t xml:space="preserve">____________________________________                                               </w:t>
       </w:r>
     </w:p>
     <w:p ns2:paraId="062B9575" ns2:textId="77777777">
@@ -3536,7 +3579,7 @@
     </w:p>
     <w:p ns2:paraId="51116140" ns2:textId="77777777">
       <w:pPr>
-        <w:spacing w:before="0" w:after="0" w:line="20" w:lineRule="exact"/>
+        <w:spacing w:before="0" w:after="0" w:line="240" w:lineRule="auto"/>
         <w:ind w:right="0"/>
         <w:rPr>
           <w:rFonts w:ascii="Arial" w:hAnsi="Arial" w:cs="Arial"/>
@@ -3547,7 +3590,7 @@
     </w:p>
     <w:p ns2:paraId="22CCB37C" ns2:textId="77777777">
       <w:pPr>
-        <w:spacing w:before="0" w:after="0" w:line="20" w:lineRule="exact"/>
+        <w:spacing w:before="0" w:after="0" w:line="240" w:lineRule="auto"/>
         <w:ind w:right="0"/>
         <w:rPr>
           <w:rFonts w:ascii="Arial" w:hAnsi="Arial" w:cs="Arial"/>
@@ -3558,7 +3601,7 @@
     </w:p>
     <w:p ns2:paraId="220E70B8" ns2:textId="4F25E514">
       <w:pPr>
-        <w:spacing w:before="0" w:after="0" w:line="20" w:lineRule="exact"/>
+        <w:spacing w:before="0" w:after="0" w:line="240" w:lineRule="auto"/>
         <w:ind w:right="0"/>
         <w:rPr>
           <w:rFonts w:ascii="Arial" w:hAnsi="Arial" w:cs="Arial"/>
@@ -3570,7 +3613,7 @@
     </w:p>
     <w:p ns2:paraId="7BD20A53" ns2:textId="77777777">
       <w:pPr>
-        <w:spacing w:before="0" w:after="0" w:line="20" w:lineRule="exact"/>
+        <w:spacing w:before="0" w:after="0" w:line="240" w:lineRule="auto"/>
         <w:ind w:right="0"/>
         <w:rPr>
           <w:rFonts w:ascii="Arial" w:hAnsi="Arial" w:cs="Arial"/>
@@ -3582,7 +3625,7 @@
     </w:p>
     <w:p ns2:paraId="6DA0E2F1" ns2:textId="77777777">
       <w:pPr>
-        <w:spacing w:before="0" w:after="0" w:line="20" w:lineRule="exact"/>
+        <w:spacing w:before="0" w:after="0" w:line="240" w:lineRule="auto"/>
         <w:ind w:right="0"/>
         <w:rPr>
           <w:rFonts w:ascii="Arial" w:hAnsi="Arial" w:cs="Arial"/>
@@ -3633,7 +3676,7 @@
     </w:p>
     <w:p ns2:paraId="35187AC2" ns2:textId="77777777">
       <w:pPr>
-        <w:spacing w:before="0" w:after="0" w:line="20" w:lineRule="exact"/>
+        <w:spacing w:before="0" w:after="0" w:line="240" w:lineRule="auto"/>
       </w:pPr>
     </w:p>
     <w:sectPr>

</xml_diff>

<commit_message>
Organiza campos do termo e plano em colunas
</commit_message>
<xml_diff>
--- a/models/plano-atividades-estagio-aems.docx
+++ b/models/plano-atividades-estagio-aems.docx
@@ -326,542 +326,146 @@
       <w:pPr>
         <w:pStyle w:val="Corpodetexto"/>
         <w:tabs>
-          <w:tab w:val="left" w:pos="0"/>
-          <w:tab w:val="left" w:pos="1620"/>
-          <w:tab w:val="left" w:pos="2520"/>
-          <w:tab w:val="left" w:pos="4320"/>
-          <w:tab w:val="left" w:pos="4500"/>
+          <w:tab w:pos="5544" w:val="left"/>
         </w:tabs>
         <w:spacing w:after="0" w:before="0" w:line="240" w:lineRule="auto"/>
-        <w:rPr>
-          <w:rFonts w:ascii="Arial" w:hAnsi="Arial" w:cs="Arial"/>
-          <w:sz w:val="24"/>
-          <w:szCs w:val="24"/>
-        </w:rPr>
-      </w:pPr>
-      <w:r>
-        <w:rPr>
-          <w:rFonts w:ascii="Arial" w:hAnsi="Arial" w:cs="Arial"/>
-          <w:sz w:val="21"/>
-          <w:szCs w:val="24"/>
-        </w:rPr>
-        <w:t xml:space="preserve">Razão social: </w:t>
-      </w:r>
-      <w:r>
-        <w:rPr>
-          <w:rFonts w:ascii="Arial" w:hAnsi="Arial" w:cs="Arial"/>
-          <w:b/>
-          <w:bCs/>
-          <w:sz w:val="21"/>
-          <w:szCs w:val="24"/>
-        </w:rPr>
-        <w:t>{{razao_social}}</w:t>
+        <w:jc w:val="left"/>
+        <w:rPr>
+          <w:rFonts w:ascii="Arial" w:hAnsi="Arial" w:cs="Arial"/>
+          <w:sz w:val="24"/>
+          <w:szCs w:val="24"/>
+        </w:rPr>
+      </w:pPr>
+      <w:r>
+        <w:rPr>
+          <w:rFonts w:ascii="Arial" w:hAnsi="Arial"/>
+          <w:sz w:val="21"/>
+        </w:rPr>
+        <w:t>Razão social: {{razao_social}}</w:t>
       </w:r>
     </w:p>
     <w:p ns2:paraId="45DA5538" ns2:textId="77777777">
       <w:pPr>
         <w:pStyle w:val="Corpodetexto"/>
         <w:tabs>
-          <w:tab w:val="left" w:pos="0"/>
-          <w:tab w:val="left" w:pos="1620"/>
-          <w:tab w:val="left" w:pos="2520"/>
-          <w:tab w:val="left" w:pos="4320"/>
-          <w:tab w:val="left" w:pos="4500"/>
+          <w:tab w:pos="5544" w:val="left"/>
         </w:tabs>
         <w:spacing w:after="0" w:before="0" w:line="240" w:lineRule="auto"/>
-        <w:rPr>
-          <w:rFonts w:ascii="Arial" w:hAnsi="Arial" w:cs="Arial"/>
-          <w:sz w:val="24"/>
-          <w:szCs w:val="24"/>
-        </w:rPr>
-      </w:pPr>
-      <w:r>
-        <w:rPr>
-          <w:rFonts w:ascii="Arial" w:hAnsi="Arial" w:cs="Arial"/>
-          <w:sz w:val="21"/>
-          <w:szCs w:val="24"/>
-        </w:rPr>
-        <w:t>CNPJ:</w:t>
-      </w:r>
-      <w:r>
-        <w:rPr>
-          <w:rFonts w:ascii="Arial" w:hAnsi="Arial" w:cs="Arial"/>
-          <w:sz w:val="21"/>
-          <w:szCs w:val="24"/>
-        </w:rPr>
-        <w:t xml:space="preserve"> </w:t>
-      </w:r>
-      <w:r>
-        <w:rPr>
-          <w:rFonts w:ascii="Arial" w:hAnsi="Arial" w:cs="Arial"/>
-          <w:b/>
-          <w:bCs/>
-          <w:sz w:val="21"/>
-          <w:szCs w:val="24"/>
-        </w:rPr>
-        <w:t>{{cnpj}}</w:t>
-      </w:r>
-      <w:r>
-        <w:rPr>
-          <w:rFonts w:ascii="Arial" w:hAnsi="Arial" w:cs="Arial"/>
-          <w:sz w:val="21"/>
-          <w:szCs w:val="24"/>
-        </w:rPr>
+        <w:jc w:val="left"/>
+        <w:rPr>
+          <w:rFonts w:ascii="Arial" w:hAnsi="Arial" w:cs="Arial"/>
+          <w:sz w:val="24"/>
+          <w:szCs w:val="24"/>
+        </w:rPr>
+      </w:pPr>
+      <w:r>
+        <w:rPr>
+          <w:rFonts w:ascii="Arial" w:hAnsi="Arial"/>
+          <w:sz w:val="21"/>
+        </w:rPr>
+        <w:t>CNPJ: {{cnpj}}</w:t>
         <w:tab/>
-      </w:r>
-      <w:r>
-        <w:rPr>
-          <w:rFonts w:ascii="Arial" w:hAnsi="Arial" w:cs="Arial"/>
-          <w:sz w:val="21"/>
-          <w:szCs w:val="24"/>
-        </w:rPr>
+        <w:t>Telefone: {{telefone_empresa}}</w:t>
+      </w:r>
+    </w:p>
+    <w:p ns2:paraId="64042C85" ns2:textId="77777777">
+      <w:pPr>
+        <w:pStyle w:val="Corpodetexto"/>
+        <w:tabs>
+          <w:tab w:pos="5544" w:val="left"/>
+        </w:tabs>
+        <w:spacing w:after="0" w:before="0" w:line="240" w:lineRule="auto"/>
+        <w:jc w:val="left"/>
+        <w:rPr>
+          <w:rFonts w:ascii="Arial" w:hAnsi="Arial" w:cs="Arial"/>
+          <w:sz w:val="24"/>
+          <w:szCs w:val="24"/>
+        </w:rPr>
+      </w:pPr>
+      <w:r>
+        <w:rPr>
+          <w:rFonts w:ascii="Arial" w:hAnsi="Arial"/>
+          <w:sz w:val="21"/>
+        </w:rPr>
+        <w:t>Ramo de atividade: {{ramo_atividade}}</w:t>
         <w:tab/>
-      </w:r>
-      <w:r>
-        <w:rPr>
-          <w:rFonts w:ascii="Arial" w:hAnsi="Arial" w:cs="Arial"/>
-          <w:sz w:val="21"/>
-          <w:szCs w:val="24"/>
-        </w:rPr>
+        <w:t>E-mail: {{email_empresa}}</w:t>
+      </w:r>
+    </w:p>
+    <w:p ns2:paraId="0F2CC8BB" ns2:textId="77777777">
+      <w:pPr>
+        <w:pStyle w:val="Corpodetexto"/>
+        <w:tabs>
+          <w:tab w:pos="5544" w:val="left"/>
+        </w:tabs>
+        <w:spacing w:after="0" w:before="0" w:line="240" w:lineRule="auto"/>
+        <w:jc w:val="left"/>
+        <w:rPr>
+          <w:rFonts w:ascii="Arial" w:hAnsi="Arial" w:cs="Arial"/>
+          <w:sz w:val="24"/>
+          <w:szCs w:val="24"/>
+        </w:rPr>
+      </w:pPr>
+      <w:r>
+        <w:rPr>
+          <w:rFonts w:ascii="Arial" w:hAnsi="Arial"/>
+          <w:sz w:val="21"/>
+        </w:rPr>
+        <w:t>Endereço: {{endereco_empresa}}</w:t>
+      </w:r>
+    </w:p>
+    <w:p ns2:paraId="441D5C50" ns2:textId="77777777">
+      <w:pPr>
+        <w:pStyle w:val="Corpodetexto"/>
+        <w:tabs>
+          <w:tab w:pos="3384" w:val="left"/>
+          <w:tab w:pos="5688" w:val="left"/>
+          <w:tab w:pos="7272" w:val="left"/>
+        </w:tabs>
+        <w:spacing w:after="0" w:before="0" w:line="240" w:lineRule="auto"/>
+        <w:jc w:val="left"/>
+        <w:rPr>
+          <w:rFonts w:ascii="Arial" w:hAnsi="Arial" w:cs="Arial"/>
+          <w:sz w:val="24"/>
+          <w:szCs w:val="24"/>
+        </w:rPr>
+      </w:pPr>
+      <w:r>
+        <w:rPr>
+          <w:rFonts w:ascii="Arial" w:hAnsi="Arial"/>
+          <w:sz w:val="21"/>
+        </w:rPr>
+        <w:t>Bairro: {{bairro_empresa}}</w:t>
         <w:tab/>
-      </w:r>
-    </w:p>
-    <w:p ns2:paraId="64042C85" ns2:textId="77777777">
+        <w:t>Município: {{municipio_empresa}}</w:t>
+        <w:tab/>
+        <w:t>UF: {{uf_empresa}}</w:t>
+        <w:tab/>
+        <w:t>CEP: {{cep_empresa}}</w:t>
+      </w:r>
+    </w:p>
+    <w:p ns2:paraId="356B539D" ns2:textId="77777777">
       <w:pPr>
         <w:pStyle w:val="Corpodetexto"/>
         <w:tabs>
-          <w:tab w:val="left" w:pos="0"/>
-          <w:tab w:val="left" w:pos="1620"/>
-          <w:tab w:val="left" w:pos="2520"/>
-          <w:tab w:val="left" w:pos="4320"/>
-          <w:tab w:val="left" w:pos="4500"/>
+          <w:tab w:pos="5544" w:val="left"/>
         </w:tabs>
         <w:spacing w:after="0" w:before="0" w:line="240" w:lineRule="auto"/>
-        <w:rPr>
-          <w:rFonts w:ascii="Arial" w:hAnsi="Arial" w:cs="Arial"/>
-          <w:sz w:val="24"/>
-          <w:szCs w:val="24"/>
-        </w:rPr>
-      </w:pPr>
-      <w:r>
-        <w:rPr>
-          <w:rFonts w:ascii="Arial" w:hAnsi="Arial" w:cs="Arial"/>
-          <w:sz w:val="21"/>
-          <w:szCs w:val="24"/>
-        </w:rPr>
-        <w:t xml:space="preserve">Telefone: {{telefone_empresa}}        </w:t>
-      </w:r>
-      <w:r>
-        <w:rPr>
-          <w:rFonts w:ascii="Arial" w:hAnsi="Arial" w:cs="Arial"/>
-          <w:sz w:val="21"/>
-          <w:szCs w:val="24"/>
-        </w:rPr>
-        <w:t xml:space="preserve"/>
-      </w:r>
-      <w:r>
-        <w:rPr>
-          <w:rFonts w:ascii="Arial" w:hAnsi="Arial" w:cs="Arial"/>
-          <w:b/>
-          <w:bCs/>
-          <w:sz w:val="21"/>
-          <w:szCs w:val="24"/>
-        </w:rPr>
-        <w:t/>
-      </w:r>
-      <w:r>
-        <w:rPr>
-          <w:rFonts w:ascii="Arial" w:hAnsi="Arial" w:cs="Arial"/>
-          <w:sz w:val="21"/>
-          <w:szCs w:val="24"/>
-        </w:rPr>
-        <w:t xml:space="preserve"/>
-      </w:r>
-    </w:p>
-    <w:p ns2:paraId="0F2CC8BB" ns2:textId="77777777">
-      <w:pPr>
-        <w:pStyle w:val="Corpodetexto"/>
-        <w:tabs>
-          <w:tab w:val="left" w:pos="0"/>
-          <w:tab w:val="left" w:pos="1620"/>
-          <w:tab w:val="left" w:pos="2520"/>
-          <w:tab w:val="left" w:pos="4320"/>
-          <w:tab w:val="left" w:pos="4500"/>
-        </w:tabs>
-        <w:spacing w:after="0" w:before="0" w:line="240" w:lineRule="auto"/>
-        <w:rPr>
-          <w:rFonts w:ascii="Arial" w:hAnsi="Arial" w:cs="Arial"/>
-          <w:sz w:val="24"/>
-          <w:szCs w:val="24"/>
-        </w:rPr>
-      </w:pPr>
-      <w:r>
-        <w:rPr>
-          <w:rFonts w:ascii="Arial" w:hAnsi="Arial" w:cs="Arial"/>
-          <w:sz w:val="21"/>
-          <w:szCs w:val="24"/>
-        </w:rPr>
-        <w:t xml:space="preserve">Ramo de atividade: {{ramo_atividade}}                                                                                 </w:t>
-      </w:r>
-      <w:r>
-        <w:rPr>
-          <w:rFonts w:ascii="Arial" w:hAnsi="Arial" w:cs="Arial"/>
-          <w:b/>
-          <w:bCs/>
-          <w:sz w:val="21"/>
-          <w:szCs w:val="24"/>
-        </w:rPr>
-        <w:t/>
-      </w:r>
-      <w:r>
-        <w:rPr>
-          <w:rFonts w:ascii="Arial" w:hAnsi="Arial" w:cs="Arial"/>
-          <w:sz w:val="21"/>
-          <w:szCs w:val="24"/>
-        </w:rPr>
-        <w:t xml:space="preserve"/>
-      </w:r>
-    </w:p>
-    <w:p ns2:paraId="441D5C50" ns2:textId="77777777">
-      <w:pPr>
-        <w:pStyle w:val="Corpodetexto"/>
-        <w:tabs>
-          <w:tab w:val="left" w:pos="0"/>
-          <w:tab w:val="left" w:pos="1620"/>
-          <w:tab w:val="left" w:pos="2520"/>
-          <w:tab w:val="left" w:pos="4320"/>
-          <w:tab w:val="left" w:pos="4500"/>
-        </w:tabs>
-        <w:spacing w:after="0" w:before="0" w:line="240" w:lineRule="auto"/>
-        <w:rPr>
-          <w:rFonts w:ascii="Arial" w:hAnsi="Arial" w:cs="Arial"/>
-          <w:sz w:val="24"/>
-          <w:szCs w:val="24"/>
-        </w:rPr>
-      </w:pPr>
-      <w:r>
-        <w:rPr>
-          <w:rFonts w:ascii="Arial" w:hAnsi="Arial" w:cs="Arial"/>
-          <w:sz w:val="21"/>
-          <w:szCs w:val="24"/>
-        </w:rPr>
-        <w:t xml:space="preserve">E-mail: {{email_empresa}}</w:t>
-      </w:r>
-      <w:r>
-        <w:rPr>
-          <w:rFonts w:ascii="Arial" w:hAnsi="Arial" w:cs="Arial"/>
-          <w:sz w:val="21"/>
-          <w:szCs w:val="24"/>
-        </w:rPr>
-        <w:t xml:space="preserve"/>
-      </w:r>
-      <w:r>
-        <w:rPr>
-          <w:rFonts w:ascii="Arial" w:hAnsi="Arial" w:cs="Arial"/>
-          <w:b/>
-          <w:bCs/>
-          <w:sz w:val="21"/>
-          <w:szCs w:val="24"/>
-        </w:rPr>
-        <w:t/>
-      </w:r>
-    </w:p>
-    <w:p ns2:paraId="356B539D" ns2:textId="77777777">
-      <w:pPr>
-        <w:pStyle w:val="Corpodetexto"/>
-        <w:tabs>
-          <w:tab w:val="left" w:pos="0"/>
-          <w:tab w:val="left" w:pos="1620"/>
-          <w:tab w:val="left" w:pos="2520"/>
-          <w:tab w:val="left" w:pos="4320"/>
-          <w:tab w:val="left" w:pos="4500"/>
-        </w:tabs>
-        <w:spacing w:after="0" w:before="0" w:line="240" w:lineRule="auto"/>
-        <w:rPr>
-          <w:rFonts w:ascii="Arial" w:hAnsi="Arial" w:cs="Arial"/>
-          <w:sz w:val="24"/>
-          <w:szCs w:val="24"/>
-        </w:rPr>
-      </w:pPr>
-      <w:r>
-        <w:rPr>
-          <w:rFonts w:ascii="Arial" w:hAnsi="Arial" w:cs="Arial"/>
-          <w:sz w:val="21"/>
-          <w:szCs w:val="24"/>
-        </w:rPr>
-        <w:t xml:space="preserve">Endereço: {{endereco_empresa}}  </w:t>
-      </w:r>
-      <w:r>
-        <w:rPr>
-          <w:rFonts w:ascii="Arial" w:hAnsi="Arial" w:cs="Arial"/>
-          <w:b/>
-          <w:bCs/>
-          <w:sz w:val="21"/>
-          <w:szCs w:val="24"/>
-        </w:rPr>
-        <w:t/>
-      </w:r>
-      <w:r>
-        <w:rPr>
-          <w:rFonts w:ascii="Arial" w:hAnsi="Arial" w:cs="Arial"/>
-          <w:b/>
-          <w:bCs/>
-          <w:color w:val="000000"/>
-          <w:sz w:val="21"/>
-          <w:szCs w:val="24"/>
-        </w:rPr>
-      </w:r>
-      <w:r>
-        <w:rPr>
-          <w:rFonts w:ascii="Arial" w:hAnsi="Arial" w:cs="Arial"/>
-          <w:sz w:val="21"/>
-          <w:szCs w:val="24"/>
-        </w:rPr>
-        <w:t xml:space="preserve"/>
-      </w:r>
-    </w:p>
-    <w:p ns2:paraId="71736CBF" ns2:textId="77777777">
-      <w:pPr>
-        <w:pStyle w:val="Corpodetexto"/>
-        <w:tabs>
-          <w:tab w:val="left" w:pos="0"/>
-        </w:tabs>
-        <w:spacing w:after="0" w:before="0" w:line="240" w:lineRule="auto"/>
-        <w:rPr>
-          <w:rFonts w:ascii="Arial" w:hAnsi="Arial" w:cs="Arial"/>
-          <w:sz w:val="24"/>
-          <w:szCs w:val="24"/>
-        </w:rPr>
-      </w:pPr>
-      <w:r>
-        <w:rPr>
-          <w:rFonts w:ascii="Arial" w:hAnsi="Arial" w:cs="Arial"/>
-          <w:sz w:val="21"/>
-          <w:szCs w:val="24"/>
-        </w:rPr>
-        <w:t xml:space="preserve">Bairro: {{bairro_empresa}}                                              </w:t>
-      </w:r>
-      <w:r>
-        <w:rPr>
-          <w:rFonts w:ascii="Arial" w:hAnsi="Arial" w:cs="Arial"/>
-          <w:b/>
-          <w:bCs/>
-          <w:sz w:val="21"/>
-          <w:szCs w:val="24"/>
-        </w:rPr>
-        <w:t/>
-      </w:r>
-      <w:r>
-        <w:rPr>
-          <w:rFonts w:ascii="Arial" w:hAnsi="Arial" w:cs="Arial"/>
-          <w:sz w:val="21"/>
-          <w:szCs w:val="24"/>
-        </w:rPr>
-        <w:t xml:space="preserve"/>
-      </w:r>
-    </w:p>
-    <w:p ns2:paraId="741FDCDC" ns2:textId="77777777">
-      <w:pPr>
-        <w:pStyle w:val="Corpodetexto"/>
-        <w:tabs>
-          <w:tab w:val="left" w:pos="0"/>
-        </w:tabs>
-        <w:spacing w:after="0" w:before="0" w:line="240" w:lineRule="auto"/>
-        <w:rPr>
-          <w:rFonts w:ascii="Arial" w:hAnsi="Arial" w:cs="Arial"/>
-          <w:sz w:val="24"/>
-          <w:szCs w:val="24"/>
-        </w:rPr>
-      </w:pPr>
-      <w:r>
-        <w:rPr>
-          <w:rFonts w:ascii="Arial" w:hAnsi="Arial" w:cs="Arial"/>
-          <w:sz w:val="21"/>
-          <w:szCs w:val="24"/>
-        </w:rPr>
-        <w:t xml:space="preserve">Município: {{municipio_empresa}}                                                          </w:t>
-      </w:r>
-      <w:r>
-        <w:rPr>
-          <w:rFonts w:ascii="Arial" w:hAnsi="Arial" w:cs="Arial"/>
-          <w:b/>
-          <w:bCs/>
-          <w:sz w:val="21"/>
-          <w:szCs w:val="24"/>
-        </w:rPr>
-        <w:t/>
-      </w:r>
-      <w:r>
-        <w:rPr>
-          <w:rFonts w:ascii="Arial" w:hAnsi="Arial" w:cs="Arial"/>
-          <w:sz w:val="21"/>
-          <w:szCs w:val="24"/>
-        </w:rPr>
-        <w:t xml:space="preserve"/>
-      </w:r>
-    </w:p>
-    <w:p ns2:paraId="0568DF55" ns2:textId="77777777">
-      <w:pPr>
-        <w:pStyle w:val="Corpodetexto"/>
-        <w:tabs>
-          <w:tab w:val="left" w:pos="0"/>
-        </w:tabs>
-        <w:spacing w:after="0" w:before="0" w:line="240" w:lineRule="auto"/>
-        <w:rPr>
-          <w:rFonts w:ascii="Arial" w:hAnsi="Arial" w:cs="Arial"/>
-          <w:sz w:val="24"/>
-          <w:szCs w:val="24"/>
-        </w:rPr>
-      </w:pPr>
-      <w:r>
-        <w:rPr>
-          <w:rFonts w:ascii="Arial" w:hAnsi="Arial" w:cs="Arial"/>
-          <w:sz w:val="21"/>
-          <w:szCs w:val="24"/>
-        </w:rPr>
-        <w:t xml:space="preserve">UF: {{uf_empresa}}                            </w:t>
-      </w:r>
-      <w:r>
-        <w:rPr>
-          <w:rFonts w:ascii="Arial" w:hAnsi="Arial" w:cs="Arial"/>
-          <w:b/>
-          <w:bCs/>
-          <w:sz w:val="21"/>
-          <w:szCs w:val="24"/>
-        </w:rPr>
-        <w:t/>
-      </w:r>
-      <w:r>
-        <w:rPr>
-          <w:rFonts w:ascii="Arial" w:hAnsi="Arial" w:cs="Arial"/>
-          <w:sz w:val="21"/>
-          <w:szCs w:val="24"/>
-        </w:rPr>
-        <w:t xml:space="preserve"/>
-      </w:r>
-    </w:p>
-    <w:p ns2:paraId="234C79A7" ns2:textId="77777777">
-      <w:pPr>
-        <w:pStyle w:val="Corpodetexto"/>
-        <w:tabs>
-          <w:tab w:val="left" w:pos="0"/>
-        </w:tabs>
-        <w:spacing w:after="0" w:before="0" w:line="240" w:lineRule="auto"/>
-        <w:rPr>
-          <w:rFonts w:ascii="Arial" w:hAnsi="Arial" w:cs="Arial"/>
-          <w:sz w:val="24"/>
-          <w:szCs w:val="24"/>
-        </w:rPr>
-      </w:pPr>
-      <w:r>
-        <w:rPr>
-          <w:rFonts w:ascii="Arial" w:hAnsi="Arial" w:cs="Arial"/>
-          <w:sz w:val="21"/>
-          <w:szCs w:val="24"/>
-        </w:rPr>
-        <w:t xml:space="preserve">CEP: {{cep_empresa}} </w:t>
-      </w:r>
-      <w:r>
-        <w:rPr>
-          <w:rFonts w:ascii="Arial" w:hAnsi="Arial" w:cs="Arial"/>
-          <w:b/>
-          <w:bCs/>
-          <w:sz w:val="21"/>
-          <w:szCs w:val="24"/>
-        </w:rPr>
-        <w:t/>
-      </w:r>
-      <w:r>
-        <w:rPr>
-          <w:rFonts w:ascii="Arial" w:hAnsi="Arial" w:cs="Arial"/>
-          <w:sz w:val="21"/>
-          <w:szCs w:val="24"/>
-        </w:rPr>
-        <w:t xml:space="preserve"/>
-      </w:r>
-    </w:p>
-    <w:p ns2:paraId="47E3B0DE" ns2:textId="77777777">
-      <w:pPr>
-        <w:tabs>
-          <w:tab w:val="left" w:pos="0"/>
-          <w:tab w:val="left" w:pos="4500"/>
-        </w:tabs>
-        <w:spacing w:before="0" w:after="0" w:line="240" w:lineRule="auto"/>
-        <w:jc w:val="both"/>
-        <w:rPr>
-          <w:rFonts w:ascii="Arial" w:hAnsi="Arial" w:cs="Arial"/>
-          <w:sz w:val="24"/>
-          <w:szCs w:val="24"/>
-        </w:rPr>
-      </w:pPr>
-      <w:r>
-        <w:rPr>
-          <w:rFonts w:ascii="Arial" w:hAnsi="Arial" w:cs="Arial"/>
-          <w:sz w:val="21"/>
-          <w:szCs w:val="24"/>
-        </w:rPr>
-        <w:t xml:space="preserve">Representada por: {{representante_legal}}                                      </w:t>
-      </w:r>
-      <w:r>
-        <w:rPr>
-          <w:rFonts w:ascii="Arial" w:hAnsi="Arial" w:cs="Arial"/>
-          <w:b/>
-          <w:bCs/>
-          <w:sz w:val="21"/>
-          <w:szCs w:val="24"/>
-        </w:rPr>
-        <w:t/>
-      </w:r>
-      <w:r>
-        <w:rPr>
-          <w:rFonts w:ascii="Arial" w:hAnsi="Arial" w:cs="Arial"/>
-          <w:sz w:val="21"/>
-          <w:szCs w:val="24"/>
-        </w:rPr>
-        <w:t xml:space="preserve"/>
-      </w:r>
-      <w:r>
-        <w:rPr>
-          <w:rFonts w:ascii="Arial" w:hAnsi="Arial" w:cs="Arial"/>
-          <w:sz w:val="21"/>
-          <w:szCs w:val="24"/>
-        </w:rPr>
+        <w:jc w:val="left"/>
+        <w:rPr>
+          <w:rFonts w:ascii="Arial" w:hAnsi="Arial" w:cs="Arial"/>
+          <w:sz w:val="24"/>
+          <w:szCs w:val="24"/>
+        </w:rPr>
+      </w:pPr>
+      <w:r>
+        <w:rPr>
+          <w:rFonts w:ascii="Arial" w:hAnsi="Arial"/>
+          <w:sz w:val="21"/>
+        </w:rPr>
+        <w:t>Representada por: {{representante_legal}}</w:t>
         <w:tab/>
-        <w:t xml:space="preserve"/>
-      </w:r>
-    </w:p>
-    <w:p ns2:paraId="05050D25" ns2:textId="77777777">
-      <w:pPr>
-        <w:tabs>
-          <w:tab w:val="left" w:pos="0"/>
-          <w:tab w:val="left" w:pos="4500"/>
-        </w:tabs>
-        <w:spacing w:before="0" w:after="0" w:line="240" w:lineRule="auto"/>
-        <w:jc w:val="both"/>
-        <w:rPr>
-          <w:rFonts w:ascii="Arial" w:hAnsi="Arial" w:cs="Arial"/>
-          <w:color w:val="FF0000"/>
-          <w:sz w:val="24"/>
-          <w:szCs w:val="24"/>
-        </w:rPr>
-      </w:pPr>
-      <w:r>
-        <w:rPr>
-          <w:rFonts w:ascii="Arial" w:hAnsi="Arial" w:cs="Arial"/>
-          <w:sz w:val="21"/>
-          <w:szCs w:val="24"/>
-        </w:rPr>
-        <w:t xml:space="preserve">Cargo:  {{cargo_representante}}</w:t>
-      </w:r>
-      <w:r>
-        <w:rPr>
-          <w:rFonts w:ascii="Arial" w:hAnsi="Arial" w:cs="Arial"/>
-          <w:b/>
-          <w:bCs/>
-          <w:sz w:val="21"/>
-          <w:szCs w:val="24"/>
-        </w:rPr>
-        <w:t/>
+        <w:t>Cargo: {{cargo_representante}}</w:t>
       </w:r>
     </w:p>
     <w:p ns2:paraId="2DD5E569" ns2:textId="77777777">
@@ -941,7 +545,7 @@
     <w:p ns2:paraId="111A491D" ns2:textId="77777777">
       <w:pPr>
         <w:tabs>
-          <w:tab w:val="left" w:pos="0"/>
+          <w:tab w:pos="5544" w:val="left"/>
         </w:tabs>
         <w:spacing w:before="0" w:after="0" w:line="240" w:lineRule="auto"/>
         <w:jc w:val="left"/>
@@ -953,84 +557,73 @@
       </w:pPr>
       <w:r>
         <w:rPr>
-          <w:rFonts w:ascii="Arial" w:hAnsi="Arial" w:cs="Arial"/>
-          <w:sz w:val="21"/>
-          <w:szCs w:val="24"/>
-        </w:rPr>
-        <w:t xml:space="preserve">Nome: {{nome_estudante}}                                                                       </w:t>
-      </w:r>
-      <w:r>
-        <w:rPr>
-          <w:rFonts w:ascii="Arial" w:hAnsi="Arial" w:cs="Arial"/>
-          <w:sz w:val="21"/>
-          <w:szCs w:val="24"/>
-        </w:rPr>
-        <w:t xml:space="preserve"/>
-      </w:r>
-      <w:r>
-        <w:rPr>
-          <w:rFonts w:ascii="Arial" w:hAnsi="Arial" w:cs="Arial"/>
-          <w:b/>
-          <w:bCs/>
-          <w:sz w:val="21"/>
-          <w:szCs w:val="24"/>
-        </w:rPr>
-        <w:t/>
-      </w:r>
-      <w:r>
-        <w:rPr>
-          <w:rFonts w:ascii="Arial" w:hAnsi="Arial" w:cs="Arial"/>
-          <w:sz w:val="21"/>
-          <w:szCs w:val="24"/>
-        </w:rPr>
-        <w:t xml:space="preserve"/>
-      </w:r>
-      <w:r>
-        <w:rPr>
-          <w:rFonts w:ascii="Arial" w:hAnsi="Arial" w:cs="Arial"/>
-          <w:sz w:val="21"/>
-          <w:szCs w:val="24"/>
-        </w:rPr>
+          <w:rFonts w:ascii="Arial" w:hAnsi="Arial"/>
+          <w:sz w:val="21"/>
+        </w:rPr>
+        <w:t>Nome: {{nome_estudante}}</w:t>
         <w:tab/>
-      </w:r>
-      <w:r>
-        <w:rPr>
-          <w:rFonts w:ascii="Arial" w:hAnsi="Arial" w:cs="Arial"/>
-          <w:sz w:val="21"/>
-          <w:szCs w:val="24"/>
-        </w:rPr>
+        <w:t>Telefone: {{telefone_estudante}}</w:t>
+      </w:r>
+    </w:p>
+    <w:p ns2:paraId="38738D6A" ns2:textId="77777777">
+      <w:pPr>
+        <w:tabs>
+          <w:tab w:pos="3240" w:val="left"/>
+          <w:tab w:pos="5760" w:val="left"/>
+        </w:tabs>
+        <w:spacing w:before="0" w:after="0" w:line="240" w:lineRule="auto"/>
+        <w:jc w:val="left"/>
+        <w:rPr>
+          <w:rFonts w:ascii="Arial" w:hAnsi="Arial" w:cs="Arial"/>
+          <w:sz w:val="24"/>
+          <w:szCs w:val="24"/>
+        </w:rPr>
+      </w:pPr>
+      <w:r>
+        <w:rPr>
+          <w:rFonts w:ascii="Arial" w:hAnsi="Arial"/>
+          <w:sz w:val="21"/>
+        </w:rPr>
+        <w:t>Identidade: {{rg}}</w:t>
         <w:tab/>
-      </w:r>
-      <w:r>
-        <w:rPr>
-          <w:rFonts w:ascii="Arial" w:hAnsi="Arial" w:cs="Arial"/>
-          <w:sz w:val="21"/>
-          <w:szCs w:val="24"/>
-        </w:rPr>
+        <w:t>CPF: {{cpf}}</w:t>
         <w:tab/>
-      </w:r>
-      <w:r>
-        <w:rPr>
-          <w:rFonts w:ascii="Arial" w:hAnsi="Arial" w:cs="Arial"/>
-          <w:sz w:val="21"/>
-          <w:szCs w:val="24"/>
-        </w:rPr>
+        <w:t>Data de Nascimento: {{data_nascimento}}</w:t>
+      </w:r>
+    </w:p>
+    <w:p ns2:paraId="4404F7F8" ns2:textId="77777777">
+      <w:pPr>
+        <w:tabs>
+          <w:tab w:pos="3816" w:val="left"/>
+          <w:tab w:pos="5976" w:val="left"/>
+          <w:tab w:pos="7992" w:val="left"/>
+        </w:tabs>
+        <w:spacing w:before="0" w:after="0" w:line="240" w:lineRule="auto"/>
+        <w:jc w:val="left"/>
+        <w:rPr>
+          <w:rFonts w:ascii="Arial" w:hAnsi="Arial" w:cs="Arial"/>
+          <w:sz w:val="24"/>
+          <w:szCs w:val="24"/>
+        </w:rPr>
+      </w:pPr>
+      <w:r>
+        <w:rPr>
+          <w:rFonts w:ascii="Arial" w:hAnsi="Arial"/>
+          <w:sz w:val="21"/>
+        </w:rPr>
+        <w:t>Curso: {{curso}}</w:t>
         <w:tab/>
-      </w:r>
-      <w:r>
-        <w:rPr>
-          <w:rFonts w:ascii="Arial" w:hAnsi="Arial" w:cs="Arial"/>
-          <w:sz w:val="21"/>
-          <w:szCs w:val="24"/>
-        </w:rPr>
+        <w:t>Série: {{periodo}}</w:t>
         <w:tab/>
-        <w:t xml:space="preserve"/>
-      </w:r>
-    </w:p>
-    <w:p ns2:paraId="38738D6A" ns2:textId="77777777">
-      <w:pPr>
-        <w:tabs>
-          <w:tab w:val="left" w:pos="0"/>
+        <w:t>Matrícula: {{matricula}}</w:t>
+        <w:tab/>
+        <w:t>Turno: {{turno}}</w:t>
+      </w:r>
+    </w:p>
+    <w:p ns2:paraId="0DA9C47B" ns2:textId="77777777">
+      <w:pPr>
+        <w:tabs>
+          <w:tab w:pos="5544" w:val="left"/>
         </w:tabs>
         <w:spacing w:before="0" w:after="0" w:line="240" w:lineRule="auto"/>
         <w:jc w:val="left"/>
@@ -1042,43 +635,16 @@
       </w:pPr>
       <w:r>
         <w:rPr>
-          <w:rFonts w:ascii="Arial" w:hAnsi="Arial" w:cs="Arial"/>
-          <w:sz w:val="21"/>
-          <w:szCs w:val="24"/>
-        </w:rPr>
-        <w:t xml:space="preserve">Telefone: {{telefone_estudante}} </w:t>
-      </w:r>
-      <w:r>
-        <w:rPr>
-          <w:rFonts w:ascii="Arial" w:hAnsi="Arial" w:cs="Arial"/>
-          <w:sz w:val="21"/>
-          <w:szCs w:val="24"/>
-        </w:rPr>
-        <w:t xml:space="preserve"/>
-      </w:r>
-      <w:r>
-        <w:rPr>
-          <w:rFonts w:ascii="Arial" w:hAnsi="Arial" w:cs="Arial"/>
-          <w:b/>
-          <w:bCs/>
-          <w:sz w:val="21"/>
-          <w:szCs w:val="24"/>
-        </w:rPr>
-        <w:t/>
-      </w:r>
-      <w:r>
-        <w:rPr>
-          <w:rFonts w:ascii="Arial" w:hAnsi="Arial" w:cs="Arial"/>
-          <w:sz w:val="21"/>
-          <w:szCs w:val="24"/>
-        </w:rPr>
-        <w:t xml:space="preserve"/>
-      </w:r>
-    </w:p>
-    <w:p ns2:paraId="4404F7F8" ns2:textId="77777777">
-      <w:pPr>
-        <w:tabs>
-          <w:tab w:val="left" w:pos="0"/>
+          <w:rFonts w:ascii="Arial" w:hAnsi="Arial"/>
+          <w:sz w:val="21"/>
+        </w:rPr>
+        <w:t>Endereço: {{endereco_estudante}}</w:t>
+      </w:r>
+    </w:p>
+    <w:p ns2:paraId="44E35EED" ns2:textId="77777777">
+      <w:pPr>
+        <w:tabs>
+          <w:tab w:pos="5544" w:val="left"/>
         </w:tabs>
         <w:spacing w:before="0" w:after="0" w:line="240" w:lineRule="auto"/>
         <w:jc w:val="left"/>
@@ -1090,685 +656,38 @@
       </w:pPr>
       <w:r>
         <w:rPr>
-          <w:rFonts w:ascii="Arial" w:hAnsi="Arial" w:cs="Arial"/>
-          <w:sz w:val="21"/>
-          <w:szCs w:val="24"/>
-        </w:rPr>
-        <w:t xml:space="preserve">Identidade: {{rg}}                          </w:t>
-      </w:r>
-      <w:r>
-        <w:rPr>
-          <w:rFonts w:ascii="Arial" w:hAnsi="Arial" w:cs="Arial"/>
-          <w:sz w:val="21"/>
-          <w:szCs w:val="24"/>
-        </w:rPr>
-        <w:t xml:space="preserve"/>
-      </w:r>
-      <w:r>
-        <w:rPr>
-          <w:rFonts w:ascii="Arial" w:hAnsi="Arial" w:cs="Arial"/>
-          <w:b/>
-          <w:bCs/>
-          <w:sz w:val="21"/>
-          <w:szCs w:val="24"/>
-        </w:rPr>
-        <w:t/>
-      </w:r>
-      <w:r>
-        <w:rPr>
-          <w:rFonts w:ascii="Arial" w:hAnsi="Arial" w:cs="Arial"/>
-          <w:sz w:val="21"/>
-          <w:szCs w:val="24"/>
-        </w:rPr>
+          <w:rFonts w:ascii="Arial" w:hAnsi="Arial"/>
+          <w:sz w:val="21"/>
+        </w:rPr>
+        <w:t>E-mail: {{email_estudante}}</w:t>
         <w:tab/>
-      </w:r>
-      <w:r>
-        <w:rPr>
-          <w:rFonts w:ascii="Arial" w:hAnsi="Arial" w:cs="Arial"/>
-          <w:sz w:val="21"/>
-          <w:szCs w:val="24"/>
-        </w:rPr>
+        <w:t>Bairro: {{bairro_estudante}}</w:t>
+      </w:r>
+    </w:p>
+    <w:p ns2:paraId="61BD856F" ns2:textId="77777777">
+      <w:pPr>
+        <w:tabs>
+          <w:tab w:pos="4680" w:val="left"/>
+          <w:tab w:pos="6696" w:val="left"/>
+        </w:tabs>
+        <w:spacing w:before="0" w:after="0" w:line="240" w:lineRule="auto"/>
+        <w:jc w:val="left"/>
+        <w:rPr>
+          <w:rFonts w:ascii="Arial" w:hAnsi="Arial" w:cs="Arial"/>
+          <w:sz w:val="24"/>
+          <w:szCs w:val="24"/>
+        </w:rPr>
+      </w:pPr>
+      <w:r>
+        <w:rPr>
+          <w:rFonts w:ascii="Arial" w:hAnsi="Arial"/>
+          <w:sz w:val="21"/>
+        </w:rPr>
+        <w:t>Município: {{municipio_estudante}}</w:t>
         <w:tab/>
-      </w:r>
-      <w:r>
-        <w:rPr>
-          <w:rFonts w:ascii="Arial" w:hAnsi="Arial" w:cs="Arial"/>
-          <w:sz w:val="21"/>
-          <w:szCs w:val="24"/>
-        </w:rPr>
+        <w:t>UF: {{uf_estudante}}</w:t>
         <w:tab/>
-        <w:t xml:space="preserve"/>
-      </w:r>
-    </w:p>
-    <w:p ns2:paraId="0DA9C47B" ns2:textId="77777777">
-      <w:pPr>
-        <w:tabs>
-          <w:tab w:val="left" w:pos="0"/>
-        </w:tabs>
-        <w:spacing w:before="0" w:after="0" w:line="240" w:lineRule="auto"/>
-        <w:jc w:val="left"/>
-        <w:rPr>
-          <w:rFonts w:ascii="Arial" w:hAnsi="Arial" w:cs="Arial"/>
-          <w:sz w:val="24"/>
-          <w:szCs w:val="24"/>
-        </w:rPr>
-      </w:pPr>
-      <w:r>
-        <w:rPr>
-          <w:rFonts w:ascii="Arial" w:hAnsi="Arial" w:cs="Arial"/>
-          <w:sz w:val="21"/>
-          <w:szCs w:val="24"/>
-        </w:rPr>
-        <w:t xml:space="preserve">CPF: {{cpf}}     </w:t>
-      </w:r>
-      <w:r>
-        <w:rPr>
-          <w:rFonts w:ascii="Arial" w:hAnsi="Arial" w:cs="Arial"/>
-          <w:sz w:val="21"/>
-          <w:szCs w:val="24"/>
-        </w:rPr>
-        <w:t xml:space="preserve"/>
-      </w:r>
-      <w:r>
-        <w:rPr>
-          <w:rFonts w:ascii="Arial" w:hAnsi="Arial" w:cs="Arial"/>
-          <w:b/>
-          <w:bCs/>
-          <w:sz w:val="21"/>
-          <w:szCs w:val="24"/>
-        </w:rPr>
-        <w:t/>
-      </w:r>
-      <w:r>
-        <w:rPr>
-          <w:rFonts w:ascii="Arial" w:hAnsi="Arial" w:cs="Arial"/>
-          <w:sz w:val="21"/>
-          <w:szCs w:val="24"/>
-        </w:rPr>
-        <w:tab/>
-      </w:r>
-      <w:r>
-        <w:rPr>
-          <w:rFonts w:ascii="Arial" w:hAnsi="Arial" w:cs="Arial"/>
-          <w:sz w:val="21"/>
-          <w:szCs w:val="24"/>
-        </w:rPr>
-        <w:tab/>
-      </w:r>
-      <w:r>
-        <w:rPr>
-          <w:rFonts w:ascii="Arial" w:hAnsi="Arial" w:cs="Arial"/>
-          <w:sz w:val="21"/>
-          <w:szCs w:val="24"/>
-        </w:rPr>
-        <w:tab/>
-        <w:t xml:space="preserve"/>
-      </w:r>
-    </w:p>
-    <w:p ns2:paraId="44E35EED" ns2:textId="77777777">
-      <w:pPr>
-        <w:tabs>
-          <w:tab w:val="left" w:pos="0"/>
-        </w:tabs>
-        <w:spacing w:before="0" w:after="0" w:line="240" w:lineRule="auto"/>
-        <w:jc w:val="left"/>
-        <w:rPr>
-          <w:rFonts w:ascii="Arial" w:hAnsi="Arial" w:cs="Arial"/>
-          <w:sz w:val="24"/>
-          <w:szCs w:val="24"/>
-        </w:rPr>
-      </w:pPr>
-      <w:r>
-        <w:rPr>
-          <w:rFonts w:ascii="Arial" w:hAnsi="Arial" w:cs="Arial"/>
-          <w:sz w:val="21"/>
-          <w:szCs w:val="24"/>
-        </w:rPr>
-        <w:t xml:space="preserve">Data de Nascimento: {{data_nascimento}} </w:t>
-      </w:r>
-      <w:r>
-        <w:rPr>
-          <w:rFonts w:ascii="Arial" w:hAnsi="Arial" w:cs="Arial"/>
-          <w:sz w:val="21"/>
-          <w:szCs w:val="24"/>
-        </w:rPr>
-        <w:t xml:space="preserve"/>
-      </w:r>
-      <w:r>
-        <w:rPr>
-          <w:rFonts w:ascii="Arial" w:hAnsi="Arial" w:cs="Arial"/>
-          <w:sz w:val="21"/>
-          <w:szCs w:val="24"/>
-        </w:rPr>
-        <w:t/>
-      </w:r>
-      <w:r>
-        <w:rPr>
-          <w:rFonts w:ascii="Arial" w:hAnsi="Arial" w:cs="Arial"/>
-          <w:sz w:val="21"/>
-          <w:szCs w:val="24"/>
-        </w:rPr>
-        <w:t xml:space="preserve"/>
-      </w:r>
-      <w:r>
-        <w:rPr>
-          <w:rFonts w:ascii="Arial" w:hAnsi="Arial" w:cs="Arial"/>
-          <w:b/>
-          <w:bCs/>
-          <w:sz w:val="21"/>
-          <w:szCs w:val="24"/>
-        </w:rPr>
-        <w:t/>
-      </w:r>
-      <w:r>
-        <w:rPr>
-          <w:rFonts w:ascii="Arial" w:hAnsi="Arial" w:cs="Arial"/>
-          <w:sz w:val="21"/>
-          <w:szCs w:val="24"/>
-        </w:rPr>
-        <w:t xml:space="preserve"/>
-      </w:r>
-    </w:p>
-    <w:p ns2:paraId="61BD856F" ns2:textId="77777777">
-      <w:pPr>
-        <w:tabs>
-          <w:tab w:val="left" w:pos="0"/>
-        </w:tabs>
-        <w:spacing w:before="0" w:after="0" w:line="240" w:lineRule="auto"/>
-        <w:jc w:val="left"/>
-        <w:rPr>
-          <w:rFonts w:ascii="Arial" w:hAnsi="Arial" w:cs="Arial"/>
-          <w:sz w:val="24"/>
-          <w:szCs w:val="24"/>
-        </w:rPr>
-      </w:pPr>
-      <w:r>
-        <w:rPr>
-          <w:rFonts w:ascii="Arial" w:hAnsi="Arial" w:cs="Arial"/>
-          <w:sz w:val="21"/>
-          <w:szCs w:val="24"/>
-        </w:rPr>
-        <w:t xml:space="preserve">Curso: {{curso}}              </w:t>
-      </w:r>
-      <w:r>
-        <w:rPr>
-          <w:rFonts w:ascii="Arial" w:hAnsi="Arial" w:cs="Arial"/>
-          <w:sz w:val="21"/>
-          <w:szCs w:val="24"/>
-        </w:rPr>
-        <w:tab/>
-      </w:r>
-      <w:r>
-        <w:rPr>
-          <w:rFonts w:ascii="Arial" w:hAnsi="Arial" w:cs="Arial"/>
-          <w:sz w:val="21"/>
-          <w:szCs w:val="24"/>
-        </w:rPr>
-        <w:t xml:space="preserve"/>
-      </w:r>
-      <w:r>
-        <w:rPr>
-          <w:rFonts w:ascii="Arial" w:hAnsi="Arial" w:cs="Arial"/>
-          <w:b/>
-          <w:bCs/>
-          <w:sz w:val="21"/>
-          <w:szCs w:val="24"/>
-        </w:rPr>
-        <w:t/>
-      </w:r>
-      <w:r>
-        <w:rPr>
-          <w:rFonts w:ascii="Arial" w:hAnsi="Arial" w:cs="Arial"/>
-          <w:sz w:val="21"/>
-          <w:szCs w:val="24"/>
-        </w:rPr>
-        <w:tab/>
-      </w:r>
-      <w:r>
-        <w:rPr>
-          <w:rFonts w:ascii="Arial" w:hAnsi="Arial" w:cs="Arial"/>
-          <w:sz w:val="21"/>
-          <w:szCs w:val="24"/>
-        </w:rPr>
-        <w:tab/>
-        <w:t xml:space="preserve"/>
-      </w:r>
-    </w:p>
-    <w:p ns2:paraId="3EB4DD46" ns2:textId="77777777">
-      <w:pPr>
-        <w:tabs>
-          <w:tab w:val="left" w:pos="0"/>
-        </w:tabs>
-        <w:spacing w:before="0" w:after="0" w:line="240" w:lineRule="auto"/>
-        <w:jc w:val="left"/>
-        <w:rPr>
-          <w:rFonts w:ascii="Arial" w:hAnsi="Arial" w:cs="Arial"/>
-          <w:sz w:val="24"/>
-          <w:szCs w:val="24"/>
-        </w:rPr>
-      </w:pPr>
-      <w:r>
-        <w:rPr>
-          <w:rFonts w:ascii="Arial" w:hAnsi="Arial" w:cs="Arial"/>
-          <w:sz w:val="21"/>
-          <w:szCs w:val="24"/>
-        </w:rPr>
-        <w:t xml:space="preserve">Série: {{periodo}}                         </w:t>
-      </w:r>
-      <w:r>
-        <w:rPr>
-          <w:rFonts w:ascii="Arial" w:hAnsi="Arial" w:cs="Arial"/>
-          <w:sz w:val="21"/>
-          <w:szCs w:val="24"/>
-        </w:rPr>
-        <w:t xml:space="preserve"/>
-      </w:r>
-      <w:r>
-        <w:rPr>
-          <w:rFonts w:ascii="Arial" w:hAnsi="Arial" w:cs="Arial"/>
-          <w:b/>
-          <w:bCs/>
-          <w:sz w:val="21"/>
-          <w:szCs w:val="24"/>
-        </w:rPr>
-        <w:t/>
-      </w:r>
-      <w:r>
-        <w:rPr>
-          <w:rFonts w:ascii="Arial" w:hAnsi="Arial" w:cs="Arial"/>
-          <w:sz w:val="21"/>
-          <w:szCs w:val="24"/>
-        </w:rPr>
-        <w:t xml:space="preserve"/>
-      </w:r>
-    </w:p>
-    <w:p ns2:paraId="3B999A20" ns2:textId="77777777">
-      <w:pPr>
-        <w:tabs>
-          <w:tab w:val="left" w:pos="0"/>
-        </w:tabs>
-        <w:spacing w:before="0" w:after="0" w:line="240" w:lineRule="auto"/>
-        <w:jc w:val="left"/>
-        <w:rPr>
-          <w:rFonts w:ascii="Arial" w:hAnsi="Arial" w:cs="Arial"/>
-          <w:sz w:val="24"/>
-          <w:szCs w:val="24"/>
-        </w:rPr>
-      </w:pPr>
-      <w:r>
-        <w:rPr>
-          <w:rFonts w:ascii="Arial" w:hAnsi="Arial" w:cs="Arial"/>
-          <w:sz w:val="21"/>
-          <w:szCs w:val="24"/>
-        </w:rPr>
-        <w:t xml:space="preserve">Matrícula: {{matricula}}                                      </w:t>
-      </w:r>
-      <w:r>
-        <w:rPr>
-          <w:rFonts w:ascii="Arial" w:hAnsi="Arial" w:cs="Arial"/>
-          <w:sz w:val="21"/>
-          <w:szCs w:val="24"/>
-        </w:rPr>
-        <w:t xml:space="preserve"/>
-      </w:r>
-      <w:r>
-        <w:rPr>
-          <w:rFonts w:ascii="Arial" w:hAnsi="Arial" w:cs="Arial"/>
-          <w:b/>
-          <w:bCs/>
-          <w:sz w:val="21"/>
-          <w:szCs w:val="24"/>
-        </w:rPr>
-        <w:t/>
-      </w:r>
-      <w:r>
-        <w:rPr>
-          <w:rFonts w:ascii="Arial" w:hAnsi="Arial" w:cs="Arial"/>
-          <w:sz w:val="21"/>
-          <w:szCs w:val="24"/>
-        </w:rPr>
-        <w:t xml:space="preserve"/>
-      </w:r>
-    </w:p>
-    <w:p ns2:paraId="0EBA9359" ns2:textId="77777777">
-      <w:pPr>
-        <w:tabs>
-          <w:tab w:val="left" w:pos="0"/>
-        </w:tabs>
-        <w:spacing w:before="0" w:after="0" w:line="240" w:lineRule="auto"/>
-        <w:jc w:val="left"/>
-        <w:rPr>
-          <w:rFonts w:ascii="Arial" w:hAnsi="Arial" w:cs="Arial"/>
-          <w:sz w:val="24"/>
-          <w:szCs w:val="24"/>
-        </w:rPr>
-      </w:pPr>
-      <w:r>
-        <w:rPr>
-          <w:rFonts w:ascii="Arial" w:hAnsi="Arial" w:cs="Arial"/>
-          <w:sz w:val="21"/>
-          <w:szCs w:val="24"/>
-        </w:rPr>
-        <w:t xml:space="preserve">Turno: {{turno}}</w:t>
-      </w:r>
-      <w:r>
-        <w:rPr>
-          <w:rFonts w:ascii="Arial" w:hAnsi="Arial" w:cs="Arial"/>
-          <w:sz w:val="21"/>
-          <w:szCs w:val="24"/>
-        </w:rPr>
-        <w:t xml:space="preserve"/>
-      </w:r>
-      <w:r>
-        <w:rPr>
-          <w:rFonts w:ascii="Arial" w:hAnsi="Arial" w:cs="Arial"/>
-          <w:b/>
-          <w:bCs/>
-          <w:sz w:val="21"/>
-          <w:szCs w:val="24"/>
-        </w:rPr>
-        <w:t/>
-      </w:r>
-    </w:p>
-    <w:p ns2:paraId="26B36904" ns2:textId="77777777">
-      <w:pPr>
-        <w:tabs>
-          <w:tab w:val="left" w:pos="0"/>
-        </w:tabs>
-        <w:spacing w:before="0" w:after="0" w:line="240" w:lineRule="auto"/>
-        <w:jc w:val="left"/>
-        <w:rPr>
-          <w:rFonts w:ascii="Arial" w:hAnsi="Arial" w:cs="Arial"/>
-          <w:sz w:val="24"/>
-          <w:szCs w:val="24"/>
-        </w:rPr>
-      </w:pPr>
-      <w:r>
-        <w:rPr>
-          <w:rFonts w:ascii="Arial" w:hAnsi="Arial" w:cs="Arial"/>
-          <w:sz w:val="21"/>
-          <w:szCs w:val="24"/>
-        </w:rPr>
-        <w:t xml:space="preserve">Endereço: {{endereco_estudante}}</w:t>
-      </w:r>
-      <w:r>
-        <w:rPr>
-          <w:rFonts w:ascii="Arial" w:hAnsi="Arial" w:cs="Arial"/>
-          <w:sz w:val="21"/>
-          <w:szCs w:val="24"/>
-        </w:rPr>
-        <w:t xml:space="preserve"/>
-      </w:r>
-      <w:r>
-        <w:rPr>
-          <w:rFonts w:ascii="Arial" w:hAnsi="Arial" w:cs="Arial"/>
-          <w:b/>
-          <w:bCs/>
-          <w:sz w:val="21"/>
-          <w:szCs w:val="24"/>
-        </w:rPr>
-        <w:t/>
-      </w:r>
-      <w:r>
-        <w:rPr>
-          <w:rFonts w:ascii="Arial" w:hAnsi="Arial" w:cs="Arial"/>
-          <w:sz w:val="21"/>
-          <w:szCs w:val="24"/>
-        </w:rPr>
-        <w:tab/>
-      </w:r>
-    </w:p>
-    <w:p ns2:paraId="4BD09452" ns2:textId="77777777">
-      <w:pPr>
-        <w:tabs>
-          <w:tab w:val="left" w:pos="0"/>
-        </w:tabs>
-        <w:spacing w:before="0" w:after="0" w:line="240" w:lineRule="auto"/>
-        <w:jc w:val="left"/>
-        <w:rPr>
-          <w:rFonts w:ascii="Arial" w:hAnsi="Arial" w:cs="Arial"/>
-          <w:sz w:val="24"/>
-          <w:szCs w:val="24"/>
-        </w:rPr>
-      </w:pPr>
-      <w:r>
-        <w:rPr>
-          <w:rFonts w:ascii="Arial" w:hAnsi="Arial" w:cs="Arial"/>
-          <w:sz w:val="21"/>
-          <w:szCs w:val="24"/>
-        </w:rPr>
-        <w:t xml:space="preserve">E-mail: {{email_estudante}}                              </w:t>
-      </w:r>
-      <w:r>
-        <w:rPr>
-          <w:rFonts w:ascii="Arial" w:hAnsi="Arial" w:cs="Arial"/>
-          <w:sz w:val="21"/>
-          <w:szCs w:val="24"/>
-        </w:rPr>
-        <w:t xml:space="preserve"/>
-      </w:r>
-      <w:r>
-        <w:rPr>
-          <w:rFonts w:ascii="Arial" w:hAnsi="Arial" w:cs="Arial"/>
-          <w:b/>
-          <w:bCs/>
-          <w:sz w:val="21"/>
-          <w:szCs w:val="24"/>
-        </w:rPr>
-        <w:t/>
-      </w:r>
-      <w:r>
-        <w:rPr>
-          <w:rFonts w:ascii="Arial" w:hAnsi="Arial" w:cs="Arial"/>
-          <w:sz w:val="21"/>
-          <w:szCs w:val="24"/>
-        </w:rPr>
-        <w:tab/>
-      </w:r>
-      <w:r>
-        <w:rPr>
-          <w:rFonts w:ascii="Arial" w:hAnsi="Arial" w:cs="Arial"/>
-          <w:sz w:val="21"/>
-          <w:szCs w:val="24"/>
-        </w:rPr>
-        <w:tab/>
-      </w:r>
-      <w:r>
-        <w:rPr>
-          <w:rFonts w:ascii="Arial" w:hAnsi="Arial" w:cs="Arial"/>
-          <w:sz w:val="21"/>
-          <w:szCs w:val="24"/>
-        </w:rPr>
-        <w:tab/>
-        <w:t xml:space="preserve"/>
-      </w:r>
-    </w:p>
-    <w:p ns2:paraId="1BD6EDC6" ns2:textId="77777777">
-      <w:pPr>
-        <w:tabs>
-          <w:tab w:val="left" w:pos="0"/>
-        </w:tabs>
-        <w:spacing w:before="0" w:after="0" w:line="240" w:lineRule="auto"/>
-        <w:jc w:val="left"/>
-        <w:rPr>
-          <w:rFonts w:ascii="Arial" w:hAnsi="Arial" w:cs="Arial"/>
-          <w:sz w:val="24"/>
-          <w:szCs w:val="24"/>
-        </w:rPr>
-      </w:pPr>
-      <w:r>
-        <w:rPr>
-          <w:rFonts w:ascii="Arial" w:hAnsi="Arial" w:cs="Arial"/>
-          <w:sz w:val="21"/>
-          <w:szCs w:val="24"/>
-        </w:rPr>
-        <w:t xml:space="preserve">Bairro: {{bairro_estudante}}                                                                  </w:t>
-      </w:r>
-      <w:r>
-        <w:rPr>
-          <w:rFonts w:ascii="Arial" w:hAnsi="Arial" w:cs="Arial"/>
-          <w:b/>
-          <w:bCs/>
-          <w:sz w:val="21"/>
-          <w:szCs w:val="24"/>
-        </w:rPr>
-        <w:t/>
-      </w:r>
-      <w:r>
-        <w:rPr>
-          <w:rFonts w:ascii="Arial" w:hAnsi="Arial" w:cs="Arial"/>
-          <w:b/>
-          <w:bCs/>
-          <w:color w:val="000000"/>
-          <w:sz w:val="21"/>
-          <w:szCs w:val="24"/>
-        </w:rPr>
-      </w:r>
-      <w:r>
-        <w:rPr>
-          <w:rFonts w:ascii="Arial" w:hAnsi="Arial" w:cs="Arial"/>
-          <w:sz w:val="21"/>
-          <w:szCs w:val="24"/>
-        </w:rPr>
-        <w:t xml:space="preserve"/>
-      </w:r>
-    </w:p>
-    <w:p ns2:paraId="1F6C928F" ns2:textId="77777777">
-      <w:pPr>
-        <w:tabs>
-          <w:tab w:val="left" w:pos="0"/>
-        </w:tabs>
-        <w:spacing w:before="0" w:after="0" w:line="240" w:lineRule="auto"/>
-        <w:jc w:val="left"/>
-        <w:rPr>
-          <w:rFonts w:ascii="Arial" w:hAnsi="Arial" w:cs="Arial"/>
-          <w:sz w:val="24"/>
-          <w:szCs w:val="24"/>
-        </w:rPr>
-      </w:pPr>
-      <w:proofErr w:type="spellStart"/>
-      <w:r>
-        <w:rPr>
-          <w:rFonts w:ascii="Arial" w:hAnsi="Arial" w:cs="Arial"/>
-          <w:sz w:val="21"/>
-          <w:szCs w:val="24"/>
-        </w:rPr>
-        <w:t xml:space="preserve">Município: {{municipio_estudante}}                                       </w:t>
-      </w:r>
-      <w:r>
-        <w:rPr>
-          <w:rFonts w:ascii="Arial" w:hAnsi="Arial" w:cs="Arial"/>
-          <w:b/>
-          <w:bCs/>
-          <w:sz w:val="21"/>
-          <w:szCs w:val="24"/>
-        </w:rPr>
-        <w:t/>
-      </w:r>
-      <w:proofErr w:type="spellEnd"/>
-      <w:r>
-        <w:rPr>
-          <w:rFonts w:ascii="Arial" w:hAnsi="Arial" w:cs="Arial"/>
-          <w:sz w:val="21"/>
-          <w:szCs w:val="24"/>
-        </w:rPr>
-        <w:t xml:space="preserve"/>
-      </w:r>
-    </w:p>
-    <w:p ns2:paraId="233F3252" ns2:textId="77777777">
-      <w:pPr>
-        <w:tabs>
-          <w:tab w:val="left" w:pos="0"/>
-        </w:tabs>
-        <w:spacing w:before="0" w:after="0" w:line="240" w:lineRule="auto"/>
-        <w:jc w:val="left"/>
-        <w:rPr>
-          <w:rFonts w:ascii="Arial" w:hAnsi="Arial" w:cs="Arial"/>
-          <w:b/>
-          <w:bCs/>
-          <w:sz w:val="24"/>
-          <w:szCs w:val="24"/>
-        </w:rPr>
-      </w:pPr>
-      <w:r>
-        <w:rPr>
-          <w:rFonts w:ascii="Arial" w:hAnsi="Arial" w:cs="Arial"/>
-          <w:sz w:val="21"/>
-          <w:szCs w:val="24"/>
-        </w:rPr>
-        <w:t xml:space="preserve">UF: {{uf_estudante}}                              </w:t>
-      </w:r>
-      <w:r>
-        <w:rPr>
-          <w:rFonts w:ascii="Arial" w:hAnsi="Arial" w:cs="Arial"/>
-          <w:b/>
-          <w:bCs/>
-          <w:sz w:val="21"/>
-          <w:szCs w:val="24"/>
-        </w:rPr>
-        <w:t xml:space="preserve"/>
-      </w:r>
-      <w:r>
-        <w:rPr>
-          <w:rFonts w:ascii="Arial" w:hAnsi="Arial" w:cs="Arial"/>
-          <w:b/>
-          <w:bCs/>
-          <w:sz w:val="21"/>
-          <w:szCs w:val="24"/>
-        </w:rPr>
-        <w:t/>
-      </w:r>
-      <w:r>
-        <w:rPr>
-          <w:rFonts w:ascii="Arial" w:hAnsi="Arial" w:cs="Arial"/>
-          <w:b/>
-          <w:bCs/>
-          <w:sz w:val="21"/>
-          <w:szCs w:val="24"/>
-        </w:rPr>
-        <w:t xml:space="preserve"/>
-      </w:r>
-    </w:p>
-    <w:p ns2:paraId="4A7A3A5F" ns2:textId="77777777">
-      <w:pPr>
-        <w:tabs>
-          <w:tab w:val="left" w:pos="0"/>
-        </w:tabs>
-        <w:spacing w:before="0" w:after="0" w:line="240" w:lineRule="auto"/>
-        <w:jc w:val="left"/>
-        <w:rPr>
-          <w:rFonts w:ascii="Arial" w:hAnsi="Arial" w:cs="Arial"/>
-          <w:sz w:val="24"/>
-          <w:szCs w:val="24"/>
-        </w:rPr>
-      </w:pPr>
-      <w:r>
-        <w:rPr>
-          <w:rFonts w:ascii="Arial" w:hAnsi="Arial" w:cs="Arial"/>
-          <w:sz w:val="21"/>
-          <w:szCs w:val="24"/>
-        </w:rPr>
-        <w:t xml:space="preserve">CEP: {{cep_estudante}}</w:t>
-      </w:r>
-      <w:r>
-        <w:rPr>
-          <w:rFonts w:ascii="Arial" w:hAnsi="Arial" w:cs="Arial"/>
-          <w:b/>
-          <w:bCs/>
-          <w:sz w:val="21"/>
-          <w:szCs w:val="24"/>
-        </w:rPr>
-        <w:t/>
-      </w:r>
-      <w:r>
-        <w:rPr>
-          <w:rFonts w:ascii="Arial" w:hAnsi="Arial" w:cs="Arial"/>
-          <w:b/>
-          <w:bCs/>
-          <w:color w:val="000000"/>
-          <w:sz w:val="21"/>
-          <w:szCs w:val="24"/>
-        </w:rPr>
+        <w:t>CEP: {{cep_estudante}}</w:t>
       </w:r>
     </w:p>
     <w:p ns2:paraId="4E1E2C65" ns2:textId="77777777">

</xml_diff>

<commit_message>
Corrige data do plano de atividades
</commit_message>
<xml_diff>
--- a/models/plano-atividades-estagio-aems.docx
+++ b/models/plano-atividades-estagio-aems.docx
@@ -2235,66 +2235,10 @@
       </w:pPr>
       <w:r>
         <w:rPr>
-          <w:rFonts w:ascii="Arial" w:hAnsi="Arial" w:cs="Arial"/>
-          <w:color w:val="000000"/>
-          <w:sz w:val="21"/>
-          <w:szCs w:val="24"/>
-        </w:rPr>
-        <w:t>Três Lagoas/MS,</w:t>
-      </w:r>
-      <w:r>
-        <w:rPr>
-          <w:rFonts w:ascii="Arial" w:hAnsi="Arial" w:cs="Arial"/>
-          <w:color w:val="000000"/>
-          <w:sz w:val="21"/>
-          <w:szCs w:val="24"/>
-        </w:rPr>
-        <w:t xml:space="preserve"> XX (dia) </w:t>
-      </w:r>
-      <w:r>
-        <w:rPr>
-          <w:rFonts w:ascii="Arial" w:hAnsi="Arial" w:cs="Arial"/>
-          <w:color w:val="000000"/>
-          <w:sz w:val="21"/>
-          <w:szCs w:val="24"/>
-        </w:rPr>
-        <w:t xml:space="preserve">de </w:t>
-      </w:r>
-      <w:r>
-        <w:rPr>
-          <w:rFonts w:ascii="Arial" w:hAnsi="Arial" w:cs="Arial"/>
-          <w:color w:val="000000"/>
-          <w:sz w:val="21"/>
-          <w:szCs w:val="24"/>
-        </w:rPr>
-        <w:t xml:space="preserve">XX (Mês) </w:t>
-      </w:r>
-      <w:r>
-        <w:rPr>
-          <w:rFonts w:ascii="Arial" w:hAnsi="Arial" w:cs="Arial"/>
-          <w:color w:val="000000"/>
-          <w:sz w:val="21"/>
-          <w:szCs w:val="24"/>
-        </w:rPr>
-        <w:t xml:space="preserve">de </w:t>
-      </w:r>
-      <w:r>
-        <w:rPr>
-          <w:rFonts w:ascii="Arial" w:hAnsi="Arial" w:cs="Arial"/>
-          <w:color w:val="000000"/>
-          <w:sz w:val="21"/>
-          <w:szCs w:val="24"/>
-        </w:rPr>
-        <w:t>XXXX (ANO)</w:t>
-      </w:r>
-      <w:r>
-        <w:rPr>
-          <w:rFonts w:ascii="Arial" w:hAnsi="Arial" w:cs="Arial"/>
-          <w:color w:val="000000"/>
-          <w:sz w:val="21"/>
-          <w:szCs w:val="24"/>
-        </w:rPr>
-        <w:t xml:space="preserve">.  </w:t>
+          <w:rFonts w:ascii="Arial" w:hAnsi="Arial"/>
+          <w:sz w:val="21"/>
+        </w:rPr>
+        <w:t>Três Lagoas/MS, {{dia_documento}} de {{mes_documento}} de {{ano_documento}}.</w:t>
       </w:r>
     </w:p>
     <w:p ns2:paraId="5F0B9354" ns2:textId="77777777">

</xml_diff>